<commit_message>
Revise top-5 report after review: sensitivity test, corrections, grading method
- Add scorecard sensitivity analysis (analysis/sensitivity.py) and a section on
  how fragile the ranking is; TRV, JPM, THC are robust, AI slots are a toss-up
- Fix 0.05 half-notch claim, AI-hardware count (5 of top 8), opening claim that
  the five were the top scores (APH is a judgment override of ANET)
- Revisit NVDA risk score and show its selection under both report dates
- Grading: fixed Sep 28 open to Nov 20 close for stock and benchmark, dividends
  by ex-date, binomial chance model, supplementary checks kept separate

Co-Authored-By: Claude Opus 5.5 <noreply@anthropic.com>
Claude-Session: https://claude.ai/code/session_016AgBnoCfdHhgV6SFp5cQBC
</commit_message>
<xml_diff>
--- a/reports/Top 5 stocks Sep to Nov 2026.docx
+++ b/reports/Top 5 stocks Sep to Nov 2026.docx
@@ -2,7 +2,7 @@
 <file path=word/document.xml><?xml version="1.0" encoding="utf-8"?>
 <w:document xmlns:w="http://schemas.openxmlformats.org/wordprocessingml/2006/main" xmlns:m="http://schemas.openxmlformats.org/officeDocument/2006/math" xmlns:r="http://schemas.openxmlformats.org/officeDocument/2006/relationships" xmlns:o="urn:schemas-microsoft-com:office:office" xmlns:v="urn:schemas-microsoft-com:vml" xmlns:w10="urn:schemas-microsoft-com:office:word" xmlns:a="http://schemas.openxmlformats.org/drawingml/2006/main" xmlns:pic="http://schemas.openxmlformats.org/drawingml/2006/picture" xmlns:wp="http://schemas.openxmlformats.org/drawingml/2006/wordprocessingDrawing">
   <w:body>
-    <w:bookmarkStart w:id="127" w:name="X7899ff881bbf6c71daf86982b2a1930edb07d0e"/>
+    <w:bookmarkStart w:id="128" w:name="X7899ff881bbf6c71daf86982b2a1930edb07d0e"/>
     <w:p>
       <w:pPr>
         <w:pStyle w:val="Heading1"/>
@@ -29,7 +29,20 @@
         <w:t xml:space="preserve">Nvidia (NVDA), Travelers (TRV), Amphenol (APH), JPMorgan Chase (JPM) and Tenet Healthcare (THC)</w:t>
       </w:r>
       <w:r>
-        <w:t xml:space="preserve">. We scored all 21 stress-tested names on one weighted scorecard. These five had the highest scores once we applied the portfolio caps: no more than two AI-hardware names and no more than two names per sector. The basket averages</w:t>
+        <w:t xml:space="preserve">. We scored all 21 stress-tested names on one weighted scorecard. Applying the portfolio caps mechanically (no more than two AI-hardware names and no more than two names per sector) gives NVDA, TRV,</w:t>
+      </w:r>
+      <w:r>
+        <w:t xml:space="preserve"> </w:t>
+      </w:r>
+      <w:r>
+        <w:rPr>
+          <w:b/>
+          <w:bCs/>
+        </w:rPr>
+        <w:t xml:space="preserve">ANET</w:t>
+      </w:r>
+      <w:r>
+        <w:t xml:space="preserve">, JPM and THC. We replaced Arista with Amphenol by judgment, for reasons given below. A sensitivity test shows that TRV, JPM and THC are robust picks. The two AI slots are close to a toss-up among NVDA, ANET, APH and DELL, and NVDA drops out if its risk score is cut by one point or if it reports after Nov 20. The basket averages</w:t>
       </w:r>
       <w:r>
         <w:t xml:space="preserve"> </w:t>
@@ -4075,7 +4088,13 @@
           <w:b/>
           <w:bCs/>
         </w:rPr>
-        <w:t xml:space="preserve">A 0.05 gap is one notch on a 10% factor, and sits within the measurement noise.</w:t>
+        <w:t xml:space="preserve">A 0.05 gap is half a notch on a 10%-weighted factor (one full notch there is worth 0.10), and sits well within the measurement noise.</w:t>
+      </w:r>
+      <w:r>
+        <w:t xml:space="preserve"> </w:t>
+      </w:r>
+      <w:r>
+        <w:t xml:space="preserve">The section on fragility below tests how much the ranking moves when these inputs change.</w:t>
       </w:r>
     </w:p>
     <w:bookmarkEnd w:id="38"/>
@@ -4147,7 +4166,7 @@
         <w:t xml:space="preserve"> </w:t>
       </w:r>
       <w:r>
-        <w:t xml:space="preserve">Six of the top eight names are AI-hardware plays, all driven by one factor: hyperscaler capex. NVDA has the top score (3.75) and takes the first slot. Four names compete for the second: DELL and ANET at 3.65, APH at 3.60 and MU at 3.50.</w:t>
+        <w:t xml:space="preserve">Five of the top eight names (NVDA, DELL, ANET, APH and MU) are AI-hardware plays, all driven by one factor: hyperscaler capex. NVDA has the top score (3.75) and takes the first slot. Four names compete for the second: DELL and ANET at 3.65, APH at 3.60 and MU at 3.50.</w:t>
       </w:r>
     </w:p>
     <w:p>
@@ -4202,7 +4221,23 @@
         <w:t xml:space="preserve"> </w:t>
       </w:r>
       <w:r>
-        <w:t xml:space="preserve">is a 0.05 difference, which is noise. We chose APH for two reasons. First, its downside-risk score is higher (4 vs 3). ANET has 42% revenue concentration in META and MSFT and trades near 47x P/E, while APH's diversified auto, defense and industrial end-markets make it a genuinely different driver from NVDA. Second, NVDA and ANET would both sit directly on the late-October hyperscaler capex guides, so they are closer to a single bet.</w:t>
+        <w:t xml:space="preserve">is a 0.05 difference, half a notch on a 10% factor.</w:t>
+      </w:r>
+      <w:r>
+        <w:t xml:space="preserve"> </w:t>
+      </w:r>
+      <w:r>
+        <w:rPr>
+          <w:b/>
+          <w:bCs/>
+        </w:rPr>
+        <w:t xml:space="preserve">The mechanical rule picks ANET.</w:t>
+      </w:r>
+      <w:r>
+        <w:t xml:space="preserve"> </w:t>
+      </w:r>
+      <w:r>
+        <w:t xml:space="preserve">We overrode it and chose APH for two reasons. Both are judgments, not scores. First, its downside-risk score is higher (4 vs 3). ANET has 42% revenue concentration in META and MSFT and trades near 47x P/E, while APH's diversified auto, defense and industrial end-markets make it a genuinely different driver from NVDA. Second, NVDA and ANET would both sit directly on the late-October hyperscaler capex guides, so they are closer to a single bet.</w:t>
       </w:r>
     </w:p>
     <w:p>
@@ -5278,7 +5313,705 @@
       </w:r>
     </w:p>
     <w:bookmarkEnd w:id="54"/>
-    <w:bookmarkStart w:id="107" w:name="X910b931f07d9527c9934127e8b2d1fa2639ddcb"/>
+    <w:bookmarkStart w:id="55" w:name="how-fragile-the-ranking-is"/>
+    <w:p>
+      <w:pPr>
+        <w:pStyle w:val="Heading2"/>
+      </w:pPr>
+      <w:r>
+        <w:t xml:space="preserve">How fragile the ranking is</w:t>
+      </w:r>
+    </w:p>
+    <w:p>
+      <w:pPr>
+        <w:pStyle w:val="FirstParagraph"/>
+      </w:pPr>
+      <w:r>
+        <w:t xml:space="preserve">The scorecard rests on judgment calls, and several inputs are stand-ins. Revisions scores use guidance raises, target changes and Zacks ranks because measured revision histories were unavailable. So we tested how much the selection moves when those inputs change. The test applies the report's selection rule mechanically: rank by weighted score, break ties in favor of an in-window report and then lower risk, and apply both caps. The script and its full output are in</w:t>
+      </w:r>
+      <w:r>
+        <w:t xml:space="preserve"> </w:t>
+      </w:r>
+      <w:r>
+        <w:rPr>
+          <w:rStyle w:val="VerbatimChar"/>
+        </w:rPr>
+        <w:t xml:space="preserve">analysis/sensitivity.py</w:t>
+      </w:r>
+      <w:r>
+        <w:t xml:space="preserve"> </w:t>
+      </w:r>
+      <w:r>
+        <w:t xml:space="preserve">and</w:t>
+      </w:r>
+      <w:r>
+        <w:t xml:space="preserve"> </w:t>
+      </w:r>
+      <w:r>
+        <w:rPr>
+          <w:rStyle w:val="VerbatimChar"/>
+        </w:rPr>
+        <w:t xml:space="preserve">analysis/sensitivity_output.txt</w:t>
+      </w:r>
+      <w:r>
+        <w:t xml:space="preserve">.</w:t>
+      </w:r>
+    </w:p>
+    <w:p>
+      <w:pPr>
+        <w:pStyle w:val="BodyText"/>
+      </w:pPr>
+      <w:r>
+        <w:rPr>
+          <w:b/>
+          <w:bCs/>
+        </w:rPr>
+        <w:t xml:space="preserve">The mechanical rule does not pick APH.</w:t>
+      </w:r>
+      <w:r>
+        <w:t xml:space="preserve"> </w:t>
+      </w:r>
+      <w:r>
+        <w:t xml:space="preserve">It selects NVDA, TRV, ANET, JPM and THC. APH is in the report's basket only through the judgment override described above.</w:t>
+      </w:r>
+    </w:p>
+    <w:p>
+      <w:pPr>
+        <w:pStyle w:val="BodyText"/>
+      </w:pPr>
+      <w:r>
+        <w:rPr>
+          <w:b/>
+          <w:bCs/>
+        </w:rPr>
+        <w:t xml:space="preserve">NVDA depends on two uncertain inputs:</w:t>
+      </w:r>
+    </w:p>
+    <w:tbl>
+      <w:tblPr>
+        <w:tblStyle w:val="Table"/>
+        <w:tblW w:type="auto" w:w="0"/>
+        <w:tblLook w:firstRow="1" w:lastRow="0" w:firstColumn="0" w:lastColumn="0" w:noHBand="0" w:noVBand="0" w:val="0020"/>
+      </w:tblPr>
+      <w:tblGrid>
+        <w:gridCol w:w="2640"/>
+        <w:gridCol w:w="2640"/>
+        <w:gridCol w:w="2640"/>
+      </w:tblGrid>
+      <w:tr>
+        <w:trPr>
+          <w:tblHeader w:val="on"/>
+        </w:trPr>
+        <w:tc>
+          <w:tcPr/>
+          <w:p>
+            <w:pPr>
+              <w:pStyle w:val="Compact"/>
+            </w:pPr>
+            <w:r>
+              <w:t xml:space="preserve">Scenario</w:t>
+            </w:r>
+          </w:p>
+        </w:tc>
+        <w:tc>
+          <w:tcPr/>
+          <w:p>
+            <w:pPr>
+              <w:pStyle w:val="Compact"/>
+            </w:pPr>
+            <w:r>
+              <w:t xml:space="preserve">NVDA score</w:t>
+            </w:r>
+          </w:p>
+        </w:tc>
+        <w:tc>
+          <w:tcPr/>
+          <w:p>
+            <w:pPr>
+              <w:pStyle w:val="Compact"/>
+            </w:pPr>
+            <w:r>
+              <w:t xml:space="preserve">Mechanical basket</w:t>
+            </w:r>
+          </w:p>
+        </w:tc>
+      </w:tr>
+      <w:tr>
+        <w:tc>
+          <w:tcPr/>
+          <w:p>
+            <w:pPr>
+              <w:pStyle w:val="Compact"/>
+            </w:pPr>
+            <w:r>
+              <w:t xml:space="preserve">As scored</w:t>
+            </w:r>
+          </w:p>
+        </w:tc>
+        <w:tc>
+          <w:tcPr/>
+          <w:p>
+            <w:pPr>
+              <w:pStyle w:val="Compact"/>
+            </w:pPr>
+            <w:r>
+              <w:t xml:space="preserve">3.75</w:t>
+            </w:r>
+          </w:p>
+        </w:tc>
+        <w:tc>
+          <w:tcPr/>
+          <w:p>
+            <w:pPr>
+              <w:pStyle w:val="Compact"/>
+            </w:pPr>
+            <w:r>
+              <w:t xml:space="preserve">NVDA, TRV, ANET, JPM, THC</w:t>
+            </w:r>
+          </w:p>
+        </w:tc>
+      </w:tr>
+      <w:tr>
+        <w:tc>
+          <w:tcPr/>
+          <w:p>
+            <w:pPr>
+              <w:pStyle w:val="Compact"/>
+            </w:pPr>
+            <w:r>
+              <w:t xml:space="preserve">NVDA risk 4 → 3</w:t>
+            </w:r>
+          </w:p>
+        </w:tc>
+        <w:tc>
+          <w:tcPr/>
+          <w:p>
+            <w:pPr>
+              <w:pStyle w:val="Compact"/>
+            </w:pPr>
+            <w:r>
+              <w:t xml:space="preserve">3.60</w:t>
+            </w:r>
+          </w:p>
+        </w:tc>
+        <w:tc>
+          <w:tcPr/>
+          <w:p>
+            <w:pPr>
+              <w:pStyle w:val="Compact"/>
+            </w:pPr>
+            <w:r>
+              <w:t xml:space="preserve">DELL, TRV, ANET, JPM, THC</w:t>
+            </w:r>
+          </w:p>
+        </w:tc>
+      </w:tr>
+      <w:tr>
+        <w:tc>
+          <w:tcPr/>
+          <w:p>
+            <w:pPr>
+              <w:pStyle w:val="Compact"/>
+            </w:pPr>
+            <w:r>
+              <w:t xml:space="preserve">NVDA risk 4 → 2</w:t>
+            </w:r>
+          </w:p>
+        </w:tc>
+        <w:tc>
+          <w:tcPr/>
+          <w:p>
+            <w:pPr>
+              <w:pStyle w:val="Compact"/>
+            </w:pPr>
+            <w:r>
+              <w:t xml:space="preserve">3.45</w:t>
+            </w:r>
+          </w:p>
+        </w:tc>
+        <w:tc>
+          <w:tcPr/>
+          <w:p>
+            <w:pPr>
+              <w:pStyle w:val="Compact"/>
+            </w:pPr>
+            <w:r>
+              <w:t xml:space="preserve">DELL, TRV, ANET, JPM, THC</w:t>
+            </w:r>
+          </w:p>
+        </w:tc>
+      </w:tr>
+      <w:tr>
+        <w:tc>
+          <w:tcPr/>
+          <w:p>
+            <w:pPr>
+              <w:pStyle w:val="Compact"/>
+            </w:pPr>
+            <w:r>
+              <w:t xml:space="preserve">NVDA reports Nov 25, after the window (catalyst 3 → 2, the same treatment as DELL)</w:t>
+            </w:r>
+          </w:p>
+        </w:tc>
+        <w:tc>
+          <w:tcPr/>
+          <w:p>
+            <w:pPr>
+              <w:pStyle w:val="Compact"/>
+            </w:pPr>
+            <w:r>
+              <w:t xml:space="preserve">3.55</w:t>
+            </w:r>
+          </w:p>
+        </w:tc>
+        <w:tc>
+          <w:tcPr/>
+          <w:p>
+            <w:pPr>
+              <w:pStyle w:val="Compact"/>
+            </w:pPr>
+            <w:r>
+              <w:t xml:space="preserve">DELL, TRV, ANET, JPM, THC</w:t>
+            </w:r>
+          </w:p>
+        </w:tc>
+      </w:tr>
+      <w:tr>
+        <w:tc>
+          <w:tcPr/>
+          <w:p>
+            <w:pPr>
+              <w:pStyle w:val="Compact"/>
+            </w:pPr>
+            <w:r>
+              <w:t xml:space="preserve">Both: risk 2 and Nov 25 report</w:t>
+            </w:r>
+          </w:p>
+        </w:tc>
+        <w:tc>
+          <w:tcPr/>
+          <w:p>
+            <w:pPr>
+              <w:pStyle w:val="Compact"/>
+            </w:pPr>
+            <w:r>
+              <w:t xml:space="preserve">3.25</w:t>
+            </w:r>
+          </w:p>
+        </w:tc>
+        <w:tc>
+          <w:tcPr/>
+          <w:p>
+            <w:pPr>
+              <w:pStyle w:val="Compact"/>
+            </w:pPr>
+            <w:r>
+              <w:t xml:space="preserve">DELL, TRV, ANET, JPM, THC</w:t>
+            </w:r>
+          </w:p>
+        </w:tc>
+      </w:tr>
+    </w:tbl>
+    <w:p>
+      <w:pPr>
+        <w:pStyle w:val="BodyText"/>
+      </w:pPr>
+      <w:r>
+        <w:t xml:space="preserve">NVDA's selection therefore depends on the unresolved report date as well as the risk judgment. If NVDA confirms a date after Nov 20 before the window starts, DELL takes its slot under the report's own rules.</w:t>
+      </w:r>
+    </w:p>
+    <w:p>
+      <w:pPr>
+        <w:pStyle w:val="BodyText"/>
+      </w:pPr>
+      <w:r>
+        <w:rPr>
+          <w:b/>
+          <w:bCs/>
+        </w:rPr>
+        <w:t xml:space="preserve">Weight changes.</w:t>
+      </w:r>
+      <w:r>
+        <w:t xml:space="preserve"> </w:t>
+      </w:r>
+      <w:r>
+        <w:t xml:space="preserve">Moving any one factor weight by 5 percentage points, and rescaling the others, changed the basket in 7 of 12 cases. Every change was inside the AI slots: NVDA, ANET, APH and DELL rotate, while TRV, JPM and THC stayed in all 12.</w:t>
+      </w:r>
+    </w:p>
+    <w:p>
+      <w:pPr>
+        <w:pStyle w:val="BodyText"/>
+      </w:pPr>
+      <w:r>
+        <w:rPr>
+          <w:b/>
+          <w:bCs/>
+        </w:rPr>
+        <w:t xml:space="preserve">Single-point changes.</w:t>
+      </w:r>
+      <w:r>
+        <w:t xml:space="preserve"> </w:t>
+      </w:r>
+      <w:r>
+        <w:t xml:space="preserve">Across all 252 one-point moves (21 names × 6 factors × up or down), the basket changed in 24. Twenty-two of those rotated the AI slots. The other two were THC losing a point on revisions or catalyst.</w:t>
+      </w:r>
+    </w:p>
+    <w:p>
+      <w:pPr>
+        <w:pStyle w:val="BodyText"/>
+      </w:pPr>
+      <w:r>
+        <w:rPr>
+          <w:b/>
+          <w:bCs/>
+        </w:rPr>
+        <w:t xml:space="preserve">Random noise.</w:t>
+      </w:r>
+      <w:r>
+        <w:t xml:space="preserve"> </w:t>
+      </w:r>
+      <w:r>
+        <w:t xml:space="preserve">We moved every sub-score by −1, 0 or +1 (probabilities 25%, 50%, 25%) and re-ran the selection 20,000 times:</w:t>
+      </w:r>
+    </w:p>
+    <w:tbl>
+      <w:tblPr>
+        <w:tblStyle w:val="Table"/>
+        <w:tblW w:type="auto" w:w="0"/>
+        <w:tblLook w:firstRow="1" w:lastRow="0" w:firstColumn="0" w:lastColumn="0" w:noHBand="0" w:noVBand="0" w:val="0020"/>
+      </w:tblPr>
+      <w:tblGrid>
+        <w:gridCol w:w="3960"/>
+        <w:gridCol w:w="3960"/>
+      </w:tblGrid>
+      <w:tr>
+        <w:trPr>
+          <w:tblHeader w:val="on"/>
+        </w:trPr>
+        <w:tc>
+          <w:tcPr/>
+          <w:p>
+            <w:pPr>
+              <w:pStyle w:val="Compact"/>
+            </w:pPr>
+            <w:r>
+              <w:t xml:space="preserve">Ticker</w:t>
+            </w:r>
+          </w:p>
+        </w:tc>
+        <w:tc>
+          <w:tcPr/>
+          <w:p>
+            <w:pPr>
+              <w:pStyle w:val="Compact"/>
+            </w:pPr>
+            <w:r>
+              <w:t xml:space="preserve">Selected in % of draws</w:t>
+            </w:r>
+          </w:p>
+        </w:tc>
+      </w:tr>
+      <w:tr>
+        <w:tc>
+          <w:tcPr/>
+          <w:p>
+            <w:pPr>
+              <w:pStyle w:val="Compact"/>
+            </w:pPr>
+            <w:r>
+              <w:t xml:space="preserve">TRV</w:t>
+            </w:r>
+          </w:p>
+        </w:tc>
+        <w:tc>
+          <w:tcPr/>
+          <w:p>
+            <w:pPr>
+              <w:pStyle w:val="Compact"/>
+            </w:pPr>
+            <w:r>
+              <w:t xml:space="preserve">91%</w:t>
+            </w:r>
+          </w:p>
+        </w:tc>
+      </w:tr>
+      <w:tr>
+        <w:tc>
+          <w:tcPr/>
+          <w:p>
+            <w:pPr>
+              <w:pStyle w:val="Compact"/>
+            </w:pPr>
+            <w:r>
+              <w:t xml:space="preserve">JPM</w:t>
+            </w:r>
+          </w:p>
+        </w:tc>
+        <w:tc>
+          <w:tcPr/>
+          <w:p>
+            <w:pPr>
+              <w:pStyle w:val="Compact"/>
+            </w:pPr>
+            <w:r>
+              <w:t xml:space="preserve">77%</w:t>
+            </w:r>
+          </w:p>
+        </w:tc>
+      </w:tr>
+      <w:tr>
+        <w:tc>
+          <w:tcPr/>
+          <w:p>
+            <w:pPr>
+              <w:pStyle w:val="Compact"/>
+            </w:pPr>
+            <w:r>
+              <w:t xml:space="preserve">THC</w:t>
+            </w:r>
+          </w:p>
+        </w:tc>
+        <w:tc>
+          <w:tcPr/>
+          <w:p>
+            <w:pPr>
+              <w:pStyle w:val="Compact"/>
+            </w:pPr>
+            <w:r>
+              <w:t xml:space="preserve">64%</w:t>
+            </w:r>
+          </w:p>
+        </w:tc>
+      </w:tr>
+      <w:tr>
+        <w:tc>
+          <w:tcPr/>
+          <w:p>
+            <w:pPr>
+              <w:pStyle w:val="Compact"/>
+            </w:pPr>
+            <w:r>
+              <w:t xml:space="preserve">NVDA</w:t>
+            </w:r>
+          </w:p>
+        </w:tc>
+        <w:tc>
+          <w:tcPr/>
+          <w:p>
+            <w:pPr>
+              <w:pStyle w:val="Compact"/>
+            </w:pPr>
+            <w:r>
+              <w:t xml:space="preserve">52%</w:t>
+            </w:r>
+          </w:p>
+        </w:tc>
+      </w:tr>
+      <w:tr>
+        <w:tc>
+          <w:tcPr/>
+          <w:p>
+            <w:pPr>
+              <w:pStyle w:val="Compact"/>
+            </w:pPr>
+            <w:r>
+              <w:t xml:space="preserve">ANET</w:t>
+            </w:r>
+          </w:p>
+        </w:tc>
+        <w:tc>
+          <w:tcPr/>
+          <w:p>
+            <w:pPr>
+              <w:pStyle w:val="Compact"/>
+            </w:pPr>
+            <w:r>
+              <w:t xml:space="preserve">49%</w:t>
+            </w:r>
+          </w:p>
+        </w:tc>
+      </w:tr>
+      <w:tr>
+        <w:tc>
+          <w:tcPr/>
+          <w:p>
+            <w:pPr>
+              <w:pStyle w:val="Compact"/>
+            </w:pPr>
+            <w:r>
+              <w:t xml:space="preserve">APH</w:t>
+            </w:r>
+          </w:p>
+        </w:tc>
+        <w:tc>
+          <w:tcPr/>
+          <w:p>
+            <w:pPr>
+              <w:pStyle w:val="Compact"/>
+            </w:pPr>
+            <w:r>
+              <w:t xml:space="preserve">43%</w:t>
+            </w:r>
+          </w:p>
+        </w:tc>
+      </w:tr>
+      <w:tr>
+        <w:tc>
+          <w:tcPr/>
+          <w:p>
+            <w:pPr>
+              <w:pStyle w:val="Compact"/>
+            </w:pPr>
+            <w:r>
+              <w:t xml:space="preserve">VLO</w:t>
+            </w:r>
+          </w:p>
+        </w:tc>
+        <w:tc>
+          <w:tcPr/>
+          <w:p>
+            <w:pPr>
+              <w:pStyle w:val="Compact"/>
+            </w:pPr>
+            <w:r>
+              <w:t xml:space="preserve">30%</w:t>
+            </w:r>
+          </w:p>
+        </w:tc>
+      </w:tr>
+      <w:tr>
+        <w:tc>
+          <w:tcPr/>
+          <w:p>
+            <w:pPr>
+              <w:pStyle w:val="Compact"/>
+            </w:pPr>
+            <w:r>
+              <w:t xml:space="preserve">CVE</w:t>
+            </w:r>
+          </w:p>
+        </w:tc>
+        <w:tc>
+          <w:tcPr/>
+          <w:p>
+            <w:pPr>
+              <w:pStyle w:val="Compact"/>
+            </w:pPr>
+            <w:r>
+              <w:t xml:space="preserve">29%</w:t>
+            </w:r>
+          </w:p>
+        </w:tc>
+      </w:tr>
+      <w:tr>
+        <w:tc>
+          <w:tcPr/>
+          <w:p>
+            <w:pPr>
+              <w:pStyle w:val="Compact"/>
+            </w:pPr>
+            <w:r>
+              <w:t xml:space="preserve">DELL</w:t>
+            </w:r>
+          </w:p>
+        </w:tc>
+        <w:tc>
+          <w:tcPr/>
+          <w:p>
+            <w:pPr>
+              <w:pStyle w:val="Compact"/>
+            </w:pPr>
+            <w:r>
+              <w:t xml:space="preserve">28%</w:t>
+            </w:r>
+          </w:p>
+        </w:tc>
+      </w:tr>
+      <w:tr>
+        <w:tc>
+          <w:tcPr/>
+          <w:p>
+            <w:pPr>
+              <w:pStyle w:val="Compact"/>
+            </w:pPr>
+            <w:r>
+              <w:t xml:space="preserve">MU</w:t>
+            </w:r>
+          </w:p>
+        </w:tc>
+        <w:tc>
+          <w:tcPr/>
+          <w:p>
+            <w:pPr>
+              <w:pStyle w:val="Compact"/>
+            </w:pPr>
+            <w:r>
+              <w:t xml:space="preserve">18%</w:t>
+            </w:r>
+          </w:p>
+        </w:tc>
+      </w:tr>
+    </w:tbl>
+    <w:p>
+      <w:pPr>
+        <w:pStyle w:val="BodyText"/>
+      </w:pPr>
+      <w:r>
+        <w:t xml:space="preserve">The exact report basket came up in only 6% of draws, and the most common basket (the mechanical one) in 7%.</w:t>
+      </w:r>
+      <w:r>
+        <w:t xml:space="preserve"> </w:t>
+      </w:r>
+      <w:r>
+        <w:rPr>
+          <w:b/>
+          <w:bCs/>
+        </w:rPr>
+        <w:t xml:space="preserve">Read the output as a robust core of TRV, JPM and THC plus two AI slots that are close to a toss-up among NVDA, ANET, APH and DELL.</w:t>
+      </w:r>
+      <w:r>
+        <w:t xml:space="preserve"> </w:t>
+      </w:r>
+      <w:r>
+        <w:t xml:space="preserve">The claim that these are</w:t>
+      </w:r>
+      <w:r>
+        <w:t xml:space="preserve"> </w:t>
+      </w:r>
+      <w:r>
+        <w:rPr>
+          <w:i/>
+          <w:iCs/>
+        </w:rPr>
+        <w:t xml:space="preserve">the</w:t>
+      </w:r>
+      <w:r>
+        <w:t xml:space="preserve"> </w:t>
+      </w:r>
+      <w:r>
+        <w:t xml:space="preserve">five best stocks is not supported. The data support a shortlist of hypotheses with low confidence in the exact order.</w:t>
+      </w:r>
+    </w:p>
+    <w:p>
+      <w:pPr>
+        <w:pStyle w:val="BodyText"/>
+      </w:pPr>
+      <w:r>
+        <w:rPr>
+          <w:b/>
+          <w:bCs/>
+        </w:rPr>
+        <w:t xml:space="preserve">What the scorecard does not answer.</w:t>
+      </w:r>
+      <w:r>
+        <w:t xml:space="preserve"> </w:t>
+      </w:r>
+      <w:r>
+        <w:t xml:space="preserve">Rising estimates are a documented predictive signal, but the scorecard never asks what the price already expects. TRV's quiet hurricane season is public. JPM's raised guidance is already in the higher consensus. NVDA's relative return depends on beating expectations embedded in a $5.4T valuation. The picks rest on the statistical tendency of revisions and momentum to persist, not on evidence that consensus is wrong.</w:t>
+      </w:r>
+    </w:p>
+    <w:bookmarkEnd w:id="55"/>
+    <w:bookmarkStart w:id="108" w:name="X910b931f07d9527c9934127e8b2d1fa2639ddcb"/>
     <w:p>
       <w:pPr>
         <w:pStyle w:val="Heading2"/>
@@ -5444,7 +6177,7 @@
             <w:pPr>
               <w:pStyle w:val="Compact"/>
             </w:pPr>
-            <w:hyperlink r:id="rId55">
+            <w:hyperlink r:id="rId56">
               <w:r>
                 <w:rPr>
                   <w:rStyle w:val="Hyperlink"/>
@@ -5549,7 +6282,7 @@
             <w:pPr>
               <w:pStyle w:val="Compact"/>
             </w:pPr>
-            <w:hyperlink r:id="rId56">
+            <w:hyperlink r:id="rId57">
               <w:r>
                 <w:rPr>
                   <w:rStyle w:val="Hyperlink"/>
@@ -5622,7 +6355,7 @@
             <w:pPr>
               <w:pStyle w:val="Compact"/>
             </w:pPr>
-            <w:hyperlink r:id="rId57">
+            <w:hyperlink r:id="rId58">
               <w:r>
                 <w:rPr>
                   <w:rStyle w:val="Hyperlink"/>
@@ -5636,7 +6369,7 @@
             <w:r>
               <w:t xml:space="preserve"> </w:t>
             </w:r>
-            <w:hyperlink r:id="rId58">
+            <w:hyperlink r:id="rId59">
               <w:r>
                 <w:rPr>
                   <w:rStyle w:val="Hyperlink"/>
@@ -5741,7 +6474,7 @@
             <w:pPr>
               <w:pStyle w:val="Compact"/>
             </w:pPr>
-            <w:hyperlink r:id="rId59">
+            <w:hyperlink r:id="rId60">
               <w:r>
                 <w:rPr>
                   <w:rStyle w:val="Hyperlink"/>
@@ -5755,7 +6488,7 @@
             <w:r>
               <w:t xml:space="preserve"> </w:t>
             </w:r>
-            <w:hyperlink r:id="rId60">
+            <w:hyperlink r:id="rId61">
               <w:r>
                 <w:rPr>
                   <w:rStyle w:val="Hyperlink"/>
@@ -5828,7 +6561,7 @@
             <w:pPr>
               <w:pStyle w:val="Compact"/>
             </w:pPr>
-            <w:hyperlink r:id="rId61">
+            <w:hyperlink r:id="rId62">
               <w:r>
                 <w:rPr>
                   <w:rStyle w:val="Hyperlink"/>
@@ -5870,7 +6603,7 @@
         <w:t xml:space="preserve">All prices are snippet-sourced and must be re-verified. "n/f" means not found in the notes.</w:t>
       </w:r>
     </w:p>
-    <w:bookmarkStart w:id="73" w:name="Xdaab0caf1efa5c8a7fa875a11e3d429b5c02763"/>
+    <w:bookmarkStart w:id="74" w:name="Xdaab0caf1efa5c8a7fa875a11e3d429b5c02763"/>
     <w:p>
       <w:pPr>
         <w:pStyle w:val="Heading3"/>
@@ -6065,7 +6798,7 @@
       <w:r>
         <w:t xml:space="preserve">, about 4% above the Street, and supply commitments rose to $279B from $119B (</w:t>
       </w:r>
-      <w:hyperlink r:id="rId62">
+      <w:hyperlink r:id="rId63">
         <w:r>
           <w:rPr>
             <w:rStyle w:val="Hyperlink"/>
@@ -6079,7 +6812,7 @@
       <w:r>
         <w:t xml:space="preserve"> </w:t>
       </w:r>
-      <w:hyperlink r:id="rId63">
+      <w:hyperlink r:id="rId64">
         <w:r>
           <w:rPr>
             <w:rStyle w:val="Hyperlink"/>
@@ -6090,7 +6823,7 @@
       <w:r>
         <w:t xml:space="preserve">). It is Zacks Rank #1 (</w:t>
       </w:r>
-      <w:hyperlink r:id="rId64">
+      <w:hyperlink r:id="rId65">
         <w:r>
           <w:rPr>
             <w:rStyle w:val="Hyperlink"/>
@@ -6135,7 +6868,7 @@
       <w:r>
         <w:t xml:space="preserve">at the end of August (</w:t>
       </w:r>
-      <w:hyperlink r:id="rId65">
+      <w:hyperlink r:id="rId66">
         <w:r>
           <w:rPr>
             <w:rStyle w:val="Hyperlink"/>
@@ -6162,7 +6895,23 @@
         <w:t xml:space="preserve"> </w:t>
       </w:r>
       <w:r>
-        <w:t xml:space="preserve">We estimate about 23–25x forward earnings. That is our estimate, not a quoted figure. At roughly 8% of the index, NVDA's relative volatility is low, which supports its downside-risk score of 4. The same weight also means it needs stock-specific outperformance to add much.</w:t>
+        <w:t xml:space="preserve">We estimate about 23–25x forward earnings. That is our estimate, not a quoted figure. At roughly 8% of the index, NVDA's relative volatility is lower than its standalone volatility, and that was the basis for its downside-risk score of 4. That reasoning is incomplete. The risk score was never defined as relative rather than standalone risk. The same volatility table puts semis at about ±18–24% over eight weeks, and semis are the most crowded trade. A score of 3 is at least as defensible.</w:t>
+      </w:r>
+      <w:r>
+        <w:t xml:space="preserve"> </w:t>
+      </w:r>
+      <w:r>
+        <w:rPr>
+          <w:b/>
+          <w:bCs/>
+        </w:rPr>
+        <w:t xml:space="preserve">At 3, NVDA falls to 3.60 and leaves the basket, replaced by DELL.</w:t>
+      </w:r>
+      <w:r>
+        <w:t xml:space="preserve"> </w:t>
+      </w:r>
+      <w:r>
+        <w:t xml:space="preserve">The same weight also means NVDA needs stock-specific outperformance to add much.</w:t>
       </w:r>
     </w:p>
     <w:p>
@@ -6200,7 +6949,7 @@
       <w:r>
         <w:t xml:space="preserve">TSMC's Q3 call on Oct 15 (</w:t>
       </w:r>
-      <w:hyperlink r:id="rId66">
+      <w:hyperlink r:id="rId67">
         <w:r>
           <w:rPr>
             <w:rStyle w:val="Hyperlink"/>
@@ -6222,45 +6971,6 @@
       </w:pPr>
       <w:r>
         <w:t xml:space="preserve">Hyperscaler reports around Oct 27–30. MSFT is expected Oct 28 but is unconfirmed (</w:t>
-      </w:r>
-      <w:hyperlink r:id="rId67">
-        <w:r>
-          <w:rPr>
-            <w:rStyle w:val="Hyperlink"/>
-          </w:rPr>
-          <w:t xml:space="preserve">Wall Street Horizon</w:t>
-        </w:r>
-      </w:hyperlink>
-      <w:r>
-        <w:t xml:space="preserve">).</w:t>
-      </w:r>
-    </w:p>
-    <w:p>
-      <w:pPr>
-        <w:pStyle w:val="Compact"/>
-        <w:numPr>
-          <w:ilvl w:val="0"/>
-          <w:numId w:val="1005"/>
-        </w:numPr>
-      </w:pPr>
-      <w:r>
-        <w:t xml:space="preserve">NVDA's own Q3 FY27 report. Wall Street Horizon lists it as confirmed for</w:t>
-      </w:r>
-      <w:r>
-        <w:t xml:space="preserve"> </w:t>
-      </w:r>
-      <w:r>
-        <w:rPr>
-          <w:b/>
-          <w:bCs/>
-        </w:rPr>
-        <w:t xml:space="preserve">Nov 17</w:t>
-      </w:r>
-      <w:r>
-        <w:t xml:space="preserve"> </w:t>
-      </w:r>
-      <w:r>
-        <w:t xml:space="preserve">after the close, but Investing.com shows Nov 25, outside the window (</w:t>
       </w:r>
       <w:hyperlink r:id="rId68">
         <w:r>
@@ -6271,12 +6981,51 @@
         </w:r>
       </w:hyperlink>
       <w:r>
+        <w:t xml:space="preserve">).</w:t>
+      </w:r>
+    </w:p>
+    <w:p>
+      <w:pPr>
+        <w:pStyle w:val="Compact"/>
+        <w:numPr>
+          <w:ilvl w:val="0"/>
+          <w:numId w:val="1005"/>
+        </w:numPr>
+      </w:pPr>
+      <w:r>
+        <w:t xml:space="preserve">NVDA's own Q3 FY27 report. Wall Street Horizon lists it as confirmed for</w:t>
+      </w:r>
+      <w:r>
+        <w:t xml:space="preserve"> </w:t>
+      </w:r>
+      <w:r>
+        <w:rPr>
+          <w:b/>
+          <w:bCs/>
+        </w:rPr>
+        <w:t xml:space="preserve">Nov 17</w:t>
+      </w:r>
+      <w:r>
+        <w:t xml:space="preserve"> </w:t>
+      </w:r>
+      <w:r>
+        <w:t xml:space="preserve">after the close, but Investing.com shows Nov 25, outside the window (</w:t>
+      </w:r>
+      <w:hyperlink r:id="rId69">
+        <w:r>
+          <w:rPr>
+            <w:rStyle w:val="Hyperlink"/>
+          </w:rPr>
+          <w:t xml:space="preserve">Wall Street Horizon</w:t>
+        </w:r>
+      </w:hyperlink>
+      <w:r>
         <w:t xml:space="preserve">;</w:t>
       </w:r>
       <w:r>
         <w:t xml:space="preserve"> </w:t>
       </w:r>
-      <w:hyperlink r:id="rId69">
+      <w:hyperlink r:id="rId70">
         <w:r>
           <w:rPr>
             <w:rStyle w:val="Hyperlink"/>
@@ -6305,7 +7054,7 @@
       <w:r>
         <w:t xml:space="preserve">Shares have "stalled" despite $600B of AI capex, because investors doubt that AI revenue scales with spending (</w:t>
       </w:r>
-      <w:hyperlink r:id="rId70">
+      <w:hyperlink r:id="rId71">
         <w:r>
           <w:rPr>
             <w:rStyle w:val="Hyperlink"/>
@@ -6332,7 +7081,7 @@
       <w:r>
         <w:t xml:space="preserve">(</w:t>
       </w:r>
-      <w:hyperlink r:id="rId71">
+      <w:hyperlink r:id="rId72">
         <w:r>
           <w:rPr>
             <w:rStyle w:val="Hyperlink"/>
@@ -6343,7 +7092,7 @@
       <w:r>
         <w:t xml:space="preserve">). On Sep 24, Oracle's force-majeure notice on the New Mexico Stargate site became the first dated crack in AI-capex financing (</w:t>
       </w:r>
-      <w:hyperlink r:id="rId72">
+      <w:hyperlink r:id="rId73">
         <w:r>
           <w:rPr>
             <w:rStyle w:val="Hyperlink"/>
@@ -6416,8 +7165,8 @@
         <w:t xml:space="preserve">, the level before the Aug 26 report. That is about 8.7% below the reference price.</w:t>
       </w:r>
     </w:p>
-    <w:bookmarkEnd w:id="73"/>
-    <w:bookmarkStart w:id="84" w:name="X4871b4c12928ca2c0977976d8a81b529575a380"/>
+    <w:bookmarkEnd w:id="74"/>
+    <w:bookmarkStart w:id="85" w:name="X4871b4c12928ca2c0977976d8a81b529575a380"/>
     <w:p>
       <w:pPr>
         <w:pStyle w:val="Heading3"/>
@@ -6474,7 +7223,7 @@
       <w:r>
         <w:t xml:space="preserve">, depending on which Zacks piece is cited (</w:t>
       </w:r>
-      <w:hyperlink r:id="rId74">
+      <w:hyperlink r:id="rId75">
         <w:r>
           <w:rPr>
             <w:rStyle w:val="Hyperlink"/>
@@ -6501,7 +7250,7 @@
       <w:r>
         <w:t xml:space="preserve">(</w:t>
       </w:r>
-      <w:hyperlink r:id="rId75">
+      <w:hyperlink r:id="rId76">
         <w:r>
           <w:rPr>
             <w:rStyle w:val="Hyperlink"/>
@@ -6546,7 +7295,7 @@
       <w:r>
         <w:t xml:space="preserve">but fell 4.51% in the seven days to Sep 24 (</w:t>
       </w:r>
-      <w:hyperlink r:id="rId56">
+      <w:hyperlink r:id="rId57">
         <w:r>
           <w:rPr>
             <w:rStyle w:val="Hyperlink"/>
@@ -6557,7 +7306,7 @@
       <w:r>
         <w:t xml:space="preserve">). The all-time high was $398.70 on Jul 28 (</w:t>
       </w:r>
-      <w:hyperlink r:id="rId76">
+      <w:hyperlink r:id="rId77">
         <w:r>
           <w:rPr>
             <w:rStyle w:val="Hyperlink"/>
@@ -6599,7 +7348,7 @@
       <w:r>
         <w:t xml:space="preserve">, confirmed by the company (</w:t>
       </w:r>
-      <w:hyperlink r:id="rId77">
+      <w:hyperlink r:id="rId78">
         <w:r>
           <w:rPr>
             <w:rStyle w:val="Hyperlink"/>
@@ -6622,7 +7371,7 @@
       <w:r>
         <w:t xml:space="preserve">The 2026 Atlantic season has been "extremely inactive" (</w:t>
       </w:r>
-      <w:hyperlink r:id="rId78">
+      <w:hyperlink r:id="rId79">
         <w:r>
           <w:rPr>
             <w:rStyle w:val="Hyperlink"/>
@@ -6645,7 +7394,7 @@
       <w:r>
         <w:t xml:space="preserve">First-half insured catastrophe losses were below trend (</w:t>
       </w:r>
-      <w:hyperlink r:id="rId79">
+      <w:hyperlink r:id="rId80">
         <w:r>
           <w:rPr>
             <w:rStyle w:val="Hyperlink"/>
@@ -6668,7 +7417,7 @@
       <w:r>
         <w:t xml:space="preserve">Q2 profit rose 46% on lower catastrophe losses (</w:t>
       </w:r>
-      <w:hyperlink r:id="rId80">
+      <w:hyperlink r:id="rId81">
         <w:r>
           <w:rPr>
             <w:rStyle w:val="Hyperlink"/>
@@ -6709,17 +7458,6 @@
       </w:r>
       <w:r>
         <w:t xml:space="preserve">. Morgan Stanley and Barclays have Underweight calls, though those predate the July high (</w:t>
-      </w:r>
-      <w:hyperlink r:id="rId81">
-        <w:r>
-          <w:rPr>
-            <w:rStyle w:val="Hyperlink"/>
-          </w:rPr>
-          <w:t xml:space="preserve">Investing.com</w:t>
-        </w:r>
-      </w:hyperlink>
-      <w:r>
-        <w:t xml:space="preserve">). Commercial property pricing is softening (</w:t>
       </w:r>
       <w:hyperlink r:id="rId82">
         <w:r>
@@ -6730,9 +7468,20 @@
         </w:r>
       </w:hyperlink>
       <w:r>
+        <w:t xml:space="preserve">). Commercial property pricing is softening (</w:t>
+      </w:r>
+      <w:hyperlink r:id="rId83">
+        <w:r>
+          <w:rPr>
+            <w:rStyle w:val="Hyperlink"/>
+          </w:rPr>
+          <w:t xml:space="preserve">Investing.com</w:t>
+        </w:r>
+      </w:hyperlink>
+      <w:r>
         <w:t xml:space="preserve">). A headline about storm losses weighing on the shares exists, but we could not verify its date or content (</w:t>
       </w:r>
-      <w:hyperlink r:id="rId83">
+      <w:hyperlink r:id="rId84">
         <w:r>
           <w:rPr>
             <w:rStyle w:val="Hyperlink"/>
@@ -6820,8 +7569,8 @@
         <w:t xml:space="preserve">before the report. This level is our inference, only 3.4% below the reference price, so it is noise-prone and should be read alongside the fundamental signals.</w:t>
       </w:r>
     </w:p>
-    <w:bookmarkEnd w:id="84"/>
-    <w:bookmarkStart w:id="92" w:name="Xebaa6290fe80fa072f7530588114ef93afcc423"/>
+    <w:bookmarkEnd w:id="85"/>
+    <w:bookmarkStart w:id="93" w:name="Xebaa6290fe80fa072f7530588114ef93afcc423"/>
     <w:p>
       <w:pPr>
         <w:pStyle w:val="Heading3"/>
@@ -6881,7 +7630,7 @@
       <w:r>
         <w:t xml:space="preserve">(</w:t>
       </w:r>
-      <w:hyperlink r:id="rId85">
+      <w:hyperlink r:id="rId86">
         <w:r>
           <w:rPr>
             <w:rStyle w:val="Hyperlink"/>
@@ -6932,7 +7681,7 @@
       <w:r>
         <w:t xml:space="preserve">(</w:t>
       </w:r>
-      <w:hyperlink r:id="rId86">
+      <w:hyperlink r:id="rId87">
         <w:r>
           <w:rPr>
             <w:rStyle w:val="Hyperlink"/>
@@ -6955,7 +7704,7 @@
       <w:r>
         <w:t xml:space="preserve">BNP raised its estimates after a management meeting (</w:t>
       </w:r>
-      <w:hyperlink r:id="rId87">
+      <w:hyperlink r:id="rId88">
         <w:r>
           <w:rPr>
             <w:rStyle w:val="Hyperlink"/>
@@ -7032,7 +7781,7 @@
       <w:r>
         <w:t xml:space="preserve">(</w:t>
       </w:r>
-      <w:hyperlink r:id="rId88">
+      <w:hyperlink r:id="rId89">
         <w:r>
           <w:rPr>
             <w:rStyle w:val="Hyperlink"/>
@@ -7055,7 +7804,7 @@
       <w:r>
         <w:t xml:space="preserve">The June-quarter EPS of $1.35 (pre-split) beat the $1.19 estimate (</w:t>
       </w:r>
-      <w:hyperlink r:id="rId89">
+      <w:hyperlink r:id="rId90">
         <w:r>
           <w:rPr>
             <w:rStyle w:val="Hyperlink"/>
@@ -7078,7 +7827,7 @@
       <w:r>
         <w:t xml:space="preserve">Bernstein initiated at Outperform with a $99 target (</w:t>
       </w:r>
-      <w:hyperlink r:id="rId90">
+      <w:hyperlink r:id="rId91">
         <w:r>
           <w:rPr>
             <w:rStyle w:val="Hyperlink"/>
@@ -7151,7 +7900,7 @@
       <w:r>
         <w:t xml:space="preserve">, though that article's date is unclear (</w:t>
       </w:r>
-      <w:hyperlink r:id="rId91">
+      <w:hyperlink r:id="rId92">
         <w:r>
           <w:rPr>
             <w:rStyle w:val="Hyperlink"/>
@@ -7224,8 +7973,8 @@
         <w:t xml:space="preserve">, the Sep 18 low, before the report. That is about 7.8% below the reference price.</w:t>
       </w:r>
     </w:p>
-    <w:bookmarkEnd w:id="92"/>
-    <w:bookmarkStart w:id="96" w:name="X307d773aad3219b45b0db73b2d276a6869901f7"/>
+    <w:bookmarkEnd w:id="93"/>
+    <w:bookmarkStart w:id="97" w:name="X307d773aad3219b45b0db73b2d276a6869901f7"/>
     <w:p>
       <w:pPr>
         <w:pStyle w:val="Heading3"/>
@@ -7249,7 +7998,7 @@
         <w:t xml:space="preserve"> </w:t>
       </w:r>
       <w:r>
-        <w:t xml:space="preserve">JPM is the first major S&amp;P 500 report of the season. Management has already guided the key lines up, so the print is more likely to beat than miss. The stock is trading on rates, not earnings.</w:t>
+        <w:t xml:space="preserve">JPM is the first major S&amp;P 500 report of the season. Management has already guided the key lines up. That guidance is probably already in the higher consensus, so the case rests on revision momentum persisting, not on an expected beat of the updated estimate. The stock is trading on rates, not earnings.</w:t>
       </w:r>
     </w:p>
     <w:p>
@@ -9186,7 +9935,7 @@
       <w:r>
         <w:t xml:space="preserve">(</w:t>
       </w:r>
-      <w:hyperlink r:id="rId59">
+      <w:hyperlink r:id="rId60">
         <w:r>
           <w:rPr>
             <w:rStyle w:val="Hyperlink"/>
@@ -9231,7 +9980,7 @@
       <w:r>
         <w:t xml:space="preserve">at about 7:00am ET, confirmed by the company (</w:t>
       </w:r>
-      <w:hyperlink r:id="rId93">
+      <w:hyperlink r:id="rId94">
         <w:r>
           <w:rPr>
             <w:rStyle w:val="Hyperlink"/>
@@ -9276,7 +10025,7 @@
       <w:r>
         <w:t xml:space="preserve">when the 10-year topped 5%, amid a near-flat curve (</w:t>
       </w:r>
-      <w:hyperlink r:id="rId94">
+      <w:hyperlink r:id="rId95">
         <w:r>
           <w:rPr>
             <w:rStyle w:val="Hyperlink"/>
@@ -9287,7 +10036,7 @@
       <w:r>
         <w:t xml:space="preserve">). BofA's CEO guided Q3 trading "relatively flat", and BAC fell about 5% (</w:t>
       </w:r>
-      <w:hyperlink r:id="rId95">
+      <w:hyperlink r:id="rId96">
         <w:r>
           <w:rPr>
             <w:rStyle w:val="Hyperlink"/>
@@ -9374,8 +10123,8 @@
         <w:t xml:space="preserve">The 10-year holding above 5.25%.</w:t>
       </w:r>
     </w:p>
-    <w:bookmarkEnd w:id="96"/>
-    <w:bookmarkStart w:id="106" w:name="X937c853dc5e5c589e9cf7fe89f4c3cc4ab5ee3d"/>
+    <w:bookmarkEnd w:id="97"/>
+    <w:bookmarkStart w:id="107" w:name="X937c853dc5e5c589e9cf7fe89f4c3cc4ab5ee3d"/>
     <w:p>
       <w:pPr>
         <w:pStyle w:val="Heading3"/>
@@ -9434,152 +10183,6 @@
           <w:bCs/>
         </w:rPr>
         <w:t xml:space="preserve">+50% since $173.20 on May 28</w:t>
-      </w:r>
-      <w:r>
-        <w:t xml:space="preserve"> </w:t>
-      </w:r>
-      <w:r>
-        <w:t xml:space="preserve">(</w:t>
-      </w:r>
-      <w:hyperlink r:id="rId97">
-        <w:r>
-          <w:rPr>
-            <w:rStyle w:val="Hyperlink"/>
-          </w:rPr>
-          <w:t xml:space="preserve">GuruFocus</w:t>
-        </w:r>
-      </w:hyperlink>
-      <w:r>
-        <w:t xml:space="preserve">).</w:t>
-      </w:r>
-    </w:p>
-    <w:p>
-      <w:pPr>
-        <w:pStyle w:val="Compact"/>
-        <w:numPr>
-          <w:ilvl w:val="0"/>
-          <w:numId w:val="1012"/>
-        </w:numPr>
-      </w:pPr>
-      <w:r>
-        <w:t xml:space="preserve">The 50-day average (</w:t>
-      </w:r>
-      <m:oMath>
-        <m:r>
-          <m:t>243.71</m:t>
-        </m:r>
-        <m:r>
-          <m:rPr>
-            <m:sty m:val="p"/>
-          </m:rPr>
-          <m:t>)</m:t>
-        </m:r>
-        <m:r>
-          <m:t>i</m:t>
-        </m:r>
-        <m:r>
-          <m:t>s</m:t>
-        </m:r>
-        <m:r>
-          <m:t>a</m:t>
-        </m:r>
-        <m:r>
-          <m:t>b</m:t>
-        </m:r>
-        <m:r>
-          <m:t>o</m:t>
-        </m:r>
-        <m:r>
-          <m:t>v</m:t>
-        </m:r>
-        <m:r>
-          <m:t>e</m:t>
-        </m:r>
-        <m:r>
-          <m:t>t</m:t>
-        </m:r>
-        <m:r>
-          <m:t>h</m:t>
-        </m:r>
-        <m:r>
-          <m:t>e</m:t>
-        </m:r>
-        <m:r>
-          <m:t>200</m:t>
-        </m:r>
-        <m:r>
-          <m:rPr>
-            <m:sty m:val="p"/>
-          </m:rPr>
-          <m:t>−</m:t>
-        </m:r>
-        <m:r>
-          <m:t>d</m:t>
-        </m:r>
-        <m:r>
-          <m:t>a</m:t>
-        </m:r>
-        <m:r>
-          <m:t>y</m:t>
-        </m:r>
-        <m:r>
-          <m:rPr>
-            <m:sty m:val="p"/>
-          </m:rPr>
-          <m:t>(</m:t>
-        </m:r>
-      </m:oMath>
-      <w:r>
-        <w:t xml:space="preserve">209.69), with</w:t>
-      </w:r>
-      <w:r>
-        <w:t xml:space="preserve"> </w:t>
-      </w:r>
-      <w:r>
-        <w:rPr>
-          <w:b/>
-          <w:bCs/>
-        </w:rPr>
-        <w:t xml:space="preserve">RSI at 75.3</w:t>
-      </w:r>
-      <w:r>
-        <w:t xml:space="preserve"> </w:t>
-      </w:r>
-      <w:r>
-        <w:t xml:space="preserve">(</w:t>
-      </w:r>
-      <w:hyperlink r:id="rId61">
-        <w:r>
-          <w:rPr>
-            <w:rStyle w:val="Hyperlink"/>
-          </w:rPr>
-          <w:t xml:space="preserve">GuruFocus</w:t>
-        </w:r>
-      </w:hyperlink>
-      <w:r>
-        <w:t xml:space="preserve">).</w:t>
-      </w:r>
-    </w:p>
-    <w:p>
-      <w:pPr>
-        <w:pStyle w:val="Compact"/>
-        <w:numPr>
-          <w:ilvl w:val="0"/>
-          <w:numId w:val="1012"/>
-        </w:numPr>
-      </w:pPr>
-      <w:r>
-        <w:t xml:space="preserve">Forward P/E is</w:t>
-      </w:r>
-      <w:r>
-        <w:t xml:space="preserve"> </w:t>
-      </w:r>
-      <w:r>
-        <w:rPr>
-          <w:b/>
-          <w:bCs/>
-        </w:rPr>
-        <w:t xml:space="preserve">12.63</w:t>
       </w:r>
       <w:r>
         <w:t xml:space="preserve"> </w:t>
@@ -9608,9 +10211,155 @@
         </w:numPr>
       </w:pPr>
       <w:r>
+        <w:t xml:space="preserve">The 50-day average (</w:t>
+      </w:r>
+      <m:oMath>
+        <m:r>
+          <m:t>243.71</m:t>
+        </m:r>
+        <m:r>
+          <m:rPr>
+            <m:sty m:val="p"/>
+          </m:rPr>
+          <m:t>)</m:t>
+        </m:r>
+        <m:r>
+          <m:t>i</m:t>
+        </m:r>
+        <m:r>
+          <m:t>s</m:t>
+        </m:r>
+        <m:r>
+          <m:t>a</m:t>
+        </m:r>
+        <m:r>
+          <m:t>b</m:t>
+        </m:r>
+        <m:r>
+          <m:t>o</m:t>
+        </m:r>
+        <m:r>
+          <m:t>v</m:t>
+        </m:r>
+        <m:r>
+          <m:t>e</m:t>
+        </m:r>
+        <m:r>
+          <m:t>t</m:t>
+        </m:r>
+        <m:r>
+          <m:t>h</m:t>
+        </m:r>
+        <m:r>
+          <m:t>e</m:t>
+        </m:r>
+        <m:r>
+          <m:t>200</m:t>
+        </m:r>
+        <m:r>
+          <m:rPr>
+            <m:sty m:val="p"/>
+          </m:rPr>
+          <m:t>−</m:t>
+        </m:r>
+        <m:r>
+          <m:t>d</m:t>
+        </m:r>
+        <m:r>
+          <m:t>a</m:t>
+        </m:r>
+        <m:r>
+          <m:t>y</m:t>
+        </m:r>
+        <m:r>
+          <m:rPr>
+            <m:sty m:val="p"/>
+          </m:rPr>
+          <m:t>(</m:t>
+        </m:r>
+      </m:oMath>
+      <w:r>
+        <w:t xml:space="preserve">209.69), with</w:t>
+      </w:r>
+      <w:r>
+        <w:t xml:space="preserve"> </w:t>
+      </w:r>
+      <w:r>
+        <w:rPr>
+          <w:b/>
+          <w:bCs/>
+        </w:rPr>
+        <w:t xml:space="preserve">RSI at 75.3</w:t>
+      </w:r>
+      <w:r>
+        <w:t xml:space="preserve"> </w:t>
+      </w:r>
+      <w:r>
+        <w:t xml:space="preserve">(</w:t>
+      </w:r>
+      <w:hyperlink r:id="rId62">
+        <w:r>
+          <w:rPr>
+            <w:rStyle w:val="Hyperlink"/>
+          </w:rPr>
+          <w:t xml:space="preserve">GuruFocus</w:t>
+        </w:r>
+      </w:hyperlink>
+      <w:r>
+        <w:t xml:space="preserve">).</w:t>
+      </w:r>
+    </w:p>
+    <w:p>
+      <w:pPr>
+        <w:pStyle w:val="Compact"/>
+        <w:numPr>
+          <w:ilvl w:val="0"/>
+          <w:numId w:val="1012"/>
+        </w:numPr>
+      </w:pPr>
+      <w:r>
+        <w:t xml:space="preserve">Forward P/E is</w:t>
+      </w:r>
+      <w:r>
+        <w:t xml:space="preserve"> </w:t>
+      </w:r>
+      <w:r>
+        <w:rPr>
+          <w:b/>
+          <w:bCs/>
+        </w:rPr>
+        <w:t xml:space="preserve">12.63</w:t>
+      </w:r>
+      <w:r>
+        <w:t xml:space="preserve"> </w:t>
+      </w:r>
+      <w:r>
+        <w:t xml:space="preserve">(</w:t>
+      </w:r>
+      <w:hyperlink r:id="rId99">
+        <w:r>
+          <w:rPr>
+            <w:rStyle w:val="Hyperlink"/>
+          </w:rPr>
+          <w:t xml:space="preserve">GuruFocus</w:t>
+        </w:r>
+      </w:hyperlink>
+      <w:r>
+        <w:t xml:space="preserve">).</w:t>
+      </w:r>
+    </w:p>
+    <w:p>
+      <w:pPr>
+        <w:pStyle w:val="Compact"/>
+        <w:numPr>
+          <w:ilvl w:val="0"/>
+          <w:numId w:val="1012"/>
+        </w:numPr>
+      </w:pPr>
+      <w:r>
         <w:t xml:space="preserve">Short interest is only about 1.89M shares (</w:t>
       </w:r>
-      <w:hyperlink r:id="rId99">
+      <w:hyperlink r:id="rId100">
         <w:r>
           <w:rPr>
             <w:rStyle w:val="Hyperlink"/>
@@ -9639,7 +10388,7 @@
       <w:r>
         <w:t xml:space="preserve">Q2 adjusted EBITDA rose 16.3% and EPS 52%, and 2026 guidance was raised (</w:t>
       </w:r>
-      <w:hyperlink r:id="rId100">
+      <w:hyperlink r:id="rId101">
         <w:r>
           <w:rPr>
             <w:rStyle w:val="Hyperlink"/>
@@ -9760,7 +10509,7 @@
       <w:r>
         <w:t xml:space="preserve">289.05** (</w:t>
       </w:r>
-      <w:hyperlink r:id="rId101">
+      <w:hyperlink r:id="rId102">
         <w:r>
           <w:rPr>
             <w:rStyle w:val="Hyperlink"/>
@@ -9789,7 +10538,7 @@
       <w:r>
         <w:t xml:space="preserve">THC has reported Q3 on Oct 28–30 in each of the last three years (</w:t>
       </w:r>
-      <w:hyperlink r:id="rId102">
+      <w:hyperlink r:id="rId103">
         <w:r>
           <w:rPr>
             <w:rStyle w:val="Hyperlink"/>
@@ -9862,7 +10611,7 @@
       <w:r>
         <w:t xml:space="preserve">(</w:t>
       </w:r>
-      <w:hyperlink r:id="rId103">
+      <w:hyperlink r:id="rId104">
         <w:r>
           <w:rPr>
             <w:rStyle w:val="Hyperlink"/>
@@ -9885,7 +10634,7 @@
       <w:r>
         <w:t xml:space="preserve">Q2 exchange admissions fell 13.5% (</w:t>
       </w:r>
-      <w:hyperlink r:id="rId104">
+      <w:hyperlink r:id="rId105">
         <w:r>
           <w:rPr>
             <w:rStyle w:val="Hyperlink"/>
@@ -9918,7 +10667,7 @@
       <w:r>
         <w:t xml:space="preserve">(</w:t>
       </w:r>
-      <w:hyperlink r:id="rId105">
+      <w:hyperlink r:id="rId106">
         <w:r>
           <w:rPr>
             <w:rStyle w:val="Hyperlink"/>
@@ -10003,9 +10752,9 @@
         <w:t xml:space="preserve">, about 6.0% below the reference price.</w:t>
       </w:r>
     </w:p>
-    <w:bookmarkEnd w:id="106"/>
     <w:bookmarkEnd w:id="107"/>
-    <w:bookmarkStart w:id="114" w:name="two-event-clusters-decide-the-window"/>
+    <w:bookmarkEnd w:id="108"/>
+    <w:bookmarkStart w:id="115" w:name="two-event-clusters-decide-the-window"/>
     <w:p>
       <w:pPr>
         <w:pStyle w:val="Heading2"/>
@@ -10096,7 +10845,7 @@
             <w:r>
               <w:t xml:space="preserve">US–China "protected lane" deal details (</w:t>
             </w:r>
-            <w:hyperlink r:id="rId108">
+            <w:hyperlink r:id="rId109">
               <w:r>
                 <w:rPr>
                   <w:rStyle w:val="Hyperlink"/>
@@ -10153,7 +10902,7 @@
             <w:r>
               <w:t xml:space="preserve">Micron FQ4 results, after close (</w:t>
             </w:r>
-            <w:hyperlink r:id="rId109">
+            <w:hyperlink r:id="rId110">
               <w:r>
                 <w:rPr>
                   <w:rStyle w:val="Hyperlink"/>
@@ -10210,7 +10959,7 @@
             <w:r>
               <w:t xml:space="preserve">September jobs report (</w:t>
             </w:r>
-            <w:hyperlink r:id="rId110">
+            <w:hyperlink r:id="rId111">
               <w:r>
                 <w:rPr>
                   <w:rStyle w:val="Hyperlink"/>
@@ -10277,7 +11026,7 @@
             <w:r>
               <w:t xml:space="preserve">(~7:00am ET); UNH (</w:t>
             </w:r>
-            <w:hyperlink r:id="rId111">
+            <w:hyperlink r:id="rId112">
               <w:r>
                 <w:rPr>
                   <w:rStyle w:val="Hyperlink"/>
@@ -10952,7 +11701,7 @@
             <w:r>
               <w:t xml:space="preserve">Treasury quarterly refunding (</w:t>
             </w:r>
-            <w:hyperlink r:id="rId112">
+            <w:hyperlink r:id="rId113">
               <w:r>
                 <w:rPr>
                   <w:rStyle w:val="Hyperlink"/>
@@ -11055,7 +11804,7 @@
             <w:r>
               <w:t xml:space="preserve">October CPI (</w:t>
             </w:r>
-            <w:hyperlink r:id="rId113">
+            <w:hyperlink r:id="rId114">
               <w:r>
                 <w:rPr>
                   <w:rStyle w:val="Hyperlink"/>
@@ -11242,8 +11991,8 @@
         <w:t xml:space="preserve">NVDA's report may add a third decision point in the final three trading days.</w:t>
       </w:r>
     </w:p>
-    <w:bookmarkEnd w:id="114"/>
-    <w:bookmarkStart w:id="118" w:name="X63b89da5788a912fdb407a113e9ad725352439e"/>
+    <w:bookmarkEnd w:id="115"/>
+    <w:bookmarkStart w:id="119" w:name="X63b89da5788a912fdb407a113e9ad725352439e"/>
     <w:p>
       <w:pPr>
         <w:pStyle w:val="Heading2"/>
@@ -11269,7 +12018,7 @@
       <w:r>
         <w:t xml:space="preserve">would push oil and then yields down. Our notes' scenario map shows this would hurt energy and defense and lift airlines, rate-sensitive stocks and small caps. When the Iran offer surfaced, airlines rose 6–8% in a week (</w:t>
       </w:r>
-      <w:hyperlink r:id="rId115">
+      <w:hyperlink r:id="rId116">
         <w:r>
           <w:rPr>
             <w:rStyle w:val="Hyperlink"/>
@@ -11324,7 +12073,7 @@
       <w:r>
         <w:t xml:space="preserve">would test the NVDA and APH slots, 40% of an equal-weight basket. Oracle's Sep 24 force-majeure notice was the first dated crack (</w:t>
       </w:r>
-      <w:hyperlink r:id="rId116">
+      <w:hyperlink r:id="rId117">
         <w:r>
           <w:rPr>
             <w:rStyle w:val="Hyperlink"/>
@@ -11335,7 +12084,7 @@
       <w:r>
         <w:t xml:space="preserve">). The GLJ note on GEV showed the whole AI-power complex trading as one factor that day: ETN fell 7% and PWR 4% (</w:t>
       </w:r>
-      <w:hyperlink r:id="rId117">
+      <w:hyperlink r:id="rId118">
         <w:r>
           <w:rPr>
             <w:rStyle w:val="Hyperlink"/>
@@ -11344,7 +12093,7 @@
         </w:r>
       </w:hyperlink>
       <w:r>
-        <w:t xml:space="preserve">). The index itself is heavily AI-weighted, with NVDA alone about 8%. So an AI sell-off hits the benchmark too, and the basket's 60% non-AI weight would likely help relative returns in that scenario. This is the logic behind the AI-hardware cap.</w:t>
+        <w:t xml:space="preserve">). The index itself is heavily AI-weighted, with NVDA alone about 8%. So an AI sell-off hits the benchmark too. Whether the basket's 60% non-AI weight helps relative returns in that scenario depends on the basket's total AI sensitivity against the benchmark's. That includes indirect exposure, such as JPM's and TRV's losses in an AI-led risk-off. We have not measured it, so the cap is a sensible precaution, not demonstrated protection.</w:t>
       </w:r>
     </w:p>
     <w:p>
@@ -11383,8 +12132,8 @@
         <w:t xml:space="preserve">adds to the risk. Two picks report within four days of each other, and three more sit in the Oct 27–30 week. Earnings-gap risk is therefore concentrated rather than spread across the window.</w:t>
       </w:r>
     </w:p>
-    <w:bookmarkEnd w:id="118"/>
-    <w:bookmarkStart w:id="124" w:name="conflicting-figures-across-the-notes"/>
+    <w:bookmarkEnd w:id="119"/>
+    <w:bookmarkStart w:id="125" w:name="conflicting-figures-across-the-notes"/>
     <w:p>
       <w:pPr>
         <w:pStyle w:val="Heading2"/>
@@ -11530,7 +12279,7 @@
             <w:r>
               <w:t xml:space="preserve">) vs "below $98" (Yahoo) vs about $106 (</w:t>
             </w:r>
-            <w:hyperlink r:id="rId119">
+            <w:hyperlink r:id="rId120">
               <w:r>
                 <w:rPr>
                   <w:rStyle w:val="Hyperlink"/>
@@ -11657,7 +12406,7 @@
             <w:r>
               <w:t xml:space="preserve">Energy +38.8% / +40.01% / +38.4%; Tech +35.24% vs +24.1% (</w:t>
             </w:r>
-            <w:hyperlink r:id="rId120">
+            <w:hyperlink r:id="rId121">
               <w:r>
                 <w:rPr>
                   <w:rStyle w:val="Hyperlink"/>
@@ -11773,7 +12522,7 @@
             <w:r>
               <w:t xml:space="preserve">42 negative + 72 positive = 114, not the stated 111 (</w:t>
             </w:r>
-            <w:hyperlink r:id="rId121">
+            <w:hyperlink r:id="rId122">
               <w:r>
                 <w:rPr>
                   <w:rStyle w:val="Hyperlink"/>
@@ -11854,7 +12603,7 @@
             <w:r>
               <w:t xml:space="preserve">−1.24% after hours (low-quality blog) vs +8.7% the next day (</w:t>
             </w:r>
-            <w:hyperlink r:id="rId122">
+            <w:hyperlink r:id="rId123">
               <w:r>
                 <w:rPr>
                   <w:rStyle w:val="Hyperlink"/>
@@ -12040,7 +12789,7 @@
             <w:r>
               <w:t xml:space="preserve">"Near-flat" (</w:t>
             </w:r>
-            <w:hyperlink r:id="rId94">
+            <w:hyperlink r:id="rId95">
               <w:r>
                 <w:rPr>
                   <w:rStyle w:val="Hyperlink"/>
@@ -12051,7 +12800,7 @@
             <w:r>
               <w:t xml:space="preserve">) vs 2s/10s about +0.52% (</w:t>
             </w:r>
-            <w:hyperlink r:id="rId123">
+            <w:hyperlink r:id="rId124">
               <w:r>
                 <w:rPr>
                   <w:rStyle w:val="Hyperlink"/>
@@ -12217,8 +12966,8 @@
         </w:tc>
       </w:tr>
     </w:tbl>
-    <w:bookmarkEnd w:id="124"/>
-    <w:bookmarkStart w:id="125" w:name="grading-the-picks-on-nov-20-and-nov-23"/>
+    <w:bookmarkEnd w:id="125"/>
+    <w:bookmarkStart w:id="126" w:name="grading-the-picks-on-nov-20-and-nov-23"/>
     <w:p>
       <w:pPr>
         <w:pStyle w:val="Heading2"/>
@@ -12232,7 +12981,17 @@
         <w:pStyle w:val="FirstParagraph"/>
       </w:pPr>
       <w:r>
-        <w:t xml:space="preserve">Record entry prices at the</w:t>
+        <w:rPr>
+          <w:b/>
+          <w:bCs/>
+        </w:rPr>
+        <w:t xml:space="preserve">Fixed window.</w:t>
+      </w:r>
+      <w:r>
+        <w:t xml:space="preserve"> </w:t>
+      </w:r>
+      <w:r>
+        <w:t xml:space="preserve">The official result uses the</w:t>
       </w:r>
       <w:r>
         <w:t xml:space="preserve"> </w:t>
@@ -12245,7 +13004,10 @@
         <w:t xml:space="preserve">Mon Sep 28 open</w:t>
       </w:r>
       <w:r>
-        <w:t xml:space="preserve">. Use the Sep 25 closes above only if the open is unavailable, and replace every snippet price with a live quote first. Mark each pick at the</w:t>
+        <w:t xml:space="preserve"> </w:t>
+      </w:r>
+      <w:r>
+        <w:t xml:space="preserve">to the</w:t>
       </w:r>
       <w:r>
         <w:t xml:space="preserve"> </w:t>
@@ -12258,20 +13020,75 @@
         <w:t xml:space="preserve">Fri Nov 20 close</w:t>
       </w:r>
       <w:r>
-        <w:t xml:space="preserve">. Compare its total return, including any dividends paid in the window, with the</w:t>
-      </w:r>
-      <w:r>
-        <w:t xml:space="preserve"> </w:t>
-      </w:r>
+        <w:t xml:space="preserve"> </w:t>
+      </w:r>
+      <w:r>
+        <w:t xml:space="preserve">for every stock and for the benchmark. Do not substitute Sep 25 closes. That would change the experiment. If an open price is unavailable, use the Sep 28 close for the stock</w:t>
+      </w:r>
+      <w:r>
+        <w:t xml:space="preserve"> </w:t>
+      </w:r>
+      <w:r>
+        <w:rPr>
+          <w:i/>
+          <w:iCs/>
+        </w:rPr>
+        <w:t xml:space="preserve">and</w:t>
+      </w:r>
+      <w:r>
+        <w:t xml:space="preserve"> </w:t>
+      </w:r>
+      <w:r>
+        <w:t xml:space="preserve">the benchmark, and say so.</w:t>
+      </w:r>
+    </w:p>
+    <w:p>
+      <w:pPr>
+        <w:pStyle w:val="BodyText"/>
+      </w:pPr>
       <w:r>
         <w:rPr>
           <w:b/>
           <w:bCs/>
         </w:rPr>
-        <w:t xml:space="preserve">S&amp;P 500 total return (or SPY) over the same dates</w:t>
-      </w:r>
-      <w:r>
-        <w:t xml:space="preserve">.</w:t>
+        <w:t xml:space="preserve">Benchmark.</w:t>
+      </w:r>
+      <w:r>
+        <w:t xml:space="preserve"> </w:t>
+      </w:r>
+      <w:r>
+        <w:t xml:space="preserve">Measure the S&amp;P 500 total return with SPY (or the S&amp;P 500 Total Return index) at exactly the same timestamps.</w:t>
+      </w:r>
+    </w:p>
+    <w:p>
+      <w:pPr>
+        <w:pStyle w:val="BodyText"/>
+      </w:pPr>
+      <w:r>
+        <w:rPr>
+          <w:b/>
+          <w:bCs/>
+        </w:rPr>
+        <w:t xml:space="preserve">Dividends.</w:t>
+      </w:r>
+      <w:r>
+        <w:t xml:space="preserve"> </w:t>
+      </w:r>
+      <w:r>
+        <w:t xml:space="preserve">Count a dividend only if its</w:t>
+      </w:r>
+      <w:r>
+        <w:t xml:space="preserve"> </w:t>
+      </w:r>
+      <w:r>
+        <w:rPr>
+          <w:b/>
+          <w:bCs/>
+        </w:rPr>
+        <w:t xml:space="preserve">ex-dividend date falls between Sep 29 and Nov 20 inclusive</w:t>
+      </w:r>
+      <w:r>
+        <w:t xml:space="preserve">, which means a Sep 28 buyer is entitled to it. Payment inside the window is not enough. For example, a dividend paid in October to holders of record in mid-September belongs to the seller. Apply the same rule to SPY's distributions.</w:t>
       </w:r>
     </w:p>
     <w:p>
@@ -12301,7 +13118,7 @@
         <w:t xml:space="preserve"> </w:t>
       </w:r>
       <w:r>
-        <w:t xml:space="preserve">Each stock's return minus the index return.</w:t>
+        <w:t xml:space="preserve">Each stock's total return minus the benchmark's.</w:t>
       </w:r>
     </w:p>
     <w:p>
@@ -12317,13 +13134,55 @@
           <w:b/>
           <w:bCs/>
         </w:rPr>
-        <w:t xml:space="preserve">Hit rate.</w:t>
-      </w:r>
-      <w:r>
-        <w:t xml:space="preserve"> </w:t>
-      </w:r>
-      <w:r>
-        <w:t xml:space="preserve">How many of the five beat the index. With a 45–48% base rate, 2–3 hits is the chance outcome. Only 4–5 hits suggests a real edge.</w:t>
+        <w:t xml:space="preserve">Hit rate, with the right chance model.</w:t>
+      </w:r>
+      <w:r>
+        <w:t xml:space="preserve"> </w:t>
+      </w:r>
+      <w:r>
+        <w:t xml:space="preserve">Using the 45–48% base rate and assuming independent picks, the chance of at least four of five beating the index is</w:t>
+      </w:r>
+      <w:r>
+        <w:t xml:space="preserve"> </w:t>
+      </w:r>
+      <w:r>
+        <w:rPr>
+          <w:b/>
+          <w:bCs/>
+        </w:rPr>
+        <w:t xml:space="preserve">13–16%</w:t>
+      </w:r>
+      <w:r>
+        <w:t xml:space="preserve">, and of all five</w:t>
+      </w:r>
+      <w:r>
+        <w:t xml:space="preserve"> </w:t>
+      </w:r>
+      <w:r>
+        <w:rPr>
+          <w:b/>
+          <w:bCs/>
+        </w:rPr>
+        <w:t xml:space="preserve">2–2.5%</w:t>
+      </w:r>
+      <w:r>
+        <w:t xml:space="preserve">. The picks share exposures (yields, AI capex), so the true chance of a lucky cluster is higher.</w:t>
+      </w:r>
+      <w:r>
+        <w:t xml:space="preserve"> </w:t>
+      </w:r>
+      <w:r>
+        <w:rPr>
+          <w:b/>
+          <w:bCs/>
+        </w:rPr>
+        <w:t xml:space="preserve">Four or five winners would be encouraging, not proof of skill.</w:t>
+      </w:r>
+      <w:r>
+        <w:t xml:space="preserve"> </w:t>
+      </w:r>
+      <w:r>
+        <w:t xml:space="preserve">One eight-week window cannot establish an edge either way.</w:t>
       </w:r>
     </w:p>
     <w:p>
@@ -12345,7 +13204,7 @@
         <w:t xml:space="preserve"> </w:t>
       </w:r>
       <w:r>
-        <w:t xml:space="preserve">The equal-weight basket against the index. Excess returns inside ±5–7% cannot be told apart from noise.</w:t>
+        <w:t xml:space="preserve">The equal-weight basket against the benchmark. The ±5–7% band is a rough one-standard-deviation estimate, not a measured covariance or a significance threshold. A result outside it is a large outcome, not evidence of skill.</w:t>
       </w:r>
     </w:p>
     <w:p>
@@ -12367,7 +13226,7 @@
         <w:t xml:space="preserve"> </w:t>
       </w:r>
       <w:r>
-        <w:t xml:space="preserve">For each pick, record whether its "what proves it wrong" signal fired. If it did, record whether the stock then underperformed. A pick can beat the index for the wrong reason or lose despite a correct thesis.</w:t>
+        <w:t xml:space="preserve">For each pick, record whether its "what proves it wrong" signal fired and whether the stock then underperformed. A pick can beat the index for the wrong reason or lose despite a correct thesis.</w:t>
       </w:r>
     </w:p>
     <w:p>
@@ -12375,7 +13234,97 @@
         <w:pStyle w:val="FirstParagraph"/>
       </w:pPr>
       <w:r>
-        <w:t xml:space="preserve">Also grade the five runners-up the same way, as a control for whether the portfolio caps added or cost value. Record the realized dates of NVDA's and THC's reports. If NVDA reports on Nov 25, re-grade it on Nov 30 as a sensitivity check.</w:t>
+        <w:rPr>
+          <w:b/>
+          <w:bCs/>
+        </w:rPr>
+        <w:t xml:space="preserve">Supplementary checks, reported separately from the official result:</w:t>
+      </w:r>
+    </w:p>
+    <w:p>
+      <w:pPr>
+        <w:pStyle w:val="Compact"/>
+        <w:numPr>
+          <w:ilvl w:val="0"/>
+          <w:numId w:val="1016"/>
+        </w:numPr>
+      </w:pPr>
+      <w:r>
+        <w:rPr>
+          <w:b/>
+          <w:bCs/>
+        </w:rPr>
+        <w:t xml:space="preserve">The mechanical basket</w:t>
+      </w:r>
+      <w:r>
+        <w:t xml:space="preserve"> </w:t>
+      </w:r>
+      <w:r>
+        <w:t xml:space="preserve">(ANET in place of APH) and the</w:t>
+      </w:r>
+      <w:r>
+        <w:t xml:space="preserve"> </w:t>
+      </w:r>
+      <w:r>
+        <w:rPr>
+          <w:b/>
+          <w:bCs/>
+        </w:rPr>
+        <w:t xml:space="preserve">runners-up</w:t>
+      </w:r>
+      <w:r>
+        <w:t xml:space="preserve"> </w:t>
+      </w:r>
+      <w:r>
+        <w:t xml:space="preserve">(ANET, DELL, MU, VLO, CVE), graded the same way. One window cannot show whether the caps or the override helped, because selection and sector exposure change together. Treat these as descriptive only.</w:t>
+      </w:r>
+    </w:p>
+    <w:p>
+      <w:pPr>
+        <w:pStyle w:val="Compact"/>
+        <w:numPr>
+          <w:ilvl w:val="0"/>
+          <w:numId w:val="1016"/>
+        </w:numPr>
+      </w:pPr>
+      <w:r>
+        <w:rPr>
+          <w:b/>
+          <w:bCs/>
+        </w:rPr>
+        <w:t xml:space="preserve">NVDA's report date.</w:t>
+      </w:r>
+      <w:r>
+        <w:t xml:space="preserve"> </w:t>
+      </w:r>
+      <w:r>
+        <w:t xml:space="preserve">Record the actual NVDA and THC report dates. If NVDA reports after Nov 20, note that its in-window catalyst did not happen. An optional Nov 30 re-mark of NVDA is a sensitivity check and never replaces the fixed-window result.</w:t>
+      </w:r>
+    </w:p>
+    <w:p>
+      <w:pPr>
+        <w:pStyle w:val="FirstParagraph"/>
+      </w:pPr>
+      <w:r>
+        <w:t xml:space="preserve">Running the grading on Mon Nov 23 captures the Nov 20 closing data after options expiration. A grading check is scheduled for that date.</w:t>
+      </w:r>
+    </w:p>
+    <w:bookmarkEnd w:id="126"/>
+    <w:bookmarkStart w:id="127" w:name="conclusion"/>
+    <w:p>
+      <w:pPr>
+        <w:pStyle w:val="Heading2"/>
+      </w:pPr>
+      <w:r>
+        <w:t xml:space="preserve">Conclusion</w:t>
+      </w:r>
+    </w:p>
+    <w:p>
+      <w:pPr>
+        <w:pStyle w:val="FirstParagraph"/>
+      </w:pPr>
+      <w:r>
+        <w:t xml:space="preserve">The main finding is that in this regime the scorecard's two strongest signals point in different directions. Momentum is concentrated in crowded AI hardware, while the cleanest revisions sit in a quiet-catastrophe insurer and a guided-up bank. Neither signal alone makes a risk-aware basket. The theme cap replaces a de facto AI-capex bet with a basket whose business drivers are split across rates (JPM, TRV), hyperscaler capex (NVDA, APH) and health policy (THC). The drivers differ, but the common macro exposure does not: a yield spike hits at least four of the five, and that exposure has not been quantified. The sensitivity test supports treating TRV, JPM and THC as the robust core. The two AI slots are low-confidence choices among four close names.</w:t>
       </w:r>
     </w:p>
     <w:p>
@@ -12383,37 +13332,11 @@
         <w:pStyle w:val="BodyText"/>
       </w:pPr>
       <w:r>
-        <w:t xml:space="preserve">Running the grading on Mon Nov 23 captures Nov 20 closing data after options expiration. The handoff proposed a scheduled grading task for that date, but the user never agreed to it.</w:t>
-      </w:r>
-    </w:p>
-    <w:bookmarkEnd w:id="125"/>
-    <w:bookmarkStart w:id="126" w:name="conclusion"/>
-    <w:p>
-      <w:pPr>
-        <w:pStyle w:val="Heading2"/>
-      </w:pPr>
-      <w:r>
-        <w:t xml:space="preserve">Conclusion</w:t>
-      </w:r>
-    </w:p>
-    <w:p>
-      <w:pPr>
-        <w:pStyle w:val="FirstParagraph"/>
-      </w:pPr>
-      <w:r>
-        <w:t xml:space="preserve">The main finding is that in this regime the scorecard's two strongest signals point in different directions. Momentum is concentrated in crowded AI hardware, while the cleanest revisions sit in a quiet-catastrophe insurer and a guided-up bank. Neither signal alone makes a risk-aware basket. The theme cap is doing real work: it replaces a de facto AI-capex bet with a basket whose failure modes are split across rates (JPM, TRV), hyperscaler capex (NVDA, APH) and health policy (THC). That means one bad macro print should not sink all five.</w:t>
-      </w:r>
-    </w:p>
-    <w:p>
-      <w:pPr>
-        <w:pStyle w:val="BodyText"/>
-      </w:pPr>
-      <w:r>
         <w:t xml:space="preserve">The uncomfortable implication is that the Financials leg makes the basket short the Fund Manager Survey's top tail risk, a yield spike. The Oct 13–16 cluster is therefore the first real test of the thesis, well before the AI names report. Given the snippet-only data, the most valuable next step is not more screening. It is a live-data pass that confirms prices, the NVDA and THC dates, and the implied moves, before anyone relies on these rankings.</w:t>
       </w:r>
     </w:p>
-    <w:bookmarkEnd w:id="126"/>
     <w:bookmarkEnd w:id="127"/>
+    <w:bookmarkEnd w:id="128"/>
     <w:sectPr>
       <w:footnotePr>
         <w:numRestart w:val="eachSect"/>
@@ -12786,6 +13709,9 @@
     <w:lvlOverride w:ilvl="8">
       <w:startOverride w:val="1"/>
     </w:lvlOverride>
+  </w:num>
+  <w:num w:numId="1016">
+    <w:abstractNumId w:val="991"/>
   </w:num>
 </w:numbering>
 </file>

</xml_diff>

<commit_message>
Fix Word export: stop dollar amounts converting to math
Co-Authored-By: Claude Opus 5.5 <noreply@anthropic.com>
Claude-Session: https://claude.ai/code/session_016AgBnoCfdHhgV6SFp5cQBC
</commit_message>
<xml_diff>
--- a/reports/Top 5 stocks Sep to Nov 2026.docx
+++ b/reports/Top 5 stocks Sep to Nov 2026.docx
@@ -2,7 +2,7 @@
 <file path=word/document.xml><?xml version="1.0" encoding="utf-8"?>
 <w:document xmlns:w="http://schemas.openxmlformats.org/wordprocessingml/2006/main" xmlns:m="http://schemas.openxmlformats.org/officeDocument/2006/math" xmlns:r="http://schemas.openxmlformats.org/officeDocument/2006/relationships" xmlns:o="urn:schemas-microsoft-com:office:office" xmlns:v="urn:schemas-microsoft-com:vml" xmlns:w10="urn:schemas-microsoft-com:office:word" xmlns:a="http://schemas.openxmlformats.org/drawingml/2006/main" xmlns:pic="http://schemas.openxmlformats.org/drawingml/2006/picture" xmlns:wp="http://schemas.openxmlformats.org/drawingml/2006/wordprocessingDrawing">
   <w:body>
-    <w:bookmarkStart w:id="128" w:name="X7899ff881bbf6c71daf86982b2a1930edb07d0e"/>
+    <w:bookmarkStart w:id="129" w:name="X7899ff881bbf6c71daf86982b2a1930edb07d0e"/>
     <w:p>
       <w:pPr>
         <w:pStyle w:val="Heading1"/>
@@ -6011,7 +6011,7 @@
       </w:r>
     </w:p>
     <w:bookmarkEnd w:id="55"/>
-    <w:bookmarkStart w:id="108" w:name="X910b931f07d9527c9934127e8b2d1fa2639ddcb"/>
+    <w:bookmarkStart w:id="109" w:name="X910b931f07d9527c9934127e8b2d1fa2639ddcb"/>
     <w:p>
       <w:pPr>
         <w:pStyle w:val="Heading2"/>
@@ -6123,40 +6123,8 @@
             <w:pPr>
               <w:pStyle w:val="Compact"/>
             </w:pPr>
-            <m:oMath>
-              <m:r>
-                <m:t>224.58</m:t>
-              </m:r>
-              <m:r>
-                <m:rPr>
-                  <m:sty m:val="p"/>
-                </m:rPr>
-                <m:t>(</m:t>
-              </m:r>
-              <m:r>
-                <m:t>m</m:t>
-              </m:r>
-              <m:r>
-                <m:t>k</m:t>
-              </m:r>
-              <m:r>
-                <m:t>t</m:t>
-              </m:r>
-              <m:r>
-                <m:t>c</m:t>
-              </m:r>
-              <m:r>
-                <m:t>a</m:t>
-              </m:r>
-              <m:r>
-                <m:t>p</m:t>
-              </m:r>
-              <m:r>
-                <m:t> </m:t>
-              </m:r>
-            </m:oMath>
-            <w:r>
-              <w:t xml:space="preserve">5.43T)</w:t>
+            <w:r>
+              <w:t xml:space="preserve">$224.58 (mkt cap ~$5.43T)</w:t>
             </w:r>
           </w:p>
         </w:tc>
@@ -6228,40 +6196,8 @@
             <w:pPr>
               <w:pStyle w:val="Compact"/>
             </w:pPr>
-            <m:oMath>
-              <m:r>
-                <m:t>362.39</m:t>
-              </m:r>
-              <m:r>
-                <m:rPr>
-                  <m:sty m:val="p"/>
-                </m:rPr>
-                <m:t>(</m:t>
-              </m:r>
-              <m:r>
-                <m:t>m</m:t>
-              </m:r>
-              <m:r>
-                <m:t>k</m:t>
-              </m:r>
-              <m:r>
-                <m:t>t</m:t>
-              </m:r>
-              <m:r>
-                <m:t>c</m:t>
-              </m:r>
-              <m:r>
-                <m:t>a</m:t>
-              </m:r>
-              <m:r>
-                <m:t>p</m:t>
-              </m:r>
-              <m:r>
-                <m:t> </m:t>
-              </m:r>
-            </m:oMath>
-            <w:r>
-              <w:t xml:space="preserve">75.7B)</w:t>
+            <w:r>
+              <w:t xml:space="preserve">$362.39 (mkt cap ~$75.7B)</w:t>
             </w:r>
           </w:p>
         </w:tc>
@@ -6420,40 +6356,8 @@
             <w:pPr>
               <w:pStyle w:val="Compact"/>
             </w:pPr>
-            <m:oMath>
-              <m:r>
-                <m:t>343.06</m:t>
-              </m:r>
-              <m:r>
-                <m:rPr>
-                  <m:sty m:val="p"/>
-                </m:rPr>
-                <m:t>(</m:t>
-              </m:r>
-              <m:r>
-                <m:t>m</m:t>
-              </m:r>
-              <m:r>
-                <m:t>k</m:t>
-              </m:r>
-              <m:r>
-                <m:t>t</m:t>
-              </m:r>
-              <m:r>
-                <m:t>c</m:t>
-              </m:r>
-              <m:r>
-                <m:t>a</m:t>
-              </m:r>
-              <m:r>
-                <m:t>p</m:t>
-              </m:r>
-              <m:r>
-                <m:t> </m:t>
-              </m:r>
-            </m:oMath>
-            <w:r>
-              <w:t xml:space="preserve">911B)</w:t>
+            <w:r>
+              <w:t xml:space="preserve">$343.06 (mkt cap ~$911B)</w:t>
             </w:r>
           </w:p>
         </w:tc>
@@ -6650,150 +6554,44 @@
       <w:r>
         <w:t xml:space="preserve"> </w:t>
       </w:r>
-      <m:oMath>
-        <m:r>
-          <m:t>96.2</m:t>
-        </m:r>
-        <m:r>
-          <m:t>B</m:t>
-        </m:r>
-        <m:r>
-          <m:rPr>
-            <m:sty m:val="p"/>
-          </m:rPr>
-          <m:t>(</m:t>
-        </m:r>
-        <m:r>
-          <m:rPr>
-            <m:sty m:val="p"/>
-          </m:rPr>
-          <m:t>+</m:t>
-        </m:r>
-        <m:r>
-          <m:t>106</m:t>
-        </m:r>
-      </m:oMath>
-      <w:r>
-        <w:rPr>
-          <w:b/>
-          <w:bCs/>
-        </w:rPr>
-        <w:t xml:space="preserve">2.22 vs</w:t>
-      </w:r>
-      <w:r>
-        <w:rPr>
-          <w:b/>
-          <w:bCs/>
-        </w:rPr>
-        <w:t xml:space="preserve"> </w:t>
-      </w:r>
-      <m:oMath>
-        <m:r>
-          <m:t>2.09</m:t>
-        </m:r>
-        <m:r>
-          <m:rPr>
-            <m:sty m:val="p"/>
-          </m:rPr>
-          <m:t>*</m:t>
-        </m:r>
-        <m:r>
-          <m:rPr>
-            <m:sty m:val="p"/>
-          </m:rPr>
-          <m:t>*</m:t>
-        </m:r>
-        <m:r>
-          <m:t>e</m:t>
-        </m:r>
-        <m:r>
-          <m:t>x</m:t>
-        </m:r>
-        <m:r>
-          <m:t>p</m:t>
-        </m:r>
-        <m:r>
-          <m:t>e</m:t>
-        </m:r>
-        <m:r>
-          <m:t>c</m:t>
-        </m:r>
-        <m:r>
-          <m:t>t</m:t>
-        </m:r>
-        <m:r>
-          <m:t>e</m:t>
-        </m:r>
-        <m:r>
-          <m:t>d</m:t>
-        </m:r>
-        <m:r>
-          <m:rPr>
-            <m:sty m:val="p"/>
-          </m:rPr>
-          <m:t>.</m:t>
-        </m:r>
-        <m:r>
-          <m:t>N</m:t>
-        </m:r>
-        <m:r>
-          <m:t>V</m:t>
-        </m:r>
-        <m:r>
-          <m:t>D</m:t>
-        </m:r>
-        <m:r>
-          <m:t>A</m:t>
-        </m:r>
-        <m:r>
-          <m:t>g</m:t>
-        </m:r>
-        <m:r>
-          <m:t>u</m:t>
-        </m:r>
-        <m:r>
-          <m:t>i</m:t>
-        </m:r>
-        <m:r>
-          <m:t>d</m:t>
-        </m:r>
-        <m:r>
-          <m:t>e</m:t>
-        </m:r>
-        <m:r>
-          <m:t>d</m:t>
-        </m:r>
-        <m:r>
-          <m:t>Q</m:t>
-        </m:r>
-        <m:r>
-          <m:t>3</m:t>
-        </m:r>
-        <m:r>
-          <m:t>t</m:t>
-        </m:r>
-        <m:r>
-          <m:t>o</m:t>
-        </m:r>
-        <m:r>
-          <m:rPr>
-            <m:sty m:val="p"/>
-          </m:rPr>
-          <m:t>*</m:t>
-        </m:r>
-        <m:r>
-          <m:rPr>
-            <m:sty m:val="p"/>
-          </m:rPr>
-          <m:t>*</m:t>
-        </m:r>
-      </m:oMath>
-      <w:r>
-        <w:rPr>
-          <w:b/>
-          <w:bCs/>
-        </w:rPr>
-        <w:t xml:space="preserve">108.0B ±2%</w:t>
+      <w:r>
+        <w:rPr>
+          <w:b/>
+          <w:bCs/>
+        </w:rPr>
+        <w:t xml:space="preserve">$96.2B (+106%)</w:t>
+      </w:r>
+      <w:r>
+        <w:t xml:space="preserve"> </w:t>
+      </w:r>
+      <w:r>
+        <w:t xml:space="preserve">and EPS</w:t>
+      </w:r>
+      <w:r>
+        <w:t xml:space="preserve"> </w:t>
+      </w:r>
+      <w:r>
+        <w:rPr>
+          <w:b/>
+          <w:bCs/>
+        </w:rPr>
+        <w:t xml:space="preserve">$2.22 vs $2.09</w:t>
+      </w:r>
+      <w:r>
+        <w:t xml:space="preserve"> </w:t>
+      </w:r>
+      <w:r>
+        <w:t xml:space="preserve">expected. NVDA guided Q3 to</w:t>
+      </w:r>
+      <w:r>
+        <w:t xml:space="preserve"> </w:t>
+      </w:r>
+      <w:r>
+        <w:rPr>
+          <w:b/>
+          <w:bCs/>
+        </w:rPr>
+        <w:t xml:space="preserve">$108.0B ±2%</w:t>
       </w:r>
       <w:r>
         <w:t xml:space="preserve">, about 4% above the Street, and supply commitments rose to $279B from $119B (</w:t>
@@ -7730,50 +7528,25 @@
       <w:r>
         <w:t xml:space="preserve"> </w:t>
       </w:r>
-      <m:oMath>
-        <m:r>
-          <m:t>8.8</m:t>
-        </m:r>
-        <m:r>
-          <m:t>B</m:t>
-        </m:r>
-        <m:r>
-          <m:rPr>
-            <m:sty m:val="p"/>
-          </m:rPr>
-          <m:t>(</m:t>
-        </m:r>
-        <m:r>
-          <m:t>a</m:t>
-        </m:r>
-        <m:r>
-          <m:t>b</m:t>
-        </m:r>
-        <m:r>
-          <m:t>o</m:t>
-        </m:r>
-        <m:r>
-          <m:t>u</m:t>
-        </m:r>
-        <m:r>
-          <m:t>t</m:t>
-        </m:r>
-        <m:r>
-          <m:rPr>
-            <m:sty m:val="p"/>
-          </m:rPr>
-          <m:t>+</m:t>
-        </m:r>
-        <m:r>
-          <m:t>55</m:t>
-        </m:r>
-      </m:oMath>
-      <w:r>
-        <w:rPr>
-          <w:b/>
-          <w:bCs/>
-        </w:rPr>
-        <w:t xml:space="preserve">10.7B for a book-to-bill of about 1.2</w:t>
+      <w:r>
+        <w:rPr>
+          <w:b/>
+          <w:bCs/>
+        </w:rPr>
+        <w:t xml:space="preserve">$8.8B (about +55%)</w:t>
+      </w:r>
+      <w:r>
+        <w:t xml:space="preserve">, with orders of</w:t>
+      </w:r>
+      <w:r>
+        <w:t xml:space="preserve"> </w:t>
+      </w:r>
+      <w:r>
+        <w:rPr>
+          <w:b/>
+          <w:bCs/>
+        </w:rPr>
+        <w:t xml:space="preserve">$10.7B for a book-to-bill of about 1.2</w:t>
       </w:r>
       <w:r>
         <w:t xml:space="preserve"> </w:t>
@@ -7974,7 +7747,7 @@
       </w:r>
     </w:p>
     <w:bookmarkEnd w:id="93"/>
-    <w:bookmarkStart w:id="97" w:name="X307d773aad3219b45b0db73b2d276a6869901f7"/>
+    <w:bookmarkStart w:id="98" w:name="X307d773aad3219b45b0db73b2d276a6869901f7"/>
     <w:p>
       <w:pPr>
         <w:pStyle w:val="Heading3"/>
@@ -8026,1908 +7799,88 @@
           <w:b/>
           <w:bCs/>
         </w:rPr>
-        <w:t xml:space="preserve">$5.49 to</w:t>
-      </w:r>
-      <w:r>
-        <w:rPr>
-          <w:b/>
-          <w:bCs/>
-        </w:rPr>
-        <w:t xml:space="preserve"> </w:t>
-      </w:r>
-      <m:oMath>
-        <m:r>
-          <m:t>5.85</m:t>
-        </m:r>
-        <m:r>
-          <m:rPr>
-            <m:sty m:val="p"/>
-          </m:rPr>
-          <m:t>*</m:t>
-        </m:r>
-        <m:r>
-          <m:rPr>
-            <m:sty m:val="p"/>
-          </m:rPr>
-          <m:t>*</m:t>
-        </m:r>
-        <m:r>
-          <m:t>s</m:t>
-        </m:r>
-        <m:r>
-          <m:t>i</m:t>
-        </m:r>
-        <m:r>
-          <m:t>n</m:t>
-        </m:r>
-        <m:r>
-          <m:t>c</m:t>
-        </m:r>
-        <m:r>
-          <m:t>e</m:t>
-        </m:r>
-        <m:r>
-          <m:t>J</m:t>
-        </m:r>
-        <m:r>
-          <m:t>u</m:t>
-        </m:r>
-        <m:r>
-          <m:t>n</m:t>
-        </m:r>
-        <m:r>
-          <m:t>30</m:t>
-        </m:r>
-        <m:r>
-          <m:rPr>
-            <m:sty m:val="p"/>
-          </m:rPr>
-          <m:t>,</m:t>
-        </m:r>
-        <m:r>
-          <m:t>m</m:t>
-        </m:r>
-        <m:r>
-          <m:t>a</m:t>
-        </m:r>
-        <m:r>
-          <m:t>k</m:t>
-        </m:r>
-        <m:r>
-          <m:t>i</m:t>
-        </m:r>
-        <m:r>
-          <m:t>n</m:t>
-        </m:r>
-        <m:r>
-          <m:t>g</m:t>
-        </m:r>
-        <m:r>
-          <m:t>J</m:t>
-        </m:r>
-        <m:r>
-          <m:t>P</m:t>
-        </m:r>
-        <m:r>
-          <m:t>M</m:t>
-        </m:r>
-        <m:r>
-          <m:t>t</m:t>
-        </m:r>
-        <m:r>
-          <m:t>h</m:t>
-        </m:r>
-        <m:r>
-          <m:t>e</m:t>
-        </m:r>
-        <m:r>
-          <m:t>l</m:t>
-        </m:r>
-        <m:r>
-          <m:t>a</m:t>
-        </m:r>
-        <m:r>
-          <m:t>r</m:t>
-        </m:r>
-        <m:r>
-          <m:t>g</m:t>
-        </m:r>
-        <m:r>
-          <m:t>e</m:t>
-        </m:r>
-        <m:r>
-          <m:t>s</m:t>
-        </m:r>
-        <m:r>
-          <m:t>t</m:t>
-        </m:r>
-        <m:r>
-          <m:t>c</m:t>
-        </m:r>
-        <m:r>
-          <m:t>o</m:t>
-        </m:r>
-        <m:r>
-          <m:t>n</m:t>
-        </m:r>
-        <m:r>
-          <m:t>t</m:t>
-        </m:r>
-        <m:r>
-          <m:t>r</m:t>
-        </m:r>
-        <m:r>
-          <m:t>i</m:t>
-        </m:r>
-        <m:r>
-          <m:t>b</m:t>
-        </m:r>
-        <m:r>
-          <m:t>u</m:t>
-        </m:r>
-        <m:r>
-          <m:t>t</m:t>
-        </m:r>
-        <m:r>
-          <m:t>o</m:t>
-        </m:r>
-        <m:r>
-          <m:t>r</m:t>
-        </m:r>
-        <m:r>
-          <m:t>t</m:t>
-        </m:r>
-        <m:r>
-          <m:t>o</m:t>
-        </m:r>
-        <m:r>
-          <m:t>t</m:t>
-        </m:r>
-        <m:r>
-          <m:t>h</m:t>
-        </m:r>
-        <m:r>
-          <m:t>e</m:t>
-        </m:r>
-        <m:r>
-          <m:t>F</m:t>
-        </m:r>
-        <m:r>
-          <m:t>i</m:t>
-        </m:r>
-        <m:r>
-          <m:t>n</m:t>
-        </m:r>
-        <m:r>
-          <m:t>a</m:t>
-        </m:r>
-        <m:r>
-          <m:t>n</m:t>
-        </m:r>
-        <m:r>
-          <m:t>c</m:t>
-        </m:r>
-        <m:r>
-          <m:t>i</m:t>
-        </m:r>
-        <m:r>
-          <m:t>a</m:t>
-        </m:r>
-        <m:r>
-          <m:t>l</m:t>
-        </m:r>
-        <m:r>
-          <m:t>s</m:t>
-        </m:r>
-        <m:r>
-          <m:t>s</m:t>
-        </m:r>
-        <m:r>
-          <m:t>e</m:t>
-        </m:r>
-        <m:r>
-          <m:t>c</m:t>
-        </m:r>
-        <m:r>
-          <m:t>t</m:t>
-        </m:r>
-        <m:r>
-          <m:t>o</m:t>
-        </m:r>
-        <m:sSup>
-          <m:e>
-            <m:r>
-              <m:t>r</m:t>
-            </m:r>
-          </m:e>
-          <m:sup>
-            <m:r>
-              <m:rPr>
-                <m:sty m:val="p"/>
-              </m:rPr>
-              <m:t>′</m:t>
-            </m:r>
-          </m:sup>
-        </m:sSup>
-        <m:r>
-          <m:t>s</m:t>
-        </m:r>
-        <m:r>
-          <m:t>i</m:t>
-        </m:r>
-        <m:r>
-          <m:t>n</m:t>
-        </m:r>
-        <m:r>
-          <m:t>c</m:t>
-        </m:r>
-        <m:r>
-          <m:t>r</m:t>
-        </m:r>
-        <m:r>
-          <m:t>e</m:t>
-        </m:r>
-        <m:r>
-          <m:t>a</m:t>
-        </m:r>
-        <m:r>
-          <m:t>s</m:t>
-        </m:r>
-        <m:r>
-          <m:t>e</m:t>
-        </m:r>
-        <m:r>
-          <m:rPr>
-            <m:sty m:val="p"/>
-          </m:rPr>
-          <m:t>(</m:t>
-        </m:r>
-        <m:r>
-          <m:rPr>
-            <m:sty m:val="p"/>
-          </m:rPr>
-          <m:t>[</m:t>
-        </m:r>
-        <m:r>
-          <m:t>F</m:t>
-        </m:r>
-        <m:r>
-          <m:t>a</m:t>
-        </m:r>
-        <m:r>
-          <m:t>c</m:t>
-        </m:r>
-        <m:r>
-          <m:t>t</m:t>
-        </m:r>
-        <m:r>
-          <m:t>S</m:t>
-        </m:r>
-        <m:r>
-          <m:t>e</m:t>
-        </m:r>
-        <m:r>
-          <m:t>t</m:t>
-        </m:r>
-        <m:r>
-          <m:rPr>
-            <m:sty m:val="p"/>
-          </m:rPr>
-          <m:t>]</m:t>
-        </m:r>
-        <m:r>
-          <m:rPr>
-            <m:sty m:val="p"/>
-          </m:rPr>
-          <m:t>(</m:t>
-        </m:r>
-        <m:r>
-          <m:t>h</m:t>
-        </m:r>
-        <m:r>
-          <m:t>t</m:t>
-        </m:r>
-        <m:r>
-          <m:t>t</m:t>
-        </m:r>
-        <m:r>
-          <m:t>p</m:t>
-        </m:r>
-        <m:r>
-          <m:t>s</m:t>
-        </m:r>
-        <m:r>
-          <m:rPr>
-            <m:sty m:val="p"/>
-          </m:rPr>
-          <m:t>:</m:t>
-        </m:r>
-        <m:r>
-          <m:rPr>
-            <m:sty m:val="p"/>
-          </m:rPr>
-          <m:t>/</m:t>
-        </m:r>
-        <m:r>
-          <m:rPr>
-            <m:sty m:val="p"/>
-          </m:rPr>
-          <m:t>/</m:t>
-        </m:r>
-        <m:r>
-          <m:t>i</m:t>
-        </m:r>
-        <m:r>
-          <m:t>n</m:t>
-        </m:r>
-        <m:r>
-          <m:t>s</m:t>
-        </m:r>
-        <m:r>
-          <m:t>i</m:t>
-        </m:r>
-        <m:r>
-          <m:t>g</m:t>
-        </m:r>
-        <m:r>
-          <m:t>h</m:t>
-        </m:r>
-        <m:r>
-          <m:t>t</m:t>
-        </m:r>
-        <m:r>
-          <m:rPr>
-            <m:sty m:val="p"/>
-          </m:rPr>
-          <m:t>.</m:t>
-        </m:r>
-        <m:r>
-          <m:t>f</m:t>
-        </m:r>
-        <m:r>
-          <m:t>a</m:t>
-        </m:r>
-        <m:r>
-          <m:t>c</m:t>
-        </m:r>
-        <m:r>
-          <m:t>t</m:t>
-        </m:r>
-        <m:r>
-          <m:t>s</m:t>
-        </m:r>
-        <m:r>
-          <m:t>e</m:t>
-        </m:r>
-        <m:r>
-          <m:t>t</m:t>
-        </m:r>
-        <m:r>
-          <m:rPr>
-            <m:sty m:val="p"/>
-          </m:rPr>
-          <m:t>.</m:t>
-        </m:r>
-        <m:r>
-          <m:t>c</m:t>
-        </m:r>
-        <m:r>
-          <m:t>o</m:t>
-        </m:r>
-        <m:r>
-          <m:t>m</m:t>
-        </m:r>
-        <m:r>
-          <m:rPr>
-            <m:sty m:val="p"/>
-          </m:rPr>
-          <m:t>/</m:t>
-        </m:r>
-        <m:r>
-          <m:t>a</m:t>
-        </m:r>
-        <m:r>
-          <m:t>n</m:t>
-        </m:r>
-        <m:r>
-          <m:t>a</m:t>
-        </m:r>
-        <m:r>
-          <m:t>l</m:t>
-        </m:r>
-        <m:r>
-          <m:t>y</m:t>
-        </m:r>
-        <m:r>
-          <m:t>s</m:t>
-        </m:r>
-        <m:r>
-          <m:t>t</m:t>
-        </m:r>
-        <m:r>
-          <m:t>s</m:t>
-        </m:r>
-        <m:r>
-          <m:rPr>
-            <m:sty m:val="p"/>
-          </m:rPr>
-          <m:t>−</m:t>
-        </m:r>
-        <m:r>
-          <m:t>i</m:t>
-        </m:r>
-        <m:r>
-          <m:t>n</m:t>
-        </m:r>
-        <m:r>
-          <m:t>c</m:t>
-        </m:r>
-        <m:r>
-          <m:t>r</m:t>
-        </m:r>
-        <m:r>
-          <m:t>e</m:t>
-        </m:r>
-        <m:r>
-          <m:t>a</m:t>
-        </m:r>
-        <m:r>
-          <m:t>s</m:t>
-        </m:r>
-        <m:r>
-          <m:t>e</m:t>
-        </m:r>
-        <m:r>
-          <m:t>d</m:t>
-        </m:r>
-        <m:r>
-          <m:rPr>
-            <m:sty m:val="p"/>
-          </m:rPr>
-          <m:t>−</m:t>
-        </m:r>
-        <m:r>
-          <m:t>e</m:t>
-        </m:r>
-        <m:r>
-          <m:t>p</m:t>
-        </m:r>
-        <m:r>
-          <m:t>s</m:t>
-        </m:r>
-        <m:r>
-          <m:rPr>
-            <m:sty m:val="p"/>
-          </m:rPr>
-          <m:t>−</m:t>
-        </m:r>
-        <m:r>
-          <m:t>e</m:t>
-        </m:r>
-        <m:r>
-          <m:t>s</m:t>
-        </m:r>
-        <m:r>
-          <m:t>t</m:t>
-        </m:r>
-        <m:r>
-          <m:t>i</m:t>
-        </m:r>
-        <m:r>
-          <m:t>m</m:t>
-        </m:r>
-        <m:r>
-          <m:t>a</m:t>
-        </m:r>
-        <m:r>
-          <m:t>t</m:t>
-        </m:r>
-        <m:r>
-          <m:t>e</m:t>
-        </m:r>
-        <m:r>
-          <m:t>s</m:t>
-        </m:r>
-        <m:r>
-          <m:rPr>
-            <m:sty m:val="p"/>
-          </m:rPr>
-          <m:t>−</m:t>
-        </m:r>
-        <m:r>
-          <m:t>f</m:t>
-        </m:r>
-        <m:r>
-          <m:t>o</m:t>
-        </m:r>
-        <m:r>
-          <m:t>r</m:t>
-        </m:r>
-        <m:r>
-          <m:rPr>
-            <m:sty m:val="p"/>
-          </m:rPr>
-          <m:t>−</m:t>
-        </m:r>
-        <m:r>
-          <m:t>s</m:t>
-        </m:r>
-        <m:r>
-          <m:t>p</m:t>
-        </m:r>
-        <m:r>
-          <m:rPr>
-            <m:sty m:val="p"/>
-          </m:rPr>
-          <m:t>−</m:t>
-        </m:r>
-        <m:r>
-          <m:t>500</m:t>
-        </m:r>
-        <m:r>
-          <m:rPr>
-            <m:sty m:val="p"/>
-          </m:rPr>
-          <m:t>−</m:t>
-        </m:r>
-        <m:r>
-          <m:t>c</m:t>
-        </m:r>
-        <m:r>
-          <m:t>o</m:t>
-        </m:r>
-        <m:r>
-          <m:t>m</m:t>
-        </m:r>
-        <m:r>
-          <m:t>p</m:t>
-        </m:r>
-        <m:r>
-          <m:t>a</m:t>
-        </m:r>
-        <m:r>
-          <m:t>n</m:t>
-        </m:r>
-        <m:r>
-          <m:t>i</m:t>
-        </m:r>
-        <m:r>
-          <m:t>e</m:t>
-        </m:r>
-        <m:r>
-          <m:t>s</m:t>
-        </m:r>
-        <m:r>
-          <m:rPr>
-            <m:sty m:val="p"/>
-          </m:rPr>
-          <m:t>−</m:t>
-        </m:r>
-        <m:r>
-          <m:t>f</m:t>
-        </m:r>
-        <m:r>
-          <m:t>o</m:t>
-        </m:r>
-        <m:r>
-          <m:t>r</m:t>
-        </m:r>
-        <m:r>
-          <m:rPr>
-            <m:sty m:val="p"/>
-          </m:rPr>
-          <m:t>−</m:t>
-        </m:r>
-        <m:r>
-          <m:t>2</m:t>
-        </m:r>
-        <m:r>
-          <m:t>n</m:t>
-        </m:r>
-        <m:r>
-          <m:t>d</m:t>
-        </m:r>
-        <m:r>
-          <m:rPr>
-            <m:sty m:val="p"/>
-          </m:rPr>
-          <m:t>−</m:t>
-        </m:r>
-        <m:r>
-          <m:t>s</m:t>
-        </m:r>
-        <m:r>
-          <m:t>t</m:t>
-        </m:r>
-        <m:r>
-          <m:t>r</m:t>
-        </m:r>
-        <m:r>
-          <m:t>a</m:t>
-        </m:r>
-        <m:r>
-          <m:t>i</m:t>
-        </m:r>
-        <m:r>
-          <m:t>g</m:t>
-        </m:r>
-        <m:r>
-          <m:t>h</m:t>
-        </m:r>
-        <m:r>
-          <m:t>t</m:t>
-        </m:r>
-        <m:r>
-          <m:rPr>
-            <m:sty m:val="p"/>
-          </m:rPr>
-          <m:t>−</m:t>
-        </m:r>
-        <m:r>
-          <m:t>q</m:t>
-        </m:r>
-        <m:r>
-          <m:t>u</m:t>
-        </m:r>
-        <m:r>
-          <m:t>a</m:t>
-        </m:r>
-        <m:r>
-          <m:t>r</m:t>
-        </m:r>
-        <m:r>
-          <m:t>t</m:t>
-        </m:r>
-        <m:r>
-          <m:t>e</m:t>
-        </m:r>
-        <m:r>
-          <m:t>r</m:t>
-        </m:r>
-        <m:r>
-          <m:rPr>
-            <m:sty m:val="p"/>
-          </m:rPr>
-          <m:t>)</m:t>
-        </m:r>
-        <m:r>
-          <m:rPr>
-            <m:sty m:val="p"/>
-          </m:rPr>
-          <m:t>)</m:t>
-        </m:r>
-        <m:r>
-          <m:rPr>
-            <m:sty m:val="p"/>
-          </m:rPr>
-          <m:t>.</m:t>
-        </m:r>
-        <m:r>
-          <m:t>Q</m:t>
-        </m:r>
-        <m:r>
-          <m:t>2</m:t>
-        </m:r>
-        <m:r>
-          <m:t>E</m:t>
-        </m:r>
-        <m:r>
-          <m:t>P</m:t>
-        </m:r>
-        <m:r>
-          <m:t>S</m:t>
-        </m:r>
-        <m:r>
-          <m:t>w</m:t>
-        </m:r>
-        <m:r>
-          <m:t>a</m:t>
-        </m:r>
-        <m:r>
-          <m:t>s</m:t>
-        </m:r>
-        <m:r>
-          <m:rPr>
-            <m:sty m:val="p"/>
-          </m:rPr>
-          <m:t>*</m:t>
-        </m:r>
-        <m:r>
-          <m:rPr>
-            <m:sty m:val="p"/>
-          </m:rPr>
-          <m:t>*</m:t>
-        </m:r>
-      </m:oMath>
-      <w:r>
-        <w:rPr>
-          <w:b/>
-          <w:bCs/>
-        </w:rPr>
-        <w:t xml:space="preserve">7.70 against a</w:t>
-      </w:r>
-      <w:r>
-        <w:rPr>
-          <w:b/>
-          <w:bCs/>
-        </w:rPr>
-        <w:t xml:space="preserve"> </w:t>
-      </w:r>
-      <m:oMath>
-        <m:r>
-          <m:t>5.55</m:t>
-        </m:r>
-        <m:r>
-          <m:t>e</m:t>
-        </m:r>
-        <m:r>
-          <m:t>s</m:t>
-        </m:r>
-        <m:r>
-          <m:t>t</m:t>
-        </m:r>
-        <m:r>
-          <m:t>i</m:t>
-        </m:r>
-        <m:r>
-          <m:t>m</m:t>
-        </m:r>
-        <m:r>
-          <m:t>a</m:t>
-        </m:r>
-        <m:r>
-          <m:t>t</m:t>
-        </m:r>
-        <m:r>
-          <m:t>e</m:t>
-        </m:r>
-        <m:r>
-          <m:rPr>
-            <m:sty m:val="p"/>
-          </m:rPr>
-          <m:t>*</m:t>
-        </m:r>
-        <m:r>
-          <m:rPr>
-            <m:sty m:val="p"/>
-          </m:rPr>
-          <m:t>*</m:t>
-        </m:r>
-        <m:r>
-          <m:rPr>
-            <m:sty m:val="p"/>
-          </m:rPr>
-          <m:t>(</m:t>
-        </m:r>
-        <m:r>
-          <m:rPr>
-            <m:sty m:val="p"/>
-          </m:rPr>
-          <m:t>[</m:t>
-        </m:r>
-        <m:r>
-          <m:t>I</m:t>
-        </m:r>
-        <m:r>
-          <m:t>n</m:t>
-        </m:r>
-        <m:r>
-          <m:t>v</m:t>
-        </m:r>
-        <m:r>
-          <m:t>e</m:t>
-        </m:r>
-        <m:r>
-          <m:t>s</m:t>
-        </m:r>
-        <m:r>
-          <m:t>t</m:t>
-        </m:r>
-        <m:r>
-          <m:t>i</m:t>
-        </m:r>
-        <m:r>
-          <m:t>n</m:t>
-        </m:r>
-        <m:r>
-          <m:t>g</m:t>
-        </m:r>
-        <m:r>
-          <m:rPr>
-            <m:sty m:val="p"/>
-          </m:rPr>
-          <m:t>.</m:t>
-        </m:r>
-        <m:r>
-          <m:t>c</m:t>
-        </m:r>
-        <m:r>
-          <m:t>o</m:t>
-        </m:r>
-        <m:r>
-          <m:t>m</m:t>
-        </m:r>
-        <m:r>
-          <m:rPr>
-            <m:sty m:val="p"/>
-          </m:rPr>
-          <m:t>]</m:t>
-        </m:r>
-        <m:r>
-          <m:rPr>
-            <m:sty m:val="p"/>
-          </m:rPr>
-          <m:t>(</m:t>
-        </m:r>
-        <m:r>
-          <m:t>h</m:t>
-        </m:r>
-        <m:r>
-          <m:t>t</m:t>
-        </m:r>
-        <m:r>
-          <m:t>t</m:t>
-        </m:r>
-        <m:r>
-          <m:t>p</m:t>
-        </m:r>
-        <m:r>
-          <m:t>s</m:t>
-        </m:r>
-        <m:r>
-          <m:rPr>
-            <m:sty m:val="p"/>
-          </m:rPr>
-          <m:t>:</m:t>
-        </m:r>
-        <m:r>
-          <m:rPr>
-            <m:sty m:val="p"/>
-          </m:rPr>
-          <m:t>/</m:t>
-        </m:r>
-        <m:r>
-          <m:rPr>
-            <m:sty m:val="p"/>
-          </m:rPr>
-          <m:t>/</m:t>
-        </m:r>
-        <m:r>
-          <m:t>w</m:t>
-        </m:r>
-        <m:r>
-          <m:t>w</m:t>
-        </m:r>
-        <m:r>
-          <m:t>w</m:t>
-        </m:r>
-        <m:r>
-          <m:rPr>
-            <m:sty m:val="p"/>
-          </m:rPr>
-          <m:t>.</m:t>
-        </m:r>
-        <m:r>
-          <m:t>i</m:t>
-        </m:r>
-        <m:r>
-          <m:t>n</m:t>
-        </m:r>
-        <m:r>
-          <m:t>v</m:t>
-        </m:r>
-        <m:r>
-          <m:t>e</m:t>
-        </m:r>
-        <m:r>
-          <m:t>s</m:t>
-        </m:r>
-        <m:r>
-          <m:t>t</m:t>
-        </m:r>
-        <m:r>
-          <m:t>i</m:t>
-        </m:r>
-        <m:r>
-          <m:t>n</m:t>
-        </m:r>
-        <m:r>
-          <m:t>g</m:t>
-        </m:r>
-        <m:r>
-          <m:rPr>
-            <m:sty m:val="p"/>
-          </m:rPr>
-          <m:t>.</m:t>
-        </m:r>
-        <m:r>
-          <m:t>c</m:t>
-        </m:r>
-        <m:r>
-          <m:t>o</m:t>
-        </m:r>
-        <m:r>
-          <m:t>m</m:t>
-        </m:r>
-        <m:r>
-          <m:rPr>
-            <m:sty m:val="p"/>
-          </m:rPr>
-          <m:t>/</m:t>
-        </m:r>
-        <m:r>
-          <m:t>e</m:t>
-        </m:r>
-        <m:r>
-          <m:t>q</m:t>
-        </m:r>
-        <m:r>
-          <m:t>u</m:t>
-        </m:r>
-        <m:r>
-          <m:t>i</m:t>
-        </m:r>
-        <m:r>
-          <m:t>t</m:t>
-        </m:r>
-        <m:r>
-          <m:t>i</m:t>
-        </m:r>
-        <m:r>
-          <m:t>e</m:t>
-        </m:r>
-        <m:r>
-          <m:t>s</m:t>
-        </m:r>
-        <m:r>
-          <m:rPr>
-            <m:sty m:val="p"/>
-          </m:rPr>
-          <m:t>/</m:t>
-        </m:r>
-        <m:r>
-          <m:t>j</m:t>
-        </m:r>
-        <m:r>
-          <m:t>p</m:t>
-        </m:r>
-        <m:r>
-          <m:rPr>
-            <m:sty m:val="p"/>
-          </m:rPr>
-          <m:t>−</m:t>
-        </m:r>
-        <m:r>
-          <m:t>m</m:t>
-        </m:r>
-        <m:r>
-          <m:t>o</m:t>
-        </m:r>
-        <m:r>
-          <m:t>r</m:t>
-        </m:r>
-        <m:r>
-          <m:t>g</m:t>
-        </m:r>
-        <m:r>
-          <m:t>a</m:t>
-        </m:r>
-        <m:r>
-          <m:t>n</m:t>
-        </m:r>
-        <m:r>
-          <m:rPr>
-            <m:sty m:val="p"/>
-          </m:rPr>
-          <m:t>−</m:t>
-        </m:r>
-        <m:r>
-          <m:t>c</m:t>
-        </m:r>
-        <m:r>
-          <m:t>h</m:t>
-        </m:r>
-        <m:r>
-          <m:t>a</m:t>
-        </m:r>
-        <m:r>
-          <m:t>s</m:t>
-        </m:r>
-        <m:r>
-          <m:t>e</m:t>
-        </m:r>
-        <m:r>
-          <m:rPr>
-            <m:sty m:val="p"/>
-          </m:rPr>
-          <m:t>)</m:t>
-        </m:r>
-        <m:r>
-          <m:rPr>
-            <m:sty m:val="p"/>
-          </m:rPr>
-          <m:t>)</m:t>
-        </m:r>
-        <m:r>
-          <m:rPr>
-            <m:sty m:val="p"/>
-          </m:rPr>
-          <m:t>.</m:t>
-        </m:r>
-        <m:r>
-          <m:t>O</m:t>
-        </m:r>
-        <m:r>
-          <m:t>n</m:t>
-        </m:r>
-        <m:r>
-          <m:t>S</m:t>
-        </m:r>
-        <m:r>
-          <m:t>e</m:t>
-        </m:r>
-        <m:r>
-          <m:t>p</m:t>
-        </m:r>
-        <m:r>
-          <m:t>14</m:t>
-        </m:r>
-        <m:r>
-          <m:rPr>
-            <m:sty m:val="p"/>
-          </m:rPr>
-          <m:t>,</m:t>
-        </m:r>
-        <m:r>
-          <m:t>c</m:t>
-        </m:r>
-        <m:r>
-          <m:t>o</m:t>
-        </m:r>
-        <m:r>
-          <m:rPr>
-            <m:sty m:val="p"/>
-          </m:rPr>
-          <m:t>−</m:t>
-        </m:r>
-        <m:r>
-          <m:t>p</m:t>
-        </m:r>
-        <m:r>
-          <m:t>r</m:t>
-        </m:r>
-        <m:r>
-          <m:t>e</m:t>
-        </m:r>
-        <m:r>
-          <m:t>s</m:t>
-        </m:r>
-        <m:r>
-          <m:t>i</m:t>
-        </m:r>
-        <m:r>
-          <m:t>d</m:t>
-        </m:r>
-        <m:r>
-          <m:t>e</m:t>
-        </m:r>
-        <m:r>
-          <m:t>n</m:t>
-        </m:r>
-        <m:r>
-          <m:t>t</m:t>
-        </m:r>
-        <m:r>
-          <m:t>D</m:t>
-        </m:r>
-        <m:r>
-          <m:t>o</m:t>
-        </m:r>
-        <m:r>
-          <m:t>u</m:t>
-        </m:r>
-        <m:r>
-          <m:t>g</m:t>
-        </m:r>
-        <m:r>
-          <m:t>P</m:t>
-        </m:r>
-        <m:r>
-          <m:t>e</m:t>
-        </m:r>
-        <m:r>
-          <m:t>t</m:t>
-        </m:r>
-        <m:r>
-          <m:t>n</m:t>
-        </m:r>
-        <m:r>
-          <m:t>o</m:t>
-        </m:r>
-        <m:r>
-          <m:t>g</m:t>
-        </m:r>
-        <m:r>
-          <m:t>u</m:t>
-        </m:r>
-        <m:r>
-          <m:t>i</m:t>
-        </m:r>
-        <m:r>
-          <m:t>d</m:t>
-        </m:r>
-        <m:r>
-          <m:t>e</m:t>
-        </m:r>
-        <m:r>
-          <m:t>d</m:t>
-        </m:r>
-        <m:r>
-          <m:t>Q</m:t>
-        </m:r>
-        <m:r>
-          <m:t>3</m:t>
-        </m:r>
-        <m:r>
-          <m:t>i</m:t>
-        </m:r>
-        <m:r>
-          <m:t>n</m:t>
-        </m:r>
-        <m:r>
-          <m:t>v</m:t>
-        </m:r>
-        <m:r>
-          <m:t>e</m:t>
-        </m:r>
-        <m:r>
-          <m:t>s</m:t>
-        </m:r>
-        <m:r>
-          <m:t>t</m:t>
-        </m:r>
-        <m:r>
-          <m:t>m</m:t>
-        </m:r>
-        <m:r>
-          <m:t>e</m:t>
-        </m:r>
-        <m:r>
-          <m:t>n</m:t>
-        </m:r>
-        <m:r>
-          <m:t>t</m:t>
-        </m:r>
-        <m:r>
-          <m:rPr>
-            <m:sty m:val="p"/>
-          </m:rPr>
-          <m:t>−</m:t>
-        </m:r>
-        <m:r>
-          <m:t>b</m:t>
-        </m:r>
-        <m:r>
-          <m:t>a</m:t>
-        </m:r>
-        <m:r>
-          <m:t>n</m:t>
-        </m:r>
-        <m:r>
-          <m:t>k</m:t>
-        </m:r>
-        <m:r>
-          <m:t>i</m:t>
-        </m:r>
-        <m:r>
-          <m:t>n</m:t>
-        </m:r>
-        <m:r>
-          <m:t>g</m:t>
-        </m:r>
-        <m:r>
-          <m:t>f</m:t>
-        </m:r>
-        <m:r>
-          <m:t>e</m:t>
-        </m:r>
-        <m:r>
-          <m:t>e</m:t>
-        </m:r>
-        <m:r>
-          <m:t>s</m:t>
-        </m:r>
-        <m:r>
-          <m:t>a</m:t>
-        </m:r>
-        <m:r>
-          <m:t>n</m:t>
-        </m:r>
-        <m:r>
-          <m:t>d</m:t>
-        </m:r>
-        <m:r>
-          <m:t>m</m:t>
-        </m:r>
-        <m:r>
-          <m:t>a</m:t>
-        </m:r>
-        <m:r>
-          <m:t>r</m:t>
-        </m:r>
-        <m:r>
-          <m:t>k</m:t>
-        </m:r>
-        <m:r>
-          <m:t>e</m:t>
-        </m:r>
-        <m:r>
-          <m:t>t</m:t>
-        </m:r>
-        <m:r>
-          <m:t>s</m:t>
-        </m:r>
-        <m:r>
-          <m:t>r</m:t>
-        </m:r>
-        <m:r>
-          <m:t>e</m:t>
-        </m:r>
-        <m:r>
-          <m:t>v</m:t>
-        </m:r>
-        <m:r>
-          <m:t>e</m:t>
-        </m:r>
-        <m:r>
-          <m:t>n</m:t>
-        </m:r>
-        <m:r>
-          <m:t>u</m:t>
-        </m:r>
-        <m:r>
-          <m:t>e</m:t>
-        </m:r>
-        <m:r>
-          <m:rPr>
-            <m:sty m:val="p"/>
-          </m:rPr>
-          <m:t>*</m:t>
-        </m:r>
-        <m:r>
-          <m:rPr>
-            <m:sty m:val="p"/>
-          </m:rPr>
-          <m:t>*</m:t>
-        </m:r>
-        <m:r>
-          <m:t>u</m:t>
-        </m:r>
-        <m:r>
-          <m:t>p</m:t>
-        </m:r>
-        <m:r>
-          <m:t>m</m:t>
-        </m:r>
-        <m:r>
-          <m:t>i</m:t>
-        </m:r>
-        <m:r>
-          <m:t>d</m:t>
-        </m:r>
-        <m:r>
-          <m:rPr>
-            <m:sty m:val="p"/>
-          </m:rPr>
-          <m:t>−</m:t>
-        </m:r>
-        <m:r>
-          <m:t>t</m:t>
-        </m:r>
-        <m:r>
-          <m:t>o</m:t>
-        </m:r>
-        <m:r>
-          <m:rPr>
-            <m:sty m:val="p"/>
-          </m:rPr>
-          <m:t>−</m:t>
-        </m:r>
-        <m:r>
-          <m:t>h</m:t>
-        </m:r>
-        <m:r>
-          <m:t>i</m:t>
-        </m:r>
-        <m:r>
-          <m:t>g</m:t>
-        </m:r>
-        <m:r>
-          <m:t>h</m:t>
-        </m:r>
-        <m:r>
-          <m:t>t</m:t>
-        </m:r>
-        <m:r>
-          <m:t>e</m:t>
-        </m:r>
-        <m:r>
-          <m:t>e</m:t>
-        </m:r>
-        <m:r>
-          <m:t>n</m:t>
-        </m:r>
-        <m:r>
-          <m:t>s</m:t>
-        </m:r>
-        <m:r>
-          <m:rPr>
-            <m:sty m:val="p"/>
-          </m:rPr>
-          <m:t>*</m:t>
-        </m:r>
-        <m:r>
-          <m:rPr>
-            <m:sty m:val="p"/>
-          </m:rPr>
-          <m:t>*</m:t>
-        </m:r>
-        <m:r>
-          <m:rPr>
-            <m:sty m:val="p"/>
-          </m:rPr>
-          <m:t>(</m:t>
-        </m:r>
-        <m:r>
-          <m:rPr>
-            <m:sty m:val="p"/>
-          </m:rPr>
-          <m:t>[</m:t>
-        </m:r>
-        <m:r>
-          <m:t>B</m:t>
-        </m:r>
-        <m:r>
-          <m:t>l</m:t>
-        </m:r>
-        <m:r>
-          <m:t>o</m:t>
-        </m:r>
-        <m:r>
-          <m:t>o</m:t>
-        </m:r>
-        <m:r>
-          <m:t>m</m:t>
-        </m:r>
-        <m:r>
-          <m:t>b</m:t>
-        </m:r>
-        <m:r>
-          <m:t>e</m:t>
-        </m:r>
-        <m:r>
-          <m:t>r</m:t>
-        </m:r>
-        <m:r>
-          <m:t>g</m:t>
-        </m:r>
-        <m:r>
-          <m:rPr>
-            <m:sty m:val="p"/>
-          </m:rPr>
-          <m:t>]</m:t>
-        </m:r>
-        <m:r>
-          <m:rPr>
-            <m:sty m:val="p"/>
-          </m:rPr>
-          <m:t>(</m:t>
-        </m:r>
-        <m:r>
-          <m:t>h</m:t>
-        </m:r>
-        <m:r>
-          <m:t>t</m:t>
-        </m:r>
-        <m:r>
-          <m:t>t</m:t>
-        </m:r>
-        <m:r>
-          <m:t>p</m:t>
-        </m:r>
-        <m:r>
-          <m:t>s</m:t>
-        </m:r>
-        <m:r>
-          <m:rPr>
-            <m:sty m:val="p"/>
-          </m:rPr>
-          <m:t>:</m:t>
-        </m:r>
-        <m:r>
-          <m:rPr>
-            <m:sty m:val="p"/>
-          </m:rPr>
-          <m:t>/</m:t>
-        </m:r>
-        <m:r>
-          <m:rPr>
-            <m:sty m:val="p"/>
-          </m:rPr>
-          <m:t>/</m:t>
-        </m:r>
-        <m:r>
-          <m:t>w</m:t>
-        </m:r>
-        <m:r>
-          <m:t>w</m:t>
-        </m:r>
-        <m:r>
-          <m:t>w</m:t>
-        </m:r>
-        <m:r>
-          <m:rPr>
-            <m:sty m:val="p"/>
-          </m:rPr>
-          <m:t>.</m:t>
-        </m:r>
-        <m:r>
-          <m:t>b</m:t>
-        </m:r>
-        <m:r>
-          <m:t>l</m:t>
-        </m:r>
-        <m:r>
-          <m:t>o</m:t>
-        </m:r>
-        <m:r>
-          <m:t>o</m:t>
-        </m:r>
-        <m:r>
-          <m:t>m</m:t>
-        </m:r>
-        <m:r>
-          <m:t>b</m:t>
-        </m:r>
-        <m:r>
-          <m:t>e</m:t>
-        </m:r>
-        <m:r>
-          <m:t>r</m:t>
-        </m:r>
-        <m:r>
-          <m:t>g</m:t>
-        </m:r>
-        <m:r>
-          <m:rPr>
-            <m:sty m:val="p"/>
-          </m:rPr>
-          <m:t>.</m:t>
-        </m:r>
-        <m:r>
-          <m:t>c</m:t>
-        </m:r>
-        <m:r>
-          <m:t>o</m:t>
-        </m:r>
-        <m:r>
-          <m:t>m</m:t>
-        </m:r>
-        <m:r>
-          <m:rPr>
-            <m:sty m:val="p"/>
-          </m:rPr>
-          <m:t>/</m:t>
-        </m:r>
-        <m:r>
-          <m:t>n</m:t>
-        </m:r>
-        <m:r>
-          <m:t>e</m:t>
-        </m:r>
-        <m:r>
-          <m:t>w</m:t>
-        </m:r>
-        <m:r>
-          <m:t>s</m:t>
-        </m:r>
-        <m:r>
-          <m:rPr>
-            <m:sty m:val="p"/>
-          </m:rPr>
-          <m:t>/</m:t>
-        </m:r>
-        <m:r>
-          <m:t>a</m:t>
-        </m:r>
-        <m:r>
-          <m:t>r</m:t>
-        </m:r>
-        <m:r>
-          <m:t>t</m:t>
-        </m:r>
-        <m:r>
-          <m:t>i</m:t>
-        </m:r>
-        <m:r>
-          <m:t>c</m:t>
-        </m:r>
-        <m:r>
-          <m:t>l</m:t>
-        </m:r>
-        <m:r>
-          <m:t>e</m:t>
-        </m:r>
-        <m:r>
-          <m:t>s</m:t>
-        </m:r>
-        <m:r>
-          <m:rPr>
-            <m:sty m:val="p"/>
-          </m:rPr>
-          <m:t>/</m:t>
-        </m:r>
-        <m:r>
-          <m:t>2026</m:t>
-        </m:r>
-        <m:r>
-          <m:rPr>
-            <m:sty m:val="p"/>
-          </m:rPr>
-          <m:t>−</m:t>
-        </m:r>
-        <m:r>
-          <m:t>09</m:t>
-        </m:r>
-        <m:r>
-          <m:rPr>
-            <m:sty m:val="p"/>
-          </m:rPr>
-          <m:t>−</m:t>
-        </m:r>
-        <m:r>
-          <m:t>14</m:t>
-        </m:r>
-        <m:r>
-          <m:rPr>
-            <m:sty m:val="p"/>
-          </m:rPr>
-          <m:t>/</m:t>
-        </m:r>
-        <m:r>
-          <m:t>b</m:t>
-        </m:r>
-        <m:r>
-          <m:t>o</m:t>
-        </m:r>
-        <m:r>
-          <m:t>f</m:t>
-        </m:r>
-        <m:r>
-          <m:t>a</m:t>
-        </m:r>
-        <m:r>
-          <m:rPr>
-            <m:sty m:val="p"/>
-          </m:rPr>
-          <m:t>−</m:t>
-        </m:r>
-        <m:r>
-          <m:t>c</m:t>
-        </m:r>
-        <m:r>
-          <m:t>e</m:t>
-        </m:r>
-        <m:r>
-          <m:t>o</m:t>
-        </m:r>
-        <m:r>
-          <m:rPr>
-            <m:sty m:val="p"/>
-          </m:rPr>
-          <m:t>−</m:t>
-        </m:r>
-        <m:r>
-          <m:t>s</m:t>
-        </m:r>
-        <m:r>
-          <m:t>e</m:t>
-        </m:r>
-        <m:r>
-          <m:t>e</m:t>
-        </m:r>
-        <m:r>
-          <m:t>s</m:t>
-        </m:r>
-        <m:r>
-          <m:rPr>
-            <m:sty m:val="p"/>
-          </m:rPr>
-          <m:t>−</m:t>
-        </m:r>
-        <m:r>
-          <m:t>t</m:t>
-        </m:r>
-        <m:r>
-          <m:t>r</m:t>
-        </m:r>
-        <m:r>
-          <m:t>a</m:t>
-        </m:r>
-        <m:r>
-          <m:t>d</m:t>
-        </m:r>
-        <m:r>
-          <m:t>i</m:t>
-        </m:r>
-        <m:r>
-          <m:t>n</m:t>
-        </m:r>
-        <m:r>
-          <m:t>g</m:t>
-        </m:r>
-        <m:r>
-          <m:rPr>
-            <m:sty m:val="p"/>
-          </m:rPr>
-          <m:t>−</m:t>
-        </m:r>
-        <m:r>
-          <m:t>r</m:t>
-        </m:r>
-        <m:r>
-          <m:t>e</m:t>
-        </m:r>
-        <m:r>
-          <m:t>v</m:t>
-        </m:r>
-        <m:r>
-          <m:t>e</m:t>
-        </m:r>
-        <m:r>
-          <m:t>n</m:t>
-        </m:r>
-        <m:r>
-          <m:t>u</m:t>
-        </m:r>
-        <m:r>
-          <m:t>e</m:t>
-        </m:r>
-        <m:r>
-          <m:rPr>
-            <m:sty m:val="p"/>
-          </m:rPr>
-          <m:t>−</m:t>
-        </m:r>
-        <m:r>
-          <m:t>r</m:t>
-        </m:r>
-        <m:r>
-          <m:t>e</m:t>
-        </m:r>
-        <m:r>
-          <m:t>l</m:t>
-        </m:r>
-        <m:r>
-          <m:t>a</m:t>
-        </m:r>
-        <m:r>
-          <m:t>t</m:t>
-        </m:r>
-        <m:r>
-          <m:t>i</m:t>
-        </m:r>
-        <m:r>
-          <m:t>v</m:t>
-        </m:r>
-        <m:r>
-          <m:t>e</m:t>
-        </m:r>
-        <m:r>
-          <m:t>l</m:t>
-        </m:r>
-        <m:r>
-          <m:t>y</m:t>
-        </m:r>
-        <m:r>
-          <m:rPr>
-            <m:sty m:val="p"/>
-          </m:rPr>
-          <m:t>−</m:t>
-        </m:r>
-        <m:r>
-          <m:t>f</m:t>
-        </m:r>
-        <m:r>
-          <m:t>l</m:t>
-        </m:r>
-        <m:r>
-          <m:t>a</m:t>
-        </m:r>
-        <m:r>
-          <m:t>t</m:t>
-        </m:r>
-        <m:r>
-          <m:rPr>
-            <m:sty m:val="p"/>
-          </m:rPr>
-          <m:t>−</m:t>
-        </m:r>
-        <m:r>
-          <m:t>i</m:t>
-        </m:r>
-        <m:r>
-          <m:t>n</m:t>
-        </m:r>
-        <m:r>
-          <m:rPr>
-            <m:sty m:val="p"/>
-          </m:rPr>
-          <m:t>−</m:t>
-        </m:r>
-        <m:r>
-          <m:t>t</m:t>
-        </m:r>
-        <m:r>
-          <m:t>h</m:t>
-        </m:r>
-        <m:r>
-          <m:t>i</m:t>
-        </m:r>
-        <m:r>
-          <m:t>r</m:t>
-        </m:r>
-        <m:r>
-          <m:t>d</m:t>
-        </m:r>
-        <m:r>
-          <m:rPr>
-            <m:sty m:val="p"/>
-          </m:rPr>
-          <m:t>−</m:t>
-        </m:r>
-        <m:r>
-          <m:t>q</m:t>
-        </m:r>
-        <m:r>
-          <m:t>u</m:t>
-        </m:r>
-        <m:r>
-          <m:t>a</m:t>
-        </m:r>
-        <m:r>
-          <m:t>r</m:t>
-        </m:r>
-        <m:r>
-          <m:t>t</m:t>
-        </m:r>
-        <m:r>
-          <m:t>e</m:t>
-        </m:r>
-        <m:r>
-          <m:t>r</m:t>
-        </m:r>
-        <m:r>
-          <m:rPr>
-            <m:sty m:val="p"/>
-          </m:rPr>
-          <m:t>)</m:t>
-        </m:r>
-        <m:r>
-          <m:rPr>
-            <m:sty m:val="p"/>
-          </m:rPr>
-          <m:t>)</m:t>
-        </m:r>
-        <m:r>
-          <m:rPr>
-            <m:sty m:val="p"/>
-          </m:rPr>
-          <m:t>.</m:t>
-        </m:r>
-        <m:r>
-          <m:t>T</m:t>
-        </m:r>
-        <m:r>
-          <m:t>h</m:t>
-        </m:r>
-        <m:r>
-          <m:t>e</m:t>
-        </m:r>
-        <m:r>
-          <m:t>24</m:t>
-        </m:r>
-        <m:r>
-          <m:rPr>
-            <m:sty m:val="p"/>
-          </m:rPr>
-          <m:t>−</m:t>
-        </m:r>
-        <m:r>
-          <m:t>a</m:t>
-        </m:r>
-        <m:r>
-          <m:t>n</m:t>
-        </m:r>
-        <m:r>
-          <m:t>a</m:t>
-        </m:r>
-        <m:r>
-          <m:t>l</m:t>
-        </m:r>
-        <m:r>
-          <m:t>y</m:t>
-        </m:r>
-        <m:r>
-          <m:t>s</m:t>
-        </m:r>
-        <m:r>
-          <m:t>t</m:t>
-        </m:r>
-        <m:r>
-          <m:t>a</m:t>
-        </m:r>
-        <m:r>
-          <m:t>v</m:t>
-        </m:r>
-        <m:r>
-          <m:t>e</m:t>
-        </m:r>
-        <m:r>
-          <m:t>r</m:t>
-        </m:r>
-        <m:r>
-          <m:t>a</m:t>
-        </m:r>
-        <m:r>
-          <m:t>g</m:t>
-        </m:r>
-        <m:r>
-          <m:t>e</m:t>
-        </m:r>
-        <m:r>
-          <m:t>t</m:t>
-        </m:r>
-        <m:r>
-          <m:t>a</m:t>
-        </m:r>
-        <m:r>
-          <m:t>r</m:t>
-        </m:r>
-        <m:r>
-          <m:t>g</m:t>
-        </m:r>
-        <m:r>
-          <m:t>e</m:t>
-        </m:r>
-        <m:r>
-          <m:t>t</m:t>
-        </m:r>
-        <m:r>
-          <m:t>i</m:t>
-        </m:r>
-        <m:r>
-          <m:t>s</m:t>
-        </m:r>
-        <m:r>
-          <m:rPr>
-            <m:sty m:val="p"/>
-          </m:rPr>
-          <m:t>*</m:t>
-        </m:r>
-        <m:r>
-          <m:rPr>
-            <m:sty m:val="p"/>
-          </m:rPr>
-          <m:t>*</m:t>
-        </m:r>
-      </m:oMath>
-      <w:r>
-        <w:rPr>
-          <w:b/>
-          <w:bCs/>
-        </w:rPr>
-        <w:t xml:space="preserve">375.14</w:t>
+        <w:t xml:space="preserve">$5.49 to $5.85</w:t>
+      </w:r>
+      <w:r>
+        <w:t xml:space="preserve"> </w:t>
+      </w:r>
+      <w:r>
+        <w:t xml:space="preserve">since Jun 30, making JPM the largest contributor to the Financials sector's increase (</w:t>
+      </w:r>
+      <w:hyperlink r:id="rId94">
+        <w:r>
+          <w:rPr>
+            <w:rStyle w:val="Hyperlink"/>
+          </w:rPr>
+          <w:t xml:space="preserve">FactSet</w:t>
+        </w:r>
+      </w:hyperlink>
+      <w:r>
+        <w:t xml:space="preserve">). Q2 EPS was</w:t>
+      </w:r>
+      <w:r>
+        <w:t xml:space="preserve"> </w:t>
+      </w:r>
+      <w:r>
+        <w:rPr>
+          <w:b/>
+          <w:bCs/>
+        </w:rPr>
+        <w:t xml:space="preserve">$7.70 against a $5.55 estimate</w:t>
+      </w:r>
+      <w:r>
+        <w:t xml:space="preserve"> </w:t>
+      </w:r>
+      <w:r>
+        <w:t xml:space="preserve">(</w:t>
+      </w:r>
+      <w:hyperlink r:id="rId61">
+        <w:r>
+          <w:rPr>
+            <w:rStyle w:val="Hyperlink"/>
+          </w:rPr>
+          <w:t xml:space="preserve">Investing.com</w:t>
+        </w:r>
+      </w:hyperlink>
+      <w:r>
+        <w:t xml:space="preserve">). On Sep 14, co-president Doug Petno guided Q3 investment-banking fees and markets revenue</w:t>
+      </w:r>
+      <w:r>
+        <w:t xml:space="preserve"> </w:t>
+      </w:r>
+      <w:r>
+        <w:rPr>
+          <w:b/>
+          <w:bCs/>
+        </w:rPr>
+        <w:t xml:space="preserve">up mid-to-high teens</w:t>
+      </w:r>
+      <w:r>
+        <w:t xml:space="preserve"> </w:t>
+      </w:r>
+      <w:r>
+        <w:t xml:space="preserve">(</w:t>
+      </w:r>
+      <w:hyperlink r:id="rId95">
+        <w:r>
+          <w:rPr>
+            <w:rStyle w:val="Hyperlink"/>
+          </w:rPr>
+          <w:t xml:space="preserve">Bloomberg</w:t>
+        </w:r>
+      </w:hyperlink>
+      <w:r>
+        <w:t xml:space="preserve">). The 24-analyst average target is</w:t>
+      </w:r>
+      <w:r>
+        <w:t xml:space="preserve"> </w:t>
+      </w:r>
+      <w:r>
+        <w:rPr>
+          <w:b/>
+          <w:bCs/>
+        </w:rPr>
+        <w:t xml:space="preserve">$375.14</w:t>
       </w:r>
       <w:r>
         <w:t xml:space="preserve"> </w:t>
@@ -9980,7 +7933,7 @@
       <w:r>
         <w:t xml:space="preserve">at about 7:00am ET, confirmed by the company (</w:t>
       </w:r>
-      <w:hyperlink r:id="rId94">
+      <w:hyperlink r:id="rId96">
         <w:r>
           <w:rPr>
             <w:rStyle w:val="Hyperlink"/>
@@ -10025,7 +7978,7 @@
       <w:r>
         <w:t xml:space="preserve">when the 10-year topped 5%, amid a near-flat curve (</w:t>
       </w:r>
-      <w:hyperlink r:id="rId95">
+      <w:hyperlink r:id="rId97">
         <w:r>
           <w:rPr>
             <w:rStyle w:val="Hyperlink"/>
@@ -10036,7 +7989,7 @@
       <w:r>
         <w:t xml:space="preserve">). BofA's CEO guided Q3 trading "relatively flat", and BAC fell about 5% (</w:t>
       </w:r>
-      <w:hyperlink r:id="rId96">
+      <w:hyperlink r:id="rId95">
         <w:r>
           <w:rPr>
             <w:rStyle w:val="Hyperlink"/>
@@ -10123,8 +8076,8 @@
         <w:t xml:space="preserve">The 10-year holding above 5.25%.</w:t>
       </w:r>
     </w:p>
-    <w:bookmarkEnd w:id="97"/>
-    <w:bookmarkStart w:id="107" w:name="X937c853dc5e5c589e9cf7fe89f4c3cc4ab5ee3d"/>
+    <w:bookmarkEnd w:id="98"/>
+    <w:bookmarkStart w:id="108" w:name="X937c853dc5e5c589e9cf7fe89f4c3cc4ab5ee3d"/>
     <w:p>
       <w:pPr>
         <w:pStyle w:val="Heading3"/>
@@ -10190,7 +8143,7 @@
       <w:r>
         <w:t xml:space="preserve">(</w:t>
       </w:r>
-      <w:hyperlink r:id="rId98">
+      <w:hyperlink r:id="rId99">
         <w:r>
           <w:rPr>
             <w:rStyle w:val="Hyperlink"/>
@@ -10211,75 +8164,7 @@
         </w:numPr>
       </w:pPr>
       <w:r>
-        <w:t xml:space="preserve">The 50-day average (</w:t>
-      </w:r>
-      <m:oMath>
-        <m:r>
-          <m:t>243.71</m:t>
-        </m:r>
-        <m:r>
-          <m:rPr>
-            <m:sty m:val="p"/>
-          </m:rPr>
-          <m:t>)</m:t>
-        </m:r>
-        <m:r>
-          <m:t>i</m:t>
-        </m:r>
-        <m:r>
-          <m:t>s</m:t>
-        </m:r>
-        <m:r>
-          <m:t>a</m:t>
-        </m:r>
-        <m:r>
-          <m:t>b</m:t>
-        </m:r>
-        <m:r>
-          <m:t>o</m:t>
-        </m:r>
-        <m:r>
-          <m:t>v</m:t>
-        </m:r>
-        <m:r>
-          <m:t>e</m:t>
-        </m:r>
-        <m:r>
-          <m:t>t</m:t>
-        </m:r>
-        <m:r>
-          <m:t>h</m:t>
-        </m:r>
-        <m:r>
-          <m:t>e</m:t>
-        </m:r>
-        <m:r>
-          <m:t>200</m:t>
-        </m:r>
-        <m:r>
-          <m:rPr>
-            <m:sty m:val="p"/>
-          </m:rPr>
-          <m:t>−</m:t>
-        </m:r>
-        <m:r>
-          <m:t>d</m:t>
-        </m:r>
-        <m:r>
-          <m:t>a</m:t>
-        </m:r>
-        <m:r>
-          <m:t>y</m:t>
-        </m:r>
-        <m:r>
-          <m:rPr>
-            <m:sty m:val="p"/>
-          </m:rPr>
-          <m:t>(</m:t>
-        </m:r>
-      </m:oMath>
-      <w:r>
-        <w:t xml:space="preserve">209.69), with</w:t>
+        <w:t xml:space="preserve">The 50-day average ($243.71) is above the 200-day ($209.69), with</w:t>
       </w:r>
       <w:r>
         <w:t xml:space="preserve"> </w:t>
@@ -10336,7 +8221,7 @@
       <w:r>
         <w:t xml:space="preserve">(</w:t>
       </w:r>
-      <w:hyperlink r:id="rId99">
+      <w:hyperlink r:id="rId100">
         <w:r>
           <w:rPr>
             <w:rStyle w:val="Hyperlink"/>
@@ -10359,7 +8244,7 @@
       <w:r>
         <w:t xml:space="preserve">Short interest is only about 1.89M shares (</w:t>
       </w:r>
-      <w:hyperlink r:id="rId100">
+      <w:hyperlink r:id="rId101">
         <w:r>
           <w:rPr>
             <w:rStyle w:val="Hyperlink"/>
@@ -10388,7 +8273,7 @@
       <w:r>
         <w:t xml:space="preserve">Q2 adjusted EBITDA rose 16.3% and EPS 52%, and 2026 guidance was raised (</w:t>
       </w:r>
-      <w:hyperlink r:id="rId101">
+      <w:hyperlink r:id="rId102">
         <w:r>
           <w:rPr>
             <w:rStyle w:val="Hyperlink"/>
@@ -10397,119 +8282,25 @@
         </w:r>
       </w:hyperlink>
       <w:r>
-        <w:t xml:space="preserve">). Targets are rising to</w:t>
-      </w:r>
-      <w:r>
-        <w:t xml:space="preserve"> </w:t>
-      </w:r>
-      <m:oMath>
-        <m:r>
-          <m:t>285</m:t>
-        </m:r>
-        <m:r>
-          <m:rPr>
-            <m:sty m:val="p"/>
-          </m:rPr>
-          <m:t>–</m:t>
-        </m:r>
-        <m:r>
-          <m:t>295</m:t>
-        </m:r>
-        <m:r>
-          <m:rPr>
-            <m:sty m:val="p"/>
-          </m:rPr>
-          <m:t>,</m:t>
-        </m:r>
-        <m:r>
-          <m:t>w</m:t>
-        </m:r>
-        <m:r>
-          <m:t>i</m:t>
-        </m:r>
-        <m:r>
-          <m:t>t</m:t>
-        </m:r>
-        <m:r>
-          <m:t>h</m:t>
-        </m:r>
-        <m:r>
-          <m:t>a</m:t>
-        </m:r>
-        <m:r>
-          <m:t>27</m:t>
-        </m:r>
-        <m:r>
-          <m:rPr>
-            <m:sty m:val="p"/>
-          </m:rPr>
-          <m:t>−</m:t>
-        </m:r>
-        <m:r>
-          <m:t>a</m:t>
-        </m:r>
-        <m:r>
-          <m:t>n</m:t>
-        </m:r>
-        <m:r>
-          <m:t>a</m:t>
-        </m:r>
-        <m:r>
-          <m:t>l</m:t>
-        </m:r>
-        <m:r>
-          <m:t>y</m:t>
-        </m:r>
-        <m:r>
-          <m:t>s</m:t>
-        </m:r>
-        <m:r>
-          <m:t>t</m:t>
-        </m:r>
-        <m:r>
-          <m:t>a</m:t>
-        </m:r>
-        <m:r>
-          <m:t>v</m:t>
-        </m:r>
-        <m:r>
-          <m:t>e</m:t>
-        </m:r>
-        <m:r>
-          <m:t>r</m:t>
-        </m:r>
-        <m:r>
-          <m:t>a</m:t>
-        </m:r>
-        <m:r>
-          <m:t>g</m:t>
-        </m:r>
-        <m:r>
-          <m:t>e</m:t>
-        </m:r>
-        <m:r>
-          <m:t>o</m:t>
-        </m:r>
-        <m:r>
-          <m:t>f</m:t>
-        </m:r>
-        <m:r>
-          <m:rPr>
-            <m:sty m:val="p"/>
-          </m:rPr>
-          <m:t>*</m:t>
-        </m:r>
-        <m:r>
-          <m:rPr>
-            <m:sty m:val="p"/>
-          </m:rPr>
-          <m:t>*</m:t>
-        </m:r>
-      </m:oMath>
-      <w:r>
-        <w:t xml:space="preserve">289.05** (</w:t>
-      </w:r>
-      <w:hyperlink r:id="rId102">
+        <w:t xml:space="preserve">). Targets are rising to $285–295, with a 27-analyst average of</w:t>
+      </w:r>
+      <w:r>
+        <w:t xml:space="preserve"> </w:t>
+      </w:r>
+      <w:r>
+        <w:rPr>
+          <w:b/>
+          <w:bCs/>
+        </w:rPr>
+        <w:t xml:space="preserve">$289.05</w:t>
+      </w:r>
+      <w:r>
+        <w:t xml:space="preserve"> </w:t>
+      </w:r>
+      <w:r>
+        <w:t xml:space="preserve">(</w:t>
+      </w:r>
+      <w:hyperlink r:id="rId103">
         <w:r>
           <w:rPr>
             <w:rStyle w:val="Hyperlink"/>
@@ -10538,7 +8329,7 @@
       <w:r>
         <w:t xml:space="preserve">THC has reported Q3 on Oct 28–30 in each of the last three years (</w:t>
       </w:r>
-      <w:hyperlink r:id="rId103">
+      <w:hyperlink r:id="rId104">
         <w:r>
           <w:rPr>
             <w:rStyle w:val="Hyperlink"/>
@@ -10611,7 +8402,7 @@
       <w:r>
         <w:t xml:space="preserve">(</w:t>
       </w:r>
-      <w:hyperlink r:id="rId104">
+      <w:hyperlink r:id="rId105">
         <w:r>
           <w:rPr>
             <w:rStyle w:val="Hyperlink"/>
@@ -10634,7 +8425,7 @@
       <w:r>
         <w:t xml:space="preserve">Q2 exchange admissions fell 13.5% (</w:t>
       </w:r>
-      <w:hyperlink r:id="rId105">
+      <w:hyperlink r:id="rId106">
         <w:r>
           <w:rPr>
             <w:rStyle w:val="Hyperlink"/>
@@ -10667,7 +8458,7 @@
       <w:r>
         <w:t xml:space="preserve">(</w:t>
       </w:r>
-      <w:hyperlink r:id="rId106">
+      <w:hyperlink r:id="rId107">
         <w:r>
           <w:rPr>
             <w:rStyle w:val="Hyperlink"/>
@@ -10752,9 +8543,9 @@
         <w:t xml:space="preserve">, about 6.0% below the reference price.</w:t>
       </w:r>
     </w:p>
-    <w:bookmarkEnd w:id="107"/>
     <w:bookmarkEnd w:id="108"/>
-    <w:bookmarkStart w:id="115" w:name="two-event-clusters-decide-the-window"/>
+    <w:bookmarkEnd w:id="109"/>
+    <w:bookmarkStart w:id="116" w:name="two-event-clusters-decide-the-window"/>
     <w:p>
       <w:pPr>
         <w:pStyle w:val="Heading2"/>
@@ -10845,7 +8636,7 @@
             <w:r>
               <w:t xml:space="preserve">US–China "protected lane" deal details (</w:t>
             </w:r>
-            <w:hyperlink r:id="rId109">
+            <w:hyperlink r:id="rId110">
               <w:r>
                 <w:rPr>
                   <w:rStyle w:val="Hyperlink"/>
@@ -10902,7 +8693,7 @@
             <w:r>
               <w:t xml:space="preserve">Micron FQ4 results, after close (</w:t>
             </w:r>
-            <w:hyperlink r:id="rId110">
+            <w:hyperlink r:id="rId111">
               <w:r>
                 <w:rPr>
                   <w:rStyle w:val="Hyperlink"/>
@@ -10959,7 +8750,7 @@
             <w:r>
               <w:t xml:space="preserve">September jobs report (</w:t>
             </w:r>
-            <w:hyperlink r:id="rId111">
+            <w:hyperlink r:id="rId112">
               <w:r>
                 <w:rPr>
                   <w:rStyle w:val="Hyperlink"/>
@@ -11026,7 +8817,7 @@
             <w:r>
               <w:t xml:space="preserve">(~7:00am ET); UNH (</w:t>
             </w:r>
-            <w:hyperlink r:id="rId112">
+            <w:hyperlink r:id="rId113">
               <w:r>
                 <w:rPr>
                   <w:rStyle w:val="Hyperlink"/>
@@ -11701,7 +9492,7 @@
             <w:r>
               <w:t xml:space="preserve">Treasury quarterly refunding (</w:t>
             </w:r>
-            <w:hyperlink r:id="rId113">
+            <w:hyperlink r:id="rId114">
               <w:r>
                 <w:rPr>
                   <w:rStyle w:val="Hyperlink"/>
@@ -11804,7 +9595,7 @@
             <w:r>
               <w:t xml:space="preserve">October CPI (</w:t>
             </w:r>
-            <w:hyperlink r:id="rId114">
+            <w:hyperlink r:id="rId115">
               <w:r>
                 <w:rPr>
                   <w:rStyle w:val="Hyperlink"/>
@@ -11991,8 +9782,8 @@
         <w:t xml:space="preserve">NVDA's report may add a third decision point in the final three trading days.</w:t>
       </w:r>
     </w:p>
-    <w:bookmarkEnd w:id="115"/>
-    <w:bookmarkStart w:id="119" w:name="X63b89da5788a912fdb407a113e9ad725352439e"/>
+    <w:bookmarkEnd w:id="116"/>
+    <w:bookmarkStart w:id="120" w:name="X63b89da5788a912fdb407a113e9ad725352439e"/>
     <w:p>
       <w:pPr>
         <w:pStyle w:val="Heading2"/>
@@ -12018,7 +9809,7 @@
       <w:r>
         <w:t xml:space="preserve">would push oil and then yields down. Our notes' scenario map shows this would hurt energy and defense and lift airlines, rate-sensitive stocks and small caps. When the Iran offer surfaced, airlines rose 6–8% in a week (</w:t>
       </w:r>
-      <w:hyperlink r:id="rId116">
+      <w:hyperlink r:id="rId117">
         <w:r>
           <w:rPr>
             <w:rStyle w:val="Hyperlink"/>
@@ -12073,7 +9864,7 @@
       <w:r>
         <w:t xml:space="preserve">would test the NVDA and APH slots, 40% of an equal-weight basket. Oracle's Sep 24 force-majeure notice was the first dated crack (</w:t>
       </w:r>
-      <w:hyperlink r:id="rId117">
+      <w:hyperlink r:id="rId118">
         <w:r>
           <w:rPr>
             <w:rStyle w:val="Hyperlink"/>
@@ -12084,7 +9875,7 @@
       <w:r>
         <w:t xml:space="preserve">). The GLJ note on GEV showed the whole AI-power complex trading as one factor that day: ETN fell 7% and PWR 4% (</w:t>
       </w:r>
-      <w:hyperlink r:id="rId118">
+      <w:hyperlink r:id="rId119">
         <w:r>
           <w:rPr>
             <w:rStyle w:val="Hyperlink"/>
@@ -12132,8 +9923,8 @@
         <w:t xml:space="preserve">adds to the risk. Two picks report within four days of each other, and three more sit in the Oct 27–30 week. Earnings-gap risk is therefore concentrated rather than spread across the window.</w:t>
       </w:r>
     </w:p>
-    <w:bookmarkEnd w:id="119"/>
-    <w:bookmarkStart w:id="125" w:name="conflicting-figures-across-the-notes"/>
+    <w:bookmarkEnd w:id="120"/>
+    <w:bookmarkStart w:id="126" w:name="conflicting-figures-across-the-notes"/>
     <w:p>
       <w:pPr>
         <w:pStyle w:val="Heading2"/>
@@ -12279,7 +10070,7 @@
             <w:r>
               <w:t xml:space="preserve">) vs "below $98" (Yahoo) vs about $106 (</w:t>
             </w:r>
-            <w:hyperlink r:id="rId120">
+            <w:hyperlink r:id="rId121">
               <w:r>
                 <w:rPr>
                   <w:rStyle w:val="Hyperlink"/>
@@ -12406,7 +10197,7 @@
             <w:r>
               <w:t xml:space="preserve">Energy +38.8% / +40.01% / +38.4%; Tech +35.24% vs +24.1% (</w:t>
             </w:r>
-            <w:hyperlink r:id="rId121">
+            <w:hyperlink r:id="rId122">
               <w:r>
                 <w:rPr>
                   <w:rStyle w:val="Hyperlink"/>
@@ -12522,7 +10313,7 @@
             <w:r>
               <w:t xml:space="preserve">42 negative + 72 positive = 114, not the stated 111 (</w:t>
             </w:r>
-            <w:hyperlink r:id="rId122">
+            <w:hyperlink r:id="rId123">
               <w:r>
                 <w:rPr>
                   <w:rStyle w:val="Hyperlink"/>
@@ -12603,7 +10394,7 @@
             <w:r>
               <w:t xml:space="preserve">−1.24% after hours (low-quality blog) vs +8.7% the next day (</w:t>
             </w:r>
-            <w:hyperlink r:id="rId123">
+            <w:hyperlink r:id="rId124">
               <w:r>
                 <w:rPr>
                   <w:rStyle w:val="Hyperlink"/>
@@ -12789,7 +10580,7 @@
             <w:r>
               <w:t xml:space="preserve">"Near-flat" (</w:t>
             </w:r>
-            <w:hyperlink r:id="rId95">
+            <w:hyperlink r:id="rId97">
               <w:r>
                 <w:rPr>
                   <w:rStyle w:val="Hyperlink"/>
@@ -12800,7 +10591,7 @@
             <w:r>
               <w:t xml:space="preserve">) vs 2s/10s about +0.52% (</w:t>
             </w:r>
-            <w:hyperlink r:id="rId124">
+            <w:hyperlink r:id="rId125">
               <w:r>
                 <w:rPr>
                   <w:rStyle w:val="Hyperlink"/>
@@ -12966,8 +10757,8 @@
         </w:tc>
       </w:tr>
     </w:tbl>
-    <w:bookmarkEnd w:id="125"/>
-    <w:bookmarkStart w:id="126" w:name="grading-the-picks-on-nov-20-and-nov-23"/>
+    <w:bookmarkEnd w:id="126"/>
+    <w:bookmarkStart w:id="127" w:name="grading-the-picks-on-nov-20-and-nov-23"/>
     <w:p>
       <w:pPr>
         <w:pStyle w:val="Heading2"/>
@@ -13309,8 +11100,8 @@
         <w:t xml:space="preserve">Running the grading on Mon Nov 23 captures the Nov 20 closing data after options expiration. A grading check is scheduled for that date.</w:t>
       </w:r>
     </w:p>
-    <w:bookmarkEnd w:id="126"/>
-    <w:bookmarkStart w:id="127" w:name="conclusion"/>
+    <w:bookmarkEnd w:id="127"/>
+    <w:bookmarkStart w:id="128" w:name="conclusion"/>
     <w:p>
       <w:pPr>
         <w:pStyle w:val="Heading2"/>
@@ -13335,8 +11126,8 @@
         <w:t xml:space="preserve">The uncomfortable implication is that the Financials leg makes the basket short the Fund Manager Survey's top tail risk, a yield spike. The Oct 13–16 cluster is therefore the first real test of the thesis, well before the AI names report. Given the snippet-only data, the most valuable next step is not more screening. It is a live-data pass that confirms prices, the NVDA and THC dates, and the implied moves, before anyone relies on these rankings.</w:t>
       </w:r>
     </w:p>
-    <w:bookmarkEnd w:id="127"/>
     <w:bookmarkEnd w:id="128"/>
+    <w:bookmarkEnd w:id="129"/>
     <w:sectPr>
       <w:footnotePr>
         <w:numRestart w:val="eachSect"/>

</xml_diff>

<commit_message>
V3 report: consistent risk and catalyst rules, rule-based basket, grading fixes
- Define one risk rule and one catalyst rule and re-score all 21 names
  (analysis/rescore_v3.py); rule-based basket is TRV, JPM, VLO, THC, MU
- Present V2 and NVDA-date-confirmed baskets as alternatives, none privileged
- Reword opening, TRV heading, NVDA crowding claim, 'robust core' language
- Grading: V3 basket pre-registered as official; one entry convention for
  the whole basket; base rate labelled as an assumption
- Guard sensitivity.py entry point so it can be imported

Co-Authored-By: Claude Opus 5.5 <noreply@anthropic.com>
Claude-Session: https://claude.ai/code/session_016AgBnoCfdHhgV6SFp5cQBC
</commit_message>
<xml_diff>
--- a/reports/Top 5 stocks Sep to Nov 2026.docx
+++ b/reports/Top 5 stocks Sep to Nov 2026.docx
@@ -2,13 +2,13 @@
 <file path=word/document.xml><?xml version="1.0" encoding="utf-8"?>
 <w:document xmlns:w="http://schemas.openxmlformats.org/wordprocessingml/2006/main" xmlns:m="http://schemas.openxmlformats.org/officeDocument/2006/math" xmlns:r="http://schemas.openxmlformats.org/officeDocument/2006/relationships" xmlns:o="urn:schemas-microsoft-com:office:office" xmlns:v="urn:schemas-microsoft-com:vml" xmlns:w10="urn:schemas-microsoft-com:office:word" xmlns:a="http://schemas.openxmlformats.org/drawingml/2006/main" xmlns:pic="http://schemas.openxmlformats.org/drawingml/2006/picture" xmlns:wp="http://schemas.openxmlformats.org/drawingml/2006/wordprocessingDrawing">
   <w:body>
-    <w:bookmarkStart w:id="129" w:name="X7899ff881bbf6c71daf86982b2a1930edb07d0e"/>
+    <w:bookmarkStart w:id="136" w:name="X05e5b260288ff09fe99ceda6960ec348c15bf23"/>
     <w:p>
       <w:pPr>
         <w:pStyle w:val="Heading1"/>
       </w:pPr>
       <w:r>
-        <w:t xml:space="preserve">Revisions tilt the odds toward five stocks</w:t>
+        <w:t xml:space="preserve">A provisional five-stock basket for Sep 28 to Nov 20, 2026</w:t>
       </w:r>
     </w:p>
     <w:p>
@@ -16,46 +16,46 @@
         <w:pStyle w:val="FirstParagraph"/>
       </w:pPr>
       <w:r>
-        <w:t xml:space="preserve">The five US-listed stocks with the best risk-aware odds of beating the S&amp;P 500 from Mon Sep 28 to Fri Nov 20, 2026 are</w:t>
-      </w:r>
-      <w:r>
-        <w:t xml:space="preserve"> </w:t>
-      </w:r>
-      <w:r>
-        <w:rPr>
-          <w:b/>
-          <w:bCs/>
-        </w:rPr>
-        <w:t xml:space="preserve">Nvidia (NVDA), Travelers (TRV), Amphenol (APH), JPMorgan Chase (JPM) and Tenet Healthcare (THC)</w:t>
-      </w:r>
-      <w:r>
-        <w:t xml:space="preserve">. We scored all 21 stress-tested names on one weighted scorecard. Applying the portfolio caps mechanically (no more than two AI-hardware names and no more than two names per sector) gives NVDA, TRV,</w:t>
-      </w:r>
-      <w:r>
-        <w:t xml:space="preserve"> </w:t>
-      </w:r>
-      <w:r>
-        <w:rPr>
-          <w:b/>
-          <w:bCs/>
-        </w:rPr>
-        <w:t xml:space="preserve">ANET</w:t>
-      </w:r>
-      <w:r>
-        <w:t xml:space="preserve">, JPM and THC. We replaced Arista with Amphenol by judgment, for reasons given below. A sensitivity test shows that TRV, JPM and THC are robust picks. The two AI slots are close to a toss-up among NVDA, ANET, APH and DELL, and NVDA drops out if its risk score is cut by one point or if it reports after Nov 20. The basket averages</w:t>
-      </w:r>
-      <w:r>
-        <w:t xml:space="preserve"> </w:t>
-      </w:r>
-      <w:r>
-        <w:rPr>
-          <w:b/>
-          <w:bCs/>
-        </w:rPr>
-        <w:t xml:space="preserve">3.63 out of 5</w:t>
-      </w:r>
-      <w:r>
-        <w:t xml:space="preserve">. Each pick has upward estimate revisions and a dated catalyst inside the window, and four of the five have a confirmed or strongly patterned earnings report in it. That matters because revisions and price momentum are the only signals with robust evidence at a two-month horizon. Post-earnings drift has largely disappeared in large caps. The edge is modest. A single stock beats the index over about two months only</w:t>
+        <w:t xml:space="preserve">This report gives a</w:t>
+      </w:r>
+      <w:r>
+        <w:t xml:space="preserve"> </w:t>
+      </w:r>
+      <w:r>
+        <w:rPr>
+          <w:b/>
+          <w:bCs/>
+        </w:rPr>
+        <w:t xml:space="preserve">provisional five-stock basket</w:t>
+      </w:r>
+      <w:r>
+        <w:t xml:space="preserve">, drawn from a 21-name shortlist, for a paper test of whether estimate revisions and momentum can beat the S&amp;P 500 from Mon Sep 28 to Fri Nov 20, 2026. It does not establish that these are the five best stocks. Scored with one rule for risk and one for catalysts across all 21 names (V3), the rule-based basket is</w:t>
+      </w:r>
+      <w:r>
+        <w:t xml:space="preserve"> </w:t>
+      </w:r>
+      <w:r>
+        <w:rPr>
+          <w:b/>
+          <w:bCs/>
+        </w:rPr>
+        <w:t xml:space="preserve">Travelers (TRV), JPMorgan Chase (JPM), Valero (VLO), Tenet Healthcare (THC) and Micron (MU)</w:t>
+      </w:r>
+      <w:r>
+        <w:t xml:space="preserve">, averaging 3.62 out of 5. No basket is privileged beyond that rule. Under random one-point changes to the scores, TRV and JPM are selected in 86% and 84% of runs and VLO in 72%. THC (52%) and MU (44%) are unstable, and the second AI slot rotates among MU, DELL, ANET, APH and NVDA. These are model-selection frequencies, not probabilities of beating the index. The earlier V2 basket,</w:t>
+      </w:r>
+      <w:r>
+        <w:t xml:space="preserve"> </w:t>
+      </w:r>
+      <w:r>
+        <w:rPr>
+          <w:b/>
+          <w:bCs/>
+        </w:rPr>
+        <w:t xml:space="preserve">NVDA, TRV, APH, JPM and THC</w:t>
+      </w:r>
+      <w:r>
+        <w:t xml:space="preserve">, relied on a risk score for Nvidia that V2 itself called hard to defend and on a judgment override of Arista. It is kept below as an alternative, together with the basket that follows if Nvidia confirms a Nov 17 report date. That matters because revisions and price momentum are the only signals with robust evidence at a two-month horizon. Post-earnings drift has largely disappeared in large caps. The edge is modest. We assume a single stock beats the index over about two months only</w:t>
       </w:r>
       <w:r>
         <w:t xml:space="preserve"> </w:t>
@@ -68,7 +68,10 @@
         <w:t xml:space="preserve">45–48% of the time</w:t>
       </w:r>
       <w:r>
-        <w:t xml:space="preserve">, and an equal-weight five-stock basket still carries roughly ±5–7% of one-standard-deviation relative noise. So this is a probability tilt, not a forecast. The backdrop is fragile. The Fed hiked on Sep 16, the 10-year Treasury is near 5.2%, oil is around $92 on the Hormuz standoff, market breadth is at record-weak levels, and "long semis" is the most crowded trade. The basket's weakest scenario is a further yield spike, which would hit JPM and TRV together. The runners-up are</w:t>
+        <w:t xml:space="preserve"> </w:t>
+      </w:r>
+      <w:r>
+        <w:t xml:space="preserve">(an unvalidated estimate), and an equal-weight five-stock basket still carries roughly ±5–7% of one-standard-deviation relative noise. So this is a probability tilt, not a forecast. The backdrop is fragile. The Fed hiked on Sep 16, the 10-year Treasury is near 5.2%, oil is around $92 on the Hormuz standoff, market breadth is at record-weak levels, and "long semis" is the most crowded trade. The basket's weakest scenario is a further yield spike, which would hit JPM and TRV together. The runners-up are</w:t>
       </w:r>
       <w:r>
         <w:t xml:space="preserve"> </w:t>
@@ -4098,18 +4101,26 @@
       </w:r>
     </w:p>
     <w:bookmarkEnd w:id="38"/>
-    <w:bookmarkStart w:id="54" w:name="Xfc047a7a2022a51f5cdbdc72ef8170f4fbcec73"/>
+    <w:bookmarkStart w:id="54" w:name="X001a3f70de19b1bd9236081ca9a20f04e827a14"/>
     <w:p>
       <w:pPr>
         <w:pStyle w:val="Heading2"/>
       </w:pPr>
       <w:r>
-        <w:t xml:space="preserve">Theme caps turn the ranking into a five-stock basket</w:t>
+        <w:t xml:space="preserve">Theme caps turn the V2 ranking into a five-stock basket</w:t>
       </w:r>
     </w:p>
     <w:p>
       <w:pPr>
         <w:pStyle w:val="FirstParagraph"/>
+      </w:pPr>
+      <w:r>
+        <w:t xml:space="preserve">This section documents how the V2 basket was built. The V3 re-score in the next sections applies the same caps to consistently scored inputs and reaches a different basket.</w:t>
+      </w:r>
+    </w:p>
+    <w:p>
+      <w:pPr>
+        <w:pStyle w:val="BodyText"/>
       </w:pPr>
       <w:r>
         <w:t xml:space="preserve">Three constraints shape the basket:</w:t>
@@ -5957,23 +5968,20 @@
         <w:pStyle w:val="BodyText"/>
       </w:pPr>
       <w:r>
-        <w:t xml:space="preserve">The exact report basket came up in only 6% of draws, and the most common basket (the mechanical one) in 7%.</w:t>
-      </w:r>
-      <w:r>
-        <w:t xml:space="preserve"> </w:t>
-      </w:r>
-      <w:r>
-        <w:rPr>
-          <w:b/>
-          <w:bCs/>
-        </w:rPr>
-        <w:t xml:space="preserve">Read the output as a robust core of TRV, JPM and THC plus two AI slots that are close to a toss-up among NVDA, ANET, APH and DELL.</w:t>
-      </w:r>
-      <w:r>
-        <w:t xml:space="preserve"> </w:t>
-      </w:r>
-      <w:r>
-        <w:t xml:space="preserve">The claim that these are</w:t>
+        <w:t xml:space="preserve">The exact report basket came up in only 6% of draws, and the most common basket (the mechanical one) in 7%. These are</w:t>
+      </w:r>
+      <w:r>
+        <w:t xml:space="preserve"> </w:t>
+      </w:r>
+      <w:r>
+        <w:rPr>
+          <w:b/>
+          <w:bCs/>
+        </w:rPr>
+        <w:t xml:space="preserve">model-selection frequencies</w:t>
+      </w:r>
+      <w:r>
+        <w:t xml:space="preserve">, not probabilities of beating the index. They say that, within this scoring framework, TRV is selected far more reliably than THC, which drops out of 36% of runs. The tests only perturb scores inside the framework. They do not cover systematically wrong source data, other definitions of risk or momentum, scoring errors that move together across the AI names, other portfolio constraints or a wider universe. The claim that these are</w:t>
       </w:r>
       <w:r>
         <w:t xml:space="preserve"> </w:t>
@@ -6011,13 +6019,1868 @@
       </w:r>
     </w:p>
     <w:bookmarkEnd w:id="55"/>
-    <w:bookmarkStart w:id="109" w:name="X910b931f07d9527c9934127e8b2d1fa2639ddcb"/>
+    <w:bookmarkStart w:id="62" w:name="Xee466e908d2fb022564c88ba79b279f1d97402b"/>
     <w:p>
       <w:pPr>
         <w:pStyle w:val="Heading2"/>
       </w:pPr>
       <w:r>
-        <w:t xml:space="preserve">Five picks: thesis, data, catalysts and kill signals</w:t>
+        <w:t xml:space="preserve">Consistent rules produce a different basket (V3)</w:t>
+      </w:r>
+    </w:p>
+    <w:p>
+      <w:pPr>
+        <w:pStyle w:val="FirstParagraph"/>
+      </w:pPr>
+      <w:r>
+        <w:t xml:space="preserve">V2 left two inconsistencies. The risk score had no stated definition, so NVDA got a 4 while other semis got 1–2. The catalyst rule gave some aggregator-listed dates a 4 but FIX a 3. V3 applies one rule for each to all 21 names. Revisions, momentum, valuation and structural scores are unchanged. Script and output:</w:t>
+      </w:r>
+      <w:r>
+        <w:t xml:space="preserve"> </w:t>
+      </w:r>
+      <w:r>
+        <w:rPr>
+          <w:rStyle w:val="VerbatimChar"/>
+        </w:rPr>
+        <w:t xml:space="preserve">analysis/rescore_v3.py</w:t>
+      </w:r>
+      <w:r>
+        <w:t xml:space="preserve"> </w:t>
+      </w:r>
+      <w:r>
+        <w:t xml:space="preserve">and</w:t>
+      </w:r>
+      <w:r>
+        <w:t xml:space="preserve"> </w:t>
+      </w:r>
+      <w:r>
+        <w:rPr>
+          <w:rStyle w:val="VerbatimChar"/>
+        </w:rPr>
+        <w:t xml:space="preserve">analysis/rescore_v3_output.txt</w:t>
+      </w:r>
+      <w:r>
+        <w:t xml:space="preserve">.</w:t>
+      </w:r>
+    </w:p>
+    <w:p>
+      <w:pPr>
+        <w:pStyle w:val="BodyText"/>
+      </w:pPr>
+      <w:r>
+        <w:rPr>
+          <w:b/>
+          <w:bCs/>
+        </w:rPr>
+        <w:t xml:space="preserve">Risk rule (5 = lowest risk).</w:t>
+      </w:r>
+      <w:r>
+        <w:t xml:space="preserve"> </w:t>
+      </w:r>
+      <w:r>
+        <w:t xml:space="preserve">Start from the relative-volatility class in the evidence section: low (about 20% a year relative to the index: large banks, P&amp;C insurers, staples) = 4; typical (about 30%) = 3; high (45–60%: semis and AI hardware, names with beta near 2, cruise) = 2. Subtract 1 for an in-window binary event priced at ±10% or more (MU's Sep 30 print, CCL's Sep 29 print), and 1 for an extended chart flagged in the notes (THC at RSI 75; refiners more than 40% above their 150-day average).</w:t>
+      </w:r>
+    </w:p>
+    <w:p>
+      <w:pPr>
+        <w:pStyle w:val="BodyText"/>
+      </w:pPr>
+      <w:r>
+        <w:rPr>
+          <w:b/>
+          <w:bCs/>
+        </w:rPr>
+        <w:t xml:space="preserve">Catalyst rule.</w:t>
+      </w:r>
+      <w:r>
+        <w:t xml:space="preserve"> </w:t>
+      </w:r>
+      <w:r>
+        <w:t xml:space="preserve">4 = an in-window report or event announced by the company itself. 3 = an in-window date that comes only from aggregators or from the historical pattern. 2 = a date that could fall on either side of Nov 20. 1 = next report expected after Nov 20. V2's "good news already expected" adjustment is dropped, because it was applied unevenly.</w:t>
+      </w:r>
+    </w:p>
+    <w:tbl>
+      <w:tblPr>
+        <w:tblStyle w:val="Table"/>
+        <w:tblW w:type="auto" w:w="0"/>
+        <w:tblLook w:firstRow="1" w:lastRow="0" w:firstColumn="0" w:lastColumn="0" w:noHBand="0" w:noVBand="0" w:val="0020"/>
+      </w:tblPr>
+      <w:tblGrid>
+        <w:gridCol w:w="1584"/>
+        <w:gridCol w:w="1584"/>
+        <w:gridCol w:w="1584"/>
+        <w:gridCol w:w="1584"/>
+        <w:gridCol w:w="1584"/>
+      </w:tblGrid>
+      <w:tr>
+        <w:trPr>
+          <w:tblHeader w:val="on"/>
+        </w:trPr>
+        <w:tc>
+          <w:tcPr/>
+          <w:p>
+            <w:pPr>
+              <w:pStyle w:val="Compact"/>
+            </w:pPr>
+            <w:r>
+              <w:t xml:space="preserve">Ticker</w:t>
+            </w:r>
+          </w:p>
+        </w:tc>
+        <w:tc>
+          <w:tcPr/>
+          <w:p>
+            <w:pPr>
+              <w:pStyle w:val="Compact"/>
+            </w:pPr>
+            <w:r>
+              <w:t xml:space="preserve">Risk V2→V3</w:t>
+            </w:r>
+          </w:p>
+        </w:tc>
+        <w:tc>
+          <w:tcPr/>
+          <w:p>
+            <w:pPr>
+              <w:pStyle w:val="Compact"/>
+            </w:pPr>
+            <w:r>
+              <w:t xml:space="preserve">Catalyst V2→V3</w:t>
+            </w:r>
+          </w:p>
+        </w:tc>
+        <w:tc>
+          <w:tcPr/>
+          <w:p>
+            <w:pPr>
+              <w:pStyle w:val="Compact"/>
+            </w:pPr>
+            <w:r>
+              <w:t xml:space="preserve">Score V2</w:t>
+            </w:r>
+          </w:p>
+        </w:tc>
+        <w:tc>
+          <w:tcPr/>
+          <w:p>
+            <w:pPr>
+              <w:pStyle w:val="Compact"/>
+            </w:pPr>
+            <w:r>
+              <w:t xml:space="preserve">Score V3</w:t>
+            </w:r>
+          </w:p>
+        </w:tc>
+      </w:tr>
+      <w:tr>
+        <w:tc>
+          <w:tcPr/>
+          <w:p>
+            <w:pPr>
+              <w:pStyle w:val="Compact"/>
+            </w:pPr>
+            <w:r>
+              <w:t xml:space="preserve">TRV</w:t>
+            </w:r>
+          </w:p>
+        </w:tc>
+        <w:tc>
+          <w:tcPr/>
+          <w:p>
+            <w:pPr>
+              <w:pStyle w:val="Compact"/>
+            </w:pPr>
+            <w:r>
+              <w:t xml:space="preserve">4→4</w:t>
+            </w:r>
+          </w:p>
+        </w:tc>
+        <w:tc>
+          <w:tcPr/>
+          <w:p>
+            <w:pPr>
+              <w:pStyle w:val="Compact"/>
+            </w:pPr>
+            <w:r>
+              <w:t xml:space="preserve">4→4</w:t>
+            </w:r>
+          </w:p>
+        </w:tc>
+        <w:tc>
+          <w:tcPr/>
+          <w:p>
+            <w:pPr>
+              <w:pStyle w:val="Compact"/>
+            </w:pPr>
+            <w:r>
+              <w:t xml:space="preserve">3.75</w:t>
+            </w:r>
+          </w:p>
+        </w:tc>
+        <w:tc>
+          <w:tcPr/>
+          <w:p>
+            <w:pPr>
+              <w:pStyle w:val="Compact"/>
+            </w:pPr>
+            <w:r>
+              <w:t xml:space="preserve">3.75</w:t>
+            </w:r>
+          </w:p>
+        </w:tc>
+      </w:tr>
+      <w:tr>
+        <w:tc>
+          <w:tcPr/>
+          <w:p>
+            <w:pPr>
+              <w:pStyle w:val="Compact"/>
+            </w:pPr>
+            <w:r>
+              <w:t xml:space="preserve">JPM</w:t>
+            </w:r>
+          </w:p>
+        </w:tc>
+        <w:tc>
+          <w:tcPr/>
+          <w:p>
+            <w:pPr>
+              <w:pStyle w:val="Compact"/>
+            </w:pPr>
+            <w:r>
+              <w:t xml:space="preserve">3→4</w:t>
+            </w:r>
+          </w:p>
+        </w:tc>
+        <w:tc>
+          <w:tcPr/>
+          <w:p>
+            <w:pPr>
+              <w:pStyle w:val="Compact"/>
+            </w:pPr>
+            <w:r>
+              <w:t xml:space="preserve">4→4</w:t>
+            </w:r>
+          </w:p>
+        </w:tc>
+        <w:tc>
+          <w:tcPr/>
+          <w:p>
+            <w:pPr>
+              <w:pStyle w:val="Compact"/>
+            </w:pPr>
+            <w:r>
+              <w:t xml:space="preserve">3.55</w:t>
+            </w:r>
+          </w:p>
+        </w:tc>
+        <w:tc>
+          <w:tcPr/>
+          <w:p>
+            <w:pPr>
+              <w:pStyle w:val="Compact"/>
+            </w:pPr>
+            <w:r>
+              <w:t xml:space="preserve">3.70</w:t>
+            </w:r>
+          </w:p>
+        </w:tc>
+      </w:tr>
+      <w:tr>
+        <w:tc>
+          <w:tcPr/>
+          <w:p>
+            <w:pPr>
+              <w:pStyle w:val="Compact"/>
+            </w:pPr>
+            <w:r>
+              <w:t xml:space="preserve">VLO</w:t>
+            </w:r>
+          </w:p>
+        </w:tc>
+        <w:tc>
+          <w:tcPr/>
+          <w:p>
+            <w:pPr>
+              <w:pStyle w:val="Compact"/>
+            </w:pPr>
+            <w:r>
+              <w:t xml:space="preserve">1→2</w:t>
+            </w:r>
+          </w:p>
+        </w:tc>
+        <w:tc>
+          <w:tcPr/>
+          <w:p>
+            <w:pPr>
+              <w:pStyle w:val="Compact"/>
+            </w:pPr>
+            <w:r>
+              <w:t xml:space="preserve">3→4</w:t>
+            </w:r>
+          </w:p>
+        </w:tc>
+        <w:tc>
+          <w:tcPr/>
+          <w:p>
+            <w:pPr>
+              <w:pStyle w:val="Compact"/>
+            </w:pPr>
+            <w:r>
+              <w:t xml:space="preserve">3.30</w:t>
+            </w:r>
+          </w:p>
+        </w:tc>
+        <w:tc>
+          <w:tcPr/>
+          <w:p>
+            <w:pPr>
+              <w:pStyle w:val="Compact"/>
+            </w:pPr>
+            <w:r>
+              <w:t xml:space="preserve">3.65</w:t>
+            </w:r>
+          </w:p>
+        </w:tc>
+      </w:tr>
+      <w:tr>
+        <w:tc>
+          <w:tcPr/>
+          <w:p>
+            <w:pPr>
+              <w:pStyle w:val="Compact"/>
+            </w:pPr>
+            <w:r>
+              <w:t xml:space="preserve">MU</w:t>
+            </w:r>
+          </w:p>
+        </w:tc>
+        <w:tc>
+          <w:tcPr/>
+          <w:p>
+            <w:pPr>
+              <w:pStyle w:val="Compact"/>
+            </w:pPr>
+            <w:r>
+              <w:t xml:space="preserve">1→1</w:t>
+            </w:r>
+          </w:p>
+        </w:tc>
+        <w:tc>
+          <w:tcPr/>
+          <w:p>
+            <w:pPr>
+              <w:pStyle w:val="Compact"/>
+            </w:pPr>
+            <w:r>
+              <w:t xml:space="preserve">4→4</w:t>
+            </w:r>
+          </w:p>
+        </w:tc>
+        <w:tc>
+          <w:tcPr/>
+          <w:p>
+            <w:pPr>
+              <w:pStyle w:val="Compact"/>
+            </w:pPr>
+            <w:r>
+              <w:t xml:space="preserve">3.50</w:t>
+            </w:r>
+          </w:p>
+        </w:tc>
+        <w:tc>
+          <w:tcPr/>
+          <w:p>
+            <w:pPr>
+              <w:pStyle w:val="Compact"/>
+            </w:pPr>
+            <w:r>
+              <w:t xml:space="preserve">3.50</w:t>
+            </w:r>
+          </w:p>
+        </w:tc>
+      </w:tr>
+      <w:tr>
+        <w:tc>
+          <w:tcPr/>
+          <w:p>
+            <w:pPr>
+              <w:pStyle w:val="Compact"/>
+            </w:pPr>
+            <w:r>
+              <w:t xml:space="preserve">THC</w:t>
+            </w:r>
+          </w:p>
+        </w:tc>
+        <w:tc>
+          <w:tcPr/>
+          <w:p>
+            <w:pPr>
+              <w:pStyle w:val="Compact"/>
+            </w:pPr>
+            <w:r>
+              <w:t xml:space="preserve">2→2</w:t>
+            </w:r>
+          </w:p>
+        </w:tc>
+        <w:tc>
+          <w:tcPr/>
+          <w:p>
+            <w:pPr>
+              <w:pStyle w:val="Compact"/>
+            </w:pPr>
+            <w:r>
+              <w:t xml:space="preserve">3→3</w:t>
+            </w:r>
+          </w:p>
+        </w:tc>
+        <w:tc>
+          <w:tcPr/>
+          <w:p>
+            <w:pPr>
+              <w:pStyle w:val="Compact"/>
+            </w:pPr>
+            <w:r>
+              <w:t xml:space="preserve">3.50</w:t>
+            </w:r>
+          </w:p>
+        </w:tc>
+        <w:tc>
+          <w:tcPr/>
+          <w:p>
+            <w:pPr>
+              <w:pStyle w:val="Compact"/>
+            </w:pPr>
+            <w:r>
+              <w:t xml:space="preserve">3.50</w:t>
+            </w:r>
+          </w:p>
+        </w:tc>
+      </w:tr>
+      <w:tr>
+        <w:tc>
+          <w:tcPr/>
+          <w:p>
+            <w:pPr>
+              <w:pStyle w:val="Compact"/>
+            </w:pPr>
+            <w:r>
+              <w:t xml:space="preserve">DELL</w:t>
+            </w:r>
+          </w:p>
+        </w:tc>
+        <w:tc>
+          <w:tcPr/>
+          <w:p>
+            <w:pPr>
+              <w:pStyle w:val="Compact"/>
+            </w:pPr>
+            <w:r>
+              <w:t xml:space="preserve">2→2</w:t>
+            </w:r>
+          </w:p>
+        </w:tc>
+        <w:tc>
+          <w:tcPr/>
+          <w:p>
+            <w:pPr>
+              <w:pStyle w:val="Compact"/>
+            </w:pPr>
+            <w:r>
+              <w:t xml:space="preserve">2→1</w:t>
+            </w:r>
+          </w:p>
+        </w:tc>
+        <w:tc>
+          <w:tcPr/>
+          <w:p>
+            <w:pPr>
+              <w:pStyle w:val="Compact"/>
+            </w:pPr>
+            <w:r>
+              <w:t xml:space="preserve">3.65</w:t>
+            </w:r>
+          </w:p>
+        </w:tc>
+        <w:tc>
+          <w:tcPr/>
+          <w:p>
+            <w:pPr>
+              <w:pStyle w:val="Compact"/>
+            </w:pPr>
+            <w:r>
+              <w:t xml:space="preserve">3.45</w:t>
+            </w:r>
+          </w:p>
+        </w:tc>
+      </w:tr>
+      <w:tr>
+        <w:tc>
+          <w:tcPr/>
+          <w:p>
+            <w:pPr>
+              <w:pStyle w:val="Compact"/>
+            </w:pPr>
+            <w:r>
+              <w:t xml:space="preserve">CVE</w:t>
+            </w:r>
+          </w:p>
+        </w:tc>
+        <w:tc>
+          <w:tcPr/>
+          <w:p>
+            <w:pPr>
+              <w:pStyle w:val="Compact"/>
+            </w:pPr>
+            <w:r>
+              <w:t xml:space="preserve">2→3</w:t>
+            </w:r>
+          </w:p>
+        </w:tc>
+        <w:tc>
+          <w:tcPr/>
+          <w:p>
+            <w:pPr>
+              <w:pStyle w:val="Compact"/>
+            </w:pPr>
+            <w:r>
+              <w:t xml:space="preserve">3→3</w:t>
+            </w:r>
+          </w:p>
+        </w:tc>
+        <w:tc>
+          <w:tcPr/>
+          <w:p>
+            <w:pPr>
+              <w:pStyle w:val="Compact"/>
+            </w:pPr>
+            <w:r>
+              <w:t xml:space="preserve">3.20</w:t>
+            </w:r>
+          </w:p>
+        </w:tc>
+        <w:tc>
+          <w:tcPr/>
+          <w:p>
+            <w:pPr>
+              <w:pStyle w:val="Compact"/>
+            </w:pPr>
+            <w:r>
+              <w:t xml:space="preserve">3.35</w:t>
+            </w:r>
+          </w:p>
+        </w:tc>
+      </w:tr>
+      <w:tr>
+        <w:tc>
+          <w:tcPr/>
+          <w:p>
+            <w:pPr>
+              <w:pStyle w:val="Compact"/>
+            </w:pPr>
+            <w:r>
+              <w:t xml:space="preserve">ANET</w:t>
+            </w:r>
+          </w:p>
+        </w:tc>
+        <w:tc>
+          <w:tcPr/>
+          <w:p>
+            <w:pPr>
+              <w:pStyle w:val="Compact"/>
+            </w:pPr>
+            <w:r>
+              <w:t xml:space="preserve">3→2</w:t>
+            </w:r>
+          </w:p>
+        </w:tc>
+        <w:tc>
+          <w:tcPr/>
+          <w:p>
+            <w:pPr>
+              <w:pStyle w:val="Compact"/>
+            </w:pPr>
+            <w:r>
+              <w:t xml:space="preserve">4→3</w:t>
+            </w:r>
+          </w:p>
+        </w:tc>
+        <w:tc>
+          <w:tcPr/>
+          <w:p>
+            <w:pPr>
+              <w:pStyle w:val="Compact"/>
+            </w:pPr>
+            <w:r>
+              <w:t xml:space="preserve">3.65</w:t>
+            </w:r>
+          </w:p>
+        </w:tc>
+        <w:tc>
+          <w:tcPr/>
+          <w:p>
+            <w:pPr>
+              <w:pStyle w:val="Compact"/>
+            </w:pPr>
+            <w:r>
+              <w:t xml:space="preserve">3.30</w:t>
+            </w:r>
+          </w:p>
+        </w:tc>
+      </w:tr>
+      <w:tr>
+        <w:tc>
+          <w:tcPr/>
+          <w:p>
+            <w:pPr>
+              <w:pStyle w:val="Compact"/>
+            </w:pPr>
+            <w:r>
+              <w:t xml:space="preserve">NVDA</w:t>
+            </w:r>
+          </w:p>
+        </w:tc>
+        <w:tc>
+          <w:tcPr/>
+          <w:p>
+            <w:pPr>
+              <w:pStyle w:val="Compact"/>
+            </w:pPr>
+            <w:r>
+              <w:t xml:space="preserve">4→2</w:t>
+            </w:r>
+          </w:p>
+        </w:tc>
+        <w:tc>
+          <w:tcPr/>
+          <w:p>
+            <w:pPr>
+              <w:pStyle w:val="Compact"/>
+            </w:pPr>
+            <w:r>
+              <w:t xml:space="preserve">3→2</w:t>
+            </w:r>
+          </w:p>
+        </w:tc>
+        <w:tc>
+          <w:tcPr/>
+          <w:p>
+            <w:pPr>
+              <w:pStyle w:val="Compact"/>
+            </w:pPr>
+            <w:r>
+              <w:t xml:space="preserve">3.75</w:t>
+            </w:r>
+          </w:p>
+        </w:tc>
+        <w:tc>
+          <w:tcPr/>
+          <w:p>
+            <w:pPr>
+              <w:pStyle w:val="Compact"/>
+            </w:pPr>
+            <w:r>
+              <w:t xml:space="preserve">3.25</w:t>
+            </w:r>
+          </w:p>
+        </w:tc>
+      </w:tr>
+      <w:tr>
+        <w:tc>
+          <w:tcPr/>
+          <w:p>
+            <w:pPr>
+              <w:pStyle w:val="Compact"/>
+            </w:pPr>
+            <w:r>
+              <w:t xml:space="preserve">APH</w:t>
+            </w:r>
+          </w:p>
+        </w:tc>
+        <w:tc>
+          <w:tcPr/>
+          <w:p>
+            <w:pPr>
+              <w:pStyle w:val="Compact"/>
+            </w:pPr>
+            <w:r>
+              <w:t xml:space="preserve">4→3</w:t>
+            </w:r>
+          </w:p>
+        </w:tc>
+        <w:tc>
+          <w:tcPr/>
+          <w:p>
+            <w:pPr>
+              <w:pStyle w:val="Compact"/>
+            </w:pPr>
+            <w:r>
+              <w:t xml:space="preserve">4→3</w:t>
+            </w:r>
+          </w:p>
+        </w:tc>
+        <w:tc>
+          <w:tcPr/>
+          <w:p>
+            <w:pPr>
+              <w:pStyle w:val="Compact"/>
+            </w:pPr>
+            <w:r>
+              <w:t xml:space="preserve">3.60</w:t>
+            </w:r>
+          </w:p>
+        </w:tc>
+        <w:tc>
+          <w:tcPr/>
+          <w:p>
+            <w:pPr>
+              <w:pStyle w:val="Compact"/>
+            </w:pPr>
+            <w:r>
+              <w:t xml:space="preserve">3.25</w:t>
+            </w:r>
+          </w:p>
+        </w:tc>
+      </w:tr>
+      <w:tr>
+        <w:tc>
+          <w:tcPr/>
+          <w:p>
+            <w:pPr>
+              <w:pStyle w:val="Compact"/>
+            </w:pPr>
+            <w:r>
+              <w:t xml:space="preserve">GEV</w:t>
+            </w:r>
+          </w:p>
+        </w:tc>
+        <w:tc>
+          <w:tcPr/>
+          <w:p>
+            <w:pPr>
+              <w:pStyle w:val="Compact"/>
+            </w:pPr>
+            <w:r>
+              <w:t xml:space="preserve">3→3</w:t>
+            </w:r>
+          </w:p>
+        </w:tc>
+        <w:tc>
+          <w:tcPr/>
+          <w:p>
+            <w:pPr>
+              <w:pStyle w:val="Compact"/>
+            </w:pPr>
+            <w:r>
+              <w:t xml:space="preserve">4→4</w:t>
+            </w:r>
+          </w:p>
+        </w:tc>
+        <w:tc>
+          <w:tcPr/>
+          <w:p>
+            <w:pPr>
+              <w:pStyle w:val="Compact"/>
+            </w:pPr>
+            <w:r>
+              <w:t xml:space="preserve">3.10</w:t>
+            </w:r>
+          </w:p>
+        </w:tc>
+        <w:tc>
+          <w:tcPr/>
+          <w:p>
+            <w:pPr>
+              <w:pStyle w:val="Compact"/>
+            </w:pPr>
+            <w:r>
+              <w:t xml:space="preserve">3.10</w:t>
+            </w:r>
+          </w:p>
+        </w:tc>
+      </w:tr>
+      <w:tr>
+        <w:tc>
+          <w:tcPr/>
+          <w:p>
+            <w:pPr>
+              <w:pStyle w:val="Compact"/>
+            </w:pPr>
+            <w:r>
+              <w:t xml:space="preserve">P</w:t>
+            </w:r>
+          </w:p>
+        </w:tc>
+        <w:tc>
+          <w:tcPr/>
+          <w:p>
+            <w:pPr>
+              <w:pStyle w:val="Compact"/>
+            </w:pPr>
+            <w:r>
+              <w:t xml:space="preserve">2→2</w:t>
+            </w:r>
+          </w:p>
+        </w:tc>
+        <w:tc>
+          <w:tcPr/>
+          <w:p>
+            <w:pPr>
+              <w:pStyle w:val="Compact"/>
+            </w:pPr>
+            <w:r>
+              <w:t xml:space="preserve">2→1</w:t>
+            </w:r>
+          </w:p>
+        </w:tc>
+        <w:tc>
+          <w:tcPr/>
+          <w:p>
+            <w:pPr>
+              <w:pStyle w:val="Compact"/>
+            </w:pPr>
+            <w:r>
+              <w:t xml:space="preserve">3.25</w:t>
+            </w:r>
+          </w:p>
+        </w:tc>
+        <w:tc>
+          <w:tcPr/>
+          <w:p>
+            <w:pPr>
+              <w:pStyle w:val="Compact"/>
+            </w:pPr>
+            <w:r>
+              <w:t xml:space="preserve">3.05</w:t>
+            </w:r>
+          </w:p>
+        </w:tc>
+      </w:tr>
+      <w:tr>
+        <w:tc>
+          <w:tcPr/>
+          <w:p>
+            <w:pPr>
+              <w:pStyle w:val="Compact"/>
+            </w:pPr>
+            <w:r>
+              <w:t xml:space="preserve">FIX</w:t>
+            </w:r>
+          </w:p>
+        </w:tc>
+        <w:tc>
+          <w:tcPr/>
+          <w:p>
+            <w:pPr>
+              <w:pStyle w:val="Compact"/>
+            </w:pPr>
+            <w:r>
+              <w:t xml:space="preserve">3→3</w:t>
+            </w:r>
+          </w:p>
+        </w:tc>
+        <w:tc>
+          <w:tcPr/>
+          <w:p>
+            <w:pPr>
+              <w:pStyle w:val="Compact"/>
+            </w:pPr>
+            <w:r>
+              <w:t xml:space="preserve">3→3</w:t>
+            </w:r>
+          </w:p>
+        </w:tc>
+        <w:tc>
+          <w:tcPr/>
+          <w:p>
+            <w:pPr>
+              <w:pStyle w:val="Compact"/>
+            </w:pPr>
+            <w:r>
+              <w:t xml:space="preserve">3.05</w:t>
+            </w:r>
+          </w:p>
+        </w:tc>
+        <w:tc>
+          <w:tcPr/>
+          <w:p>
+            <w:pPr>
+              <w:pStyle w:val="Compact"/>
+            </w:pPr>
+            <w:r>
+              <w:t xml:space="preserve">3.05</w:t>
+            </w:r>
+          </w:p>
+        </w:tc>
+      </w:tr>
+      <w:tr>
+        <w:tc>
+          <w:tcPr/>
+          <w:p>
+            <w:pPr>
+              <w:pStyle w:val="Compact"/>
+            </w:pPr>
+            <w:r>
+              <w:t xml:space="preserve">GMED</w:t>
+            </w:r>
+          </w:p>
+        </w:tc>
+        <w:tc>
+          <w:tcPr/>
+          <w:p>
+            <w:pPr>
+              <w:pStyle w:val="Compact"/>
+            </w:pPr>
+            <w:r>
+              <w:t xml:space="preserve">3→3</w:t>
+            </w:r>
+          </w:p>
+        </w:tc>
+        <w:tc>
+          <w:tcPr/>
+          <w:p>
+            <w:pPr>
+              <w:pStyle w:val="Compact"/>
+            </w:pPr>
+            <w:r>
+              <w:t xml:space="preserve">3→3</w:t>
+            </w:r>
+          </w:p>
+        </w:tc>
+        <w:tc>
+          <w:tcPr/>
+          <w:p>
+            <w:pPr>
+              <w:pStyle w:val="Compact"/>
+            </w:pPr>
+            <w:r>
+              <w:t xml:space="preserve">2.95</w:t>
+            </w:r>
+          </w:p>
+        </w:tc>
+        <w:tc>
+          <w:tcPr/>
+          <w:p>
+            <w:pPr>
+              <w:pStyle w:val="Compact"/>
+            </w:pPr>
+            <w:r>
+              <w:t xml:space="preserve">2.95</w:t>
+            </w:r>
+          </w:p>
+        </w:tc>
+      </w:tr>
+      <w:tr>
+        <w:tc>
+          <w:tcPr/>
+          <w:p>
+            <w:pPr>
+              <w:pStyle w:val="Compact"/>
+            </w:pPr>
+            <w:r>
+              <w:t xml:space="preserve">CRWD</w:t>
+            </w:r>
+          </w:p>
+        </w:tc>
+        <w:tc>
+          <w:tcPr/>
+          <w:p>
+            <w:pPr>
+              <w:pStyle w:val="Compact"/>
+            </w:pPr>
+            <w:r>
+              <w:t xml:space="preserve">2→3</w:t>
+            </w:r>
+          </w:p>
+        </w:tc>
+        <w:tc>
+          <w:tcPr/>
+          <w:p>
+            <w:pPr>
+              <w:pStyle w:val="Compact"/>
+            </w:pPr>
+            <w:r>
+              <w:t xml:space="preserve">1→1</w:t>
+            </w:r>
+          </w:p>
+        </w:tc>
+        <w:tc>
+          <w:tcPr/>
+          <w:p>
+            <w:pPr>
+              <w:pStyle w:val="Compact"/>
+            </w:pPr>
+            <w:r>
+              <w:t xml:space="preserve">2.80</w:t>
+            </w:r>
+          </w:p>
+        </w:tc>
+        <w:tc>
+          <w:tcPr/>
+          <w:p>
+            <w:pPr>
+              <w:pStyle w:val="Compact"/>
+            </w:pPr>
+            <w:r>
+              <w:t xml:space="preserve">2.95</w:t>
+            </w:r>
+          </w:p>
+        </w:tc>
+      </w:tr>
+      <w:tr>
+        <w:tc>
+          <w:tcPr/>
+          <w:p>
+            <w:pPr>
+              <w:pStyle w:val="Compact"/>
+            </w:pPr>
+            <w:r>
+              <w:t xml:space="preserve">SNOW</w:t>
+            </w:r>
+          </w:p>
+        </w:tc>
+        <w:tc>
+          <w:tcPr/>
+          <w:p>
+            <w:pPr>
+              <w:pStyle w:val="Compact"/>
+            </w:pPr>
+            <w:r>
+              <w:t xml:space="preserve">2→3</w:t>
+            </w:r>
+          </w:p>
+        </w:tc>
+        <w:tc>
+          <w:tcPr/>
+          <w:p>
+            <w:pPr>
+              <w:pStyle w:val="Compact"/>
+            </w:pPr>
+            <w:r>
+              <w:t xml:space="preserve">1→1</w:t>
+            </w:r>
+          </w:p>
+        </w:tc>
+        <w:tc>
+          <w:tcPr/>
+          <w:p>
+            <w:pPr>
+              <w:pStyle w:val="Compact"/>
+            </w:pPr>
+            <w:r>
+              <w:t xml:space="preserve">2.70</w:t>
+            </w:r>
+          </w:p>
+        </w:tc>
+        <w:tc>
+          <w:tcPr/>
+          <w:p>
+            <w:pPr>
+              <w:pStyle w:val="Compact"/>
+            </w:pPr>
+            <w:r>
+              <w:t xml:space="preserve">2.85</w:t>
+            </w:r>
+          </w:p>
+        </w:tc>
+      </w:tr>
+      <w:tr>
+        <w:tc>
+          <w:tcPr/>
+          <w:p>
+            <w:pPr>
+              <w:pStyle w:val="Compact"/>
+            </w:pPr>
+            <w:r>
+              <w:t xml:space="preserve">VRT</w:t>
+            </w:r>
+          </w:p>
+        </w:tc>
+        <w:tc>
+          <w:tcPr/>
+          <w:p>
+            <w:pPr>
+              <w:pStyle w:val="Compact"/>
+            </w:pPr>
+            <w:r>
+              <w:t xml:space="preserve">1→2</w:t>
+            </w:r>
+          </w:p>
+        </w:tc>
+        <w:tc>
+          <w:tcPr/>
+          <w:p>
+            <w:pPr>
+              <w:pStyle w:val="Compact"/>
+            </w:pPr>
+            <w:r>
+              <w:t xml:space="preserve">4→3</w:t>
+            </w:r>
+          </w:p>
+        </w:tc>
+        <w:tc>
+          <w:tcPr/>
+          <w:p>
+            <w:pPr>
+              <w:pStyle w:val="Compact"/>
+            </w:pPr>
+            <w:r>
+              <w:t xml:space="preserve">2.85</w:t>
+            </w:r>
+          </w:p>
+        </w:tc>
+        <w:tc>
+          <w:tcPr/>
+          <w:p>
+            <w:pPr>
+              <w:pStyle w:val="Compact"/>
+            </w:pPr>
+            <w:r>
+              <w:t xml:space="preserve">2.80</w:t>
+            </w:r>
+          </w:p>
+        </w:tc>
+      </w:tr>
+      <w:tr>
+        <w:tc>
+          <w:tcPr/>
+          <w:p>
+            <w:pPr>
+              <w:pStyle w:val="Compact"/>
+            </w:pPr>
+            <w:r>
+              <w:t xml:space="preserve">KR</w:t>
+            </w:r>
+          </w:p>
+        </w:tc>
+        <w:tc>
+          <w:tcPr/>
+          <w:p>
+            <w:pPr>
+              <w:pStyle w:val="Compact"/>
+            </w:pPr>
+            <w:r>
+              <w:t xml:space="preserve">4→4</w:t>
+            </w:r>
+          </w:p>
+        </w:tc>
+        <w:tc>
+          <w:tcPr/>
+          <w:p>
+            <w:pPr>
+              <w:pStyle w:val="Compact"/>
+            </w:pPr>
+            <w:r>
+              <w:t xml:space="preserve">4→4</w:t>
+            </w:r>
+          </w:p>
+        </w:tc>
+        <w:tc>
+          <w:tcPr/>
+          <w:p>
+            <w:pPr>
+              <w:pStyle w:val="Compact"/>
+            </w:pPr>
+            <w:r>
+              <w:t xml:space="preserve">2.70</w:t>
+            </w:r>
+          </w:p>
+        </w:tc>
+        <w:tc>
+          <w:tcPr/>
+          <w:p>
+            <w:pPr>
+              <w:pStyle w:val="Compact"/>
+            </w:pPr>
+            <w:r>
+              <w:t xml:space="preserve">2.70</w:t>
+            </w:r>
+          </w:p>
+        </w:tc>
+      </w:tr>
+      <w:tr>
+        <w:tc>
+          <w:tcPr/>
+          <w:p>
+            <w:pPr>
+              <w:pStyle w:val="Compact"/>
+            </w:pPr>
+            <w:r>
+              <w:t xml:space="preserve">STRL</w:t>
+            </w:r>
+          </w:p>
+        </w:tc>
+        <w:tc>
+          <w:tcPr/>
+          <w:p>
+            <w:pPr>
+              <w:pStyle w:val="Compact"/>
+            </w:pPr>
+            <w:r>
+              <w:t xml:space="preserve">1→2</w:t>
+            </w:r>
+          </w:p>
+        </w:tc>
+        <w:tc>
+          <w:tcPr/>
+          <w:p>
+            <w:pPr>
+              <w:pStyle w:val="Compact"/>
+            </w:pPr>
+            <w:r>
+              <w:t xml:space="preserve">3→3</w:t>
+            </w:r>
+          </w:p>
+        </w:tc>
+        <w:tc>
+          <w:tcPr/>
+          <w:p>
+            <w:pPr>
+              <w:pStyle w:val="Compact"/>
+            </w:pPr>
+            <w:r>
+              <w:t xml:space="preserve">2.55</w:t>
+            </w:r>
+          </w:p>
+        </w:tc>
+        <w:tc>
+          <w:tcPr/>
+          <w:p>
+            <w:pPr>
+              <w:pStyle w:val="Compact"/>
+            </w:pPr>
+            <w:r>
+              <w:t xml:space="preserve">2.70</w:t>
+            </w:r>
+          </w:p>
+        </w:tc>
+      </w:tr>
+      <w:tr>
+        <w:tc>
+          <w:tcPr/>
+          <w:p>
+            <w:pPr>
+              <w:pStyle w:val="Compact"/>
+            </w:pPr>
+            <w:r>
+              <w:t xml:space="preserve">GS</w:t>
+            </w:r>
+          </w:p>
+        </w:tc>
+        <w:tc>
+          <w:tcPr/>
+          <w:p>
+            <w:pPr>
+              <w:pStyle w:val="Compact"/>
+            </w:pPr>
+            <w:r>
+              <w:t xml:space="preserve">2→3</w:t>
+            </w:r>
+          </w:p>
+        </w:tc>
+        <w:tc>
+          <w:tcPr/>
+          <w:p>
+            <w:pPr>
+              <w:pStyle w:val="Compact"/>
+            </w:pPr>
+            <w:r>
+              <w:t xml:space="preserve">3→3</w:t>
+            </w:r>
+          </w:p>
+        </w:tc>
+        <w:tc>
+          <w:tcPr/>
+          <w:p>
+            <w:pPr>
+              <w:pStyle w:val="Compact"/>
+            </w:pPr>
+            <w:r>
+              <w:t xml:space="preserve">1.95</w:t>
+            </w:r>
+          </w:p>
+        </w:tc>
+        <w:tc>
+          <w:tcPr/>
+          <w:p>
+            <w:pPr>
+              <w:pStyle w:val="Compact"/>
+            </w:pPr>
+            <w:r>
+              <w:t xml:space="preserve">2.10</w:t>
+            </w:r>
+          </w:p>
+        </w:tc>
+      </w:tr>
+      <w:tr>
+        <w:tc>
+          <w:tcPr/>
+          <w:p>
+            <w:pPr>
+              <w:pStyle w:val="Compact"/>
+            </w:pPr>
+            <w:r>
+              <w:t xml:space="preserve">CCL</w:t>
+            </w:r>
+          </w:p>
+        </w:tc>
+        <w:tc>
+          <w:tcPr/>
+          <w:p>
+            <w:pPr>
+              <w:pStyle w:val="Compact"/>
+            </w:pPr>
+            <w:r>
+              <w:t xml:space="preserve">1→1</w:t>
+            </w:r>
+          </w:p>
+        </w:tc>
+        <w:tc>
+          <w:tcPr/>
+          <w:p>
+            <w:pPr>
+              <w:pStyle w:val="Compact"/>
+            </w:pPr>
+            <w:r>
+              <w:t xml:space="preserve">4→4</w:t>
+            </w:r>
+          </w:p>
+        </w:tc>
+        <w:tc>
+          <w:tcPr/>
+          <w:p>
+            <w:pPr>
+              <w:pStyle w:val="Compact"/>
+            </w:pPr>
+            <w:r>
+              <w:t xml:space="preserve">1.90</w:t>
+            </w:r>
+          </w:p>
+        </w:tc>
+        <w:tc>
+          <w:tcPr/>
+          <w:p>
+            <w:pPr>
+              <w:pStyle w:val="Compact"/>
+            </w:pPr>
+            <w:r>
+              <w:t xml:space="preserve">1.90</w:t>
+            </w:r>
+          </w:p>
+        </w:tc>
+      </w:tr>
+    </w:tbl>
+    <w:p>
+      <w:pPr>
+        <w:pStyle w:val="BodyText"/>
+      </w:pPr>
+      <w:r>
+        <w:rPr>
+          <w:b/>
+          <w:bCs/>
+        </w:rPr>
+        <w:t xml:space="preserve">Rule-based V3 basket: TRV, JPM, VLO, THC and MU</w:t>
+      </w:r>
+      <w:r>
+        <w:t xml:space="preserve">, average 3.62. The caps work as before (two Financials, at most two AI-capex names). DELL (3.45) is the next name in.</w:t>
+      </w:r>
+    </w:p>
+    <w:p>
+      <w:pPr>
+        <w:pStyle w:val="BodyText"/>
+      </w:pPr>
+      <w:r>
+        <w:rPr>
+          <w:b/>
+          <w:bCs/>
+        </w:rPr>
+        <w:t xml:space="preserve">How stable it is.</w:t>
+      </w:r>
+      <w:r>
+        <w:t xml:space="preserve"> </w:t>
+      </w:r>
+      <w:r>
+        <w:t xml:space="preserve">Under the same random-perturbation test as V2, selection frequencies are TRV 86%, JPM 84%, VLO 72%, THC 52%, MU 44%, CVE 39%, ANET 28%, DELL 26%, APH 23% and NVDA 11%. The exact V3 basket appears in only 4.2% of runs. Moving one factor weight by 5 points changes the basket in 7 of 12 cases, usually by bringing in DELL.</w:t>
+      </w:r>
+    </w:p>
+    <w:p>
+      <w:pPr>
+        <w:pStyle w:val="BodyText"/>
+      </w:pPr>
+      <w:r>
+        <w:rPr>
+          <w:b/>
+          <w:bCs/>
+        </w:rPr>
+        <w:t xml:space="preserve">Alternative baskets, none privileged:</w:t>
+      </w:r>
+    </w:p>
+    <w:tbl>
+      <w:tblPr>
+        <w:tblStyle w:val="Table"/>
+        <w:tblW w:type="auto" w:w="0"/>
+        <w:tblLook w:firstRow="1" w:lastRow="0" w:firstColumn="0" w:lastColumn="0" w:noHBand="0" w:noVBand="0" w:val="0020"/>
+      </w:tblPr>
+      <w:tblGrid>
+        <w:gridCol w:w="2640"/>
+        <w:gridCol w:w="2640"/>
+        <w:gridCol w:w="2640"/>
+      </w:tblGrid>
+      <w:tr>
+        <w:trPr>
+          <w:tblHeader w:val="on"/>
+        </w:trPr>
+        <w:tc>
+          <w:tcPr/>
+          <w:p>
+            <w:pPr>
+              <w:pStyle w:val="Compact"/>
+            </w:pPr>
+            <w:r>
+              <w:t xml:space="preserve">Basket</w:t>
+            </w:r>
+          </w:p>
+        </w:tc>
+        <w:tc>
+          <w:tcPr/>
+          <w:p>
+            <w:pPr>
+              <w:pStyle w:val="Compact"/>
+            </w:pPr>
+            <w:r>
+              <w:t xml:space="preserve">Names</w:t>
+            </w:r>
+          </w:p>
+        </w:tc>
+        <w:tc>
+          <w:tcPr/>
+          <w:p>
+            <w:pPr>
+              <w:pStyle w:val="Compact"/>
+            </w:pPr>
+            <w:r>
+              <w:t xml:space="preserve">When it applies</w:t>
+            </w:r>
+          </w:p>
+        </w:tc>
+      </w:tr>
+      <w:tr>
+        <w:tc>
+          <w:tcPr/>
+          <w:p>
+            <w:pPr>
+              <w:pStyle w:val="Compact"/>
+            </w:pPr>
+            <w:r>
+              <w:t xml:space="preserve">V3 rule-based</w:t>
+            </w:r>
+          </w:p>
+        </w:tc>
+        <w:tc>
+          <w:tcPr/>
+          <w:p>
+            <w:pPr>
+              <w:pStyle w:val="Compact"/>
+            </w:pPr>
+            <w:r>
+              <w:t xml:space="preserve">TRV, JPM, VLO, THC, MU</w:t>
+            </w:r>
+          </w:p>
+        </w:tc>
+        <w:tc>
+          <w:tcPr/>
+          <w:p>
+            <w:pPr>
+              <w:pStyle w:val="Compact"/>
+            </w:pPr>
+            <w:r>
+              <w:t xml:space="preserve">The scorecard as written, with consistent risk and catalyst rules</w:t>
+            </w:r>
+          </w:p>
+        </w:tc>
+      </w:tr>
+      <w:tr>
+        <w:tc>
+          <w:tcPr/>
+          <w:p>
+            <w:pPr>
+              <w:pStyle w:val="Compact"/>
+            </w:pPr>
+            <w:r>
+              <w:t xml:space="preserve">V3 with NVDA date confirmed</w:t>
+            </w:r>
+          </w:p>
+        </w:tc>
+        <w:tc>
+          <w:tcPr/>
+          <w:p>
+            <w:pPr>
+              <w:pStyle w:val="Compact"/>
+            </w:pPr>
+            <w:r>
+              <w:t xml:space="preserve">TRV, JPM, VLO, THC, NVDA</w:t>
+            </w:r>
+          </w:p>
+        </w:tc>
+        <w:tc>
+          <w:tcPr/>
+          <w:p>
+            <w:pPr>
+              <w:pStyle w:val="Compact"/>
+            </w:pPr>
+            <w:r>
+              <w:t xml:space="preserve">If NVIDIA itself announces a report on or before Nov 20 (catalyst 4, score 3.65). Putting NVDA in the typical risk class alone (3.40) is not enough</w:t>
+            </w:r>
+          </w:p>
+        </w:tc>
+      </w:tr>
+      <w:tr>
+        <w:tc>
+          <w:tcPr/>
+          <w:p>
+            <w:pPr>
+              <w:pStyle w:val="Compact"/>
+            </w:pPr>
+            <w:r>
+              <w:t xml:space="preserve">V2 judgment basket</w:t>
+            </w:r>
+          </w:p>
+        </w:tc>
+        <w:tc>
+          <w:tcPr/>
+          <w:p>
+            <w:pPr>
+              <w:pStyle w:val="Compact"/>
+            </w:pPr>
+            <w:r>
+              <w:t xml:space="preserve">NVDA, TRV, APH, JPM, THC</w:t>
+            </w:r>
+          </w:p>
+        </w:tc>
+        <w:tc>
+          <w:tcPr/>
+          <w:p>
+            <w:pPr>
+              <w:pStyle w:val="Compact"/>
+            </w:pPr>
+            <w:r>
+              <w:t xml:space="preserve">Relies on NVDA's undefined risk score of 4 and the APH-for-ANET override</w:t>
+            </w:r>
+          </w:p>
+        </w:tc>
+      </w:tr>
+    </w:tbl>
+    <w:p>
+      <w:pPr>
+        <w:pStyle w:val="BodyText"/>
+      </w:pPr>
+      <w:r>
+        <w:rPr>
+          <w:b/>
+          <w:bCs/>
+        </w:rPr>
+        <w:t xml:space="preserve">What V3 changes about the risk profile.</w:t>
+      </w:r>
+      <w:r>
+        <w:t xml:space="preserve"> </w:t>
+      </w:r>
+      <w:r>
+        <w:t xml:space="preserve">The V2 basket had no oil exposure. V3 adds VLO, which the notes identify as a Hormuz-deal loser: refiners are at a historic extreme and the notes' own provisional risk score was 1. The V3 rule does not penalize geopolitical event risk that isn't tied to a dated print, which is a limitation of the rule. V3 also adds MU, a ±10% binary report on day 3, which V2 had called contrary to a risk-aware brief. The rule already scores MU's risk at 1, and it still qualifies on revisions, catalyst and momentum.</w:t>
+      </w:r>
+    </w:p>
+    <w:bookmarkStart w:id="60" w:name="Xd324877cc94b65387f12a3700a455e37abf89c9"/>
+    <w:p>
+      <w:pPr>
+        <w:pStyle w:val="Heading3"/>
+      </w:pPr>
+      <w:r>
+        <w:t xml:space="preserve">VLO: record refining margins with a Hormuz clock</w:t>
+      </w:r>
+    </w:p>
+    <w:p>
+      <w:pPr>
+        <w:pStyle w:val="Compact"/>
+        <w:numPr>
+          <w:ilvl w:val="0"/>
+          <w:numId w:val="1005"/>
+        </w:numPr>
+      </w:pPr>
+      <w:r>
+        <w:rPr>
+          <w:b/>
+          <w:bCs/>
+        </w:rPr>
+        <w:t xml:space="preserve">Data.</w:t>
+      </w:r>
+      <w:r>
+        <w:t xml:space="preserve"> </w:t>
+      </w:r>
+      <w:r>
+        <w:t xml:space="preserve">$382.86 at the Sep 24 close, about 8.6% below its $419.04 high. Consensus EPS up 20.6% in 30 days with no cuts; Zacks #1. Q2 refining margin $23.62/bbl vs $12.35 a year earlier (</w:t>
+      </w:r>
+      <w:hyperlink r:id="rId56">
+        <w:r>
+          <w:rPr>
+            <w:rStyle w:val="Hyperlink"/>
+          </w:rPr>
+          <w:t xml:space="preserve">VLO 10-Q</w:t>
+        </w:r>
+      </w:hyperlink>
+      <w:r>
+        <w:t xml:space="preserve">).</w:t>
+      </w:r>
+    </w:p>
+    <w:p>
+      <w:pPr>
+        <w:pStyle w:val="Compact"/>
+        <w:numPr>
+          <w:ilvl w:val="0"/>
+          <w:numId w:val="1005"/>
+        </w:numPr>
+      </w:pPr>
+      <w:r>
+        <w:rPr>
+          <w:b/>
+          <w:bCs/>
+        </w:rPr>
+        <w:t xml:space="preserve">Catalyst.</w:t>
+      </w:r>
+      <w:r>
+        <w:t xml:space="preserve"> </w:t>
+      </w:r>
+      <w:r>
+        <w:t xml:space="preserve">Q3 results on</w:t>
+      </w:r>
+      <w:r>
+        <w:t xml:space="preserve"> </w:t>
+      </w:r>
+      <w:r>
+        <w:rPr>
+          <w:b/>
+          <w:bCs/>
+        </w:rPr>
+        <w:t xml:space="preserve">Thu Oct 22</w:t>
+      </w:r>
+      <w:r>
+        <w:t xml:space="preserve">, announced by the company (</w:t>
+      </w:r>
+      <w:hyperlink r:id="rId57">
+        <w:r>
+          <w:rPr>
+            <w:rStyle w:val="Hyperlink"/>
+          </w:rPr>
+          <w:t xml:space="preserve">BusinessWire</w:t>
+        </w:r>
+      </w:hyperlink>
+      <w:r>
+        <w:t xml:space="preserve">).</w:t>
+      </w:r>
+    </w:p>
+    <w:p>
+      <w:pPr>
+        <w:pStyle w:val="Compact"/>
+        <w:numPr>
+          <w:ilvl w:val="0"/>
+          <w:numId w:val="1005"/>
+        </w:numPr>
+      </w:pPr>
+      <w:r>
+        <w:rPr>
+          <w:b/>
+          <w:bCs/>
+        </w:rPr>
+        <w:t xml:space="preserve">Bear case.</w:t>
+      </w:r>
+      <w:r>
+        <w:t xml:space="preserve"> </w:t>
+      </w:r>
+      <w:r>
+        <w:t xml:space="preserve">The 3-2-1 crack is about $64–70 against a ~$19 long-run median, and futures price it about 35% lower a year out. The last five times refiners stood this far above their 150-day average, six-month returns were negative every time, averaging −10.1% (</w:t>
+      </w:r>
+      <w:hyperlink r:id="rId58">
+        <w:r>
+          <w:rPr>
+            <w:rStyle w:val="Hyperlink"/>
+          </w:rPr>
+          <w:t xml:space="preserve">CNBC</w:t>
+        </w:r>
+      </w:hyperlink>
+      <w:r>
+        <w:t xml:space="preserve">). Jefferies downgraded it to Hold on Sep 22 (</w:t>
+      </w:r>
+      <w:hyperlink r:id="rId59">
+        <w:r>
+          <w:rPr>
+            <w:rStyle w:val="Hyperlink"/>
+          </w:rPr>
+          <w:t xml:space="preserve">Investing.com</w:t>
+        </w:r>
+      </w:hyperlink>
+      <w:r>
+        <w:t xml:space="preserve">). On the June Hormuz deal it fell 7.6%.</w:t>
+      </w:r>
+    </w:p>
+    <w:p>
+      <w:pPr>
+        <w:pStyle w:val="Compact"/>
+        <w:numPr>
+          <w:ilvl w:val="0"/>
+          <w:numId w:val="1005"/>
+        </w:numPr>
+      </w:pPr>
+      <w:r>
+        <w:rPr>
+          <w:b/>
+          <w:bCs/>
+        </w:rPr>
+        <w:t xml:space="preserve">What proves it wrong.</w:t>
+      </w:r>
+      <w:r>
+        <w:t xml:space="preserve"> </w:t>
+      </w:r>
+      <w:r>
+        <w:t xml:space="preserve">Confirmed tanker transits through Hormuz under a deal that holds, or the prompt 3-2-1 crack falling below about $45.</w:t>
+      </w:r>
+    </w:p>
+    <w:bookmarkEnd w:id="60"/>
+    <w:bookmarkStart w:id="61" w:name="Xc4472982ce1431a773ce52474b637ebe1c1e29c"/>
+    <w:p>
+      <w:pPr>
+        <w:pStyle w:val="Heading3"/>
+      </w:pPr>
+      <w:r>
+        <w:t xml:space="preserve">MU: the biggest revisions, decided on day 3</w:t>
+      </w:r>
+    </w:p>
+    <w:p>
+      <w:pPr>
+        <w:pStyle w:val="Compact"/>
+        <w:numPr>
+          <w:ilvl w:val="0"/>
+          <w:numId w:val="1006"/>
+        </w:numPr>
+      </w:pPr>
+      <w:r>
+        <w:rPr>
+          <w:b/>
+          <w:bCs/>
+        </w:rPr>
+        <w:t xml:space="preserve">Data.</w:t>
+      </w:r>
+      <w:r>
+        <w:t xml:space="preserve"> </w:t>
+      </w:r>
+      <w:r>
+        <w:t xml:space="preserve">$1,082.28 on Sep 25, about 13.8% below its $1,255 high and up about 256–270% YTD. Consensus FQ4 EPS about $31, revenue about $50.6B.</w:t>
+      </w:r>
+    </w:p>
+    <w:p>
+      <w:pPr>
+        <w:pStyle w:val="Compact"/>
+        <w:numPr>
+          <w:ilvl w:val="0"/>
+          <w:numId w:val="1006"/>
+        </w:numPr>
+      </w:pPr>
+      <w:r>
+        <w:rPr>
+          <w:b/>
+          <w:bCs/>
+        </w:rPr>
+        <w:t xml:space="preserve">Catalyst.</w:t>
+      </w:r>
+      <w:r>
+        <w:t xml:space="preserve"> </w:t>
+      </w:r>
+      <w:r>
+        <w:t xml:space="preserve">FQ4 results on</w:t>
+      </w:r>
+      <w:r>
+        <w:t xml:space="preserve"> </w:t>
+      </w:r>
+      <w:r>
+        <w:rPr>
+          <w:b/>
+          <w:bCs/>
+        </w:rPr>
+        <w:t xml:space="preserve">Wed Sep 30 after the close</w:t>
+      </w:r>
+      <w:r>
+        <w:t xml:space="preserve">, announced by the company. Options imply about ±10% (</w:t>
+      </w:r>
+      <w:hyperlink r:id="rId40">
+        <w:r>
+          <w:rPr>
+            <w:rStyle w:val="Hyperlink"/>
+          </w:rPr>
+          <w:t xml:space="preserve">TipRanks</w:t>
+        </w:r>
+      </w:hyperlink>
+      <w:r>
+        <w:t xml:space="preserve">).</w:t>
+      </w:r>
+    </w:p>
+    <w:p>
+      <w:pPr>
+        <w:pStyle w:val="Compact"/>
+        <w:numPr>
+          <w:ilvl w:val="0"/>
+          <w:numId w:val="1006"/>
+        </w:numPr>
+      </w:pPr>
+      <w:r>
+        <w:rPr>
+          <w:b/>
+          <w:bCs/>
+        </w:rPr>
+        <w:t xml:space="preserve">Bear case.</w:t>
+      </w:r>
+      <w:r>
+        <w:t xml:space="preserve"> </w:t>
+      </w:r>
+      <w:r>
+        <w:t xml:space="preserve">Management already flagged "a meaningful moderation in the rate of price increases" with gross margin at a record ~86%. An Evercore analyst says memory prices "appear to be peaking." A low P/E on peak earnings is a late-cycle signal, not valuation room.</w:t>
+      </w:r>
+    </w:p>
+    <w:p>
+      <w:pPr>
+        <w:pStyle w:val="Compact"/>
+        <w:numPr>
+          <w:ilvl w:val="0"/>
+          <w:numId w:val="1006"/>
+        </w:numPr>
+      </w:pPr>
+      <w:r>
+        <w:rPr>
+          <w:b/>
+          <w:bCs/>
+        </w:rPr>
+        <w:t xml:space="preserve">What proves it wrong.</w:t>
+      </w:r>
+      <w:r>
+        <w:t xml:space="preserve"> </w:t>
+      </w:r>
+      <w:r>
+        <w:t xml:space="preserve">A next-quarter guide showing flat pricing or falling gross margin, or the stock trading below about $950 in the days after the print.</w:t>
+      </w:r>
+    </w:p>
+    <w:bookmarkEnd w:id="61"/>
+    <w:bookmarkEnd w:id="62"/>
+    <w:bookmarkStart w:id="116" w:name="detailed-write-ups-for-the-v2-picks"/>
+    <w:p>
+      <w:pPr>
+        <w:pStyle w:val="Heading2"/>
+      </w:pPr>
+      <w:r>
+        <w:t xml:space="preserve">Detailed write-ups for the V2 picks</w:t>
+      </w:r>
+    </w:p>
+    <w:p>
+      <w:pPr>
+        <w:pStyle w:val="FirstParagraph"/>
+      </w:pPr>
+      <w:r>
+        <w:t xml:space="preserve">TRV, JPM and THC are in both baskets. NVDA and APH are V2-only picks and are kept for comparison.</w:t>
       </w:r>
     </w:p>
     <w:tbl>
@@ -6145,7 +8008,7 @@
             <w:pPr>
               <w:pStyle w:val="Compact"/>
             </w:pPr>
-            <w:hyperlink r:id="rId56">
+            <w:hyperlink r:id="rId63">
               <w:r>
                 <w:rPr>
                   <w:rStyle w:val="Hyperlink"/>
@@ -6218,7 +8081,7 @@
             <w:pPr>
               <w:pStyle w:val="Compact"/>
             </w:pPr>
-            <w:hyperlink r:id="rId57">
+            <w:hyperlink r:id="rId64">
               <w:r>
                 <w:rPr>
                   <w:rStyle w:val="Hyperlink"/>
@@ -6291,7 +8154,7 @@
             <w:pPr>
               <w:pStyle w:val="Compact"/>
             </w:pPr>
-            <w:hyperlink r:id="rId58">
+            <w:hyperlink r:id="rId65">
               <w:r>
                 <w:rPr>
                   <w:rStyle w:val="Hyperlink"/>
@@ -6305,7 +8168,7 @@
             <w:r>
               <w:t xml:space="preserve"> </w:t>
             </w:r>
-            <w:hyperlink r:id="rId59">
+            <w:hyperlink r:id="rId66">
               <w:r>
                 <w:rPr>
                   <w:rStyle w:val="Hyperlink"/>
@@ -6378,7 +8241,7 @@
             <w:pPr>
               <w:pStyle w:val="Compact"/>
             </w:pPr>
-            <w:hyperlink r:id="rId60">
+            <w:hyperlink r:id="rId67">
               <w:r>
                 <w:rPr>
                   <w:rStyle w:val="Hyperlink"/>
@@ -6392,7 +8255,7 @@
             <w:r>
               <w:t xml:space="preserve"> </w:t>
             </w:r>
-            <w:hyperlink r:id="rId61">
+            <w:hyperlink r:id="rId68">
               <w:r>
                 <w:rPr>
                   <w:rStyle w:val="Hyperlink"/>
@@ -6465,7 +8328,7 @@
             <w:pPr>
               <w:pStyle w:val="Compact"/>
             </w:pPr>
-            <w:hyperlink r:id="rId62">
+            <w:hyperlink r:id="rId69">
               <w:r>
                 <w:rPr>
                   <w:rStyle w:val="Hyperlink"/>
@@ -6507,7 +8370,7 @@
         <w:t xml:space="preserve">All prices are snippet-sourced and must be re-verified. "n/f" means not found in the notes.</w:t>
       </w:r>
     </w:p>
-    <w:bookmarkStart w:id="74" w:name="Xdaab0caf1efa5c8a7fa875a11e3d429b5c02763"/>
+    <w:bookmarkStart w:id="81" w:name="Xdaab0caf1efa5c8a7fa875a11e3d429b5c02763"/>
     <w:p>
       <w:pPr>
         <w:pStyle w:val="Heading3"/>
@@ -6531,7 +8394,7 @@
         <w:t xml:space="preserve"> </w:t>
       </w:r>
       <w:r>
-        <w:t xml:space="preserve">NVDA combines the strongest absolute revisions in the universe with the least-extended chart among AI leaders. It is the least-crowded way to hold one AI-compute slot.</w:t>
+        <w:t xml:space="preserve">NVDA combines the strongest absolute revisions in the universe with the least-extended chart among AI leaders. Its weak price run means it is the least extended of the AI leaders. That is not evidence of low crowding: semis as a group are the most crowded trade.</w:t>
       </w:r>
     </w:p>
     <w:p>
@@ -6596,7 +8459,7 @@
       <w:r>
         <w:t xml:space="preserve">, about 4% above the Street, and supply commitments rose to $279B from $119B (</w:t>
       </w:r>
-      <w:hyperlink r:id="rId63">
+      <w:hyperlink r:id="rId70">
         <w:r>
           <w:rPr>
             <w:rStyle w:val="Hyperlink"/>
@@ -6610,7 +8473,7 @@
       <w:r>
         <w:t xml:space="preserve"> </w:t>
       </w:r>
-      <w:hyperlink r:id="rId64">
+      <w:hyperlink r:id="rId71">
         <w:r>
           <w:rPr>
             <w:rStyle w:val="Hyperlink"/>
@@ -6621,7 +8484,7 @@
       <w:r>
         <w:t xml:space="preserve">). It is Zacks Rank #1 (</w:t>
       </w:r>
-      <w:hyperlink r:id="rId65">
+      <w:hyperlink r:id="rId72">
         <w:r>
           <w:rPr>
             <w:rStyle w:val="Hyperlink"/>
@@ -6666,7 +8529,7 @@
       <w:r>
         <w:t xml:space="preserve">at the end of August (</w:t>
       </w:r>
-      <w:hyperlink r:id="rId66">
+      <w:hyperlink r:id="rId73">
         <w:r>
           <w:rPr>
             <w:rStyle w:val="Hyperlink"/>
@@ -6729,7 +8592,7 @@
         <w:pStyle w:val="Compact"/>
         <w:numPr>
           <w:ilvl w:val="0"/>
-          <w:numId w:val="1005"/>
+          <w:numId w:val="1007"/>
         </w:numPr>
       </w:pPr>
       <w:r>
@@ -6741,13 +8604,13 @@
         <w:pStyle w:val="Compact"/>
         <w:numPr>
           <w:ilvl w:val="0"/>
-          <w:numId w:val="1005"/>
+          <w:numId w:val="1007"/>
         </w:numPr>
       </w:pPr>
       <w:r>
         <w:t xml:space="preserve">TSMC's Q3 call on Oct 15 (</w:t>
       </w:r>
-      <w:hyperlink r:id="rId67">
+      <w:hyperlink r:id="rId74">
         <w:r>
           <w:rPr>
             <w:rStyle w:val="Hyperlink"/>
@@ -6764,13 +8627,13 @@
         <w:pStyle w:val="Compact"/>
         <w:numPr>
           <w:ilvl w:val="0"/>
-          <w:numId w:val="1005"/>
+          <w:numId w:val="1007"/>
         </w:numPr>
       </w:pPr>
       <w:r>
         <w:t xml:space="preserve">Hyperscaler reports around Oct 27–30. MSFT is expected Oct 28 but is unconfirmed (</w:t>
       </w:r>
-      <w:hyperlink r:id="rId68">
+      <w:hyperlink r:id="rId75">
         <w:r>
           <w:rPr>
             <w:rStyle w:val="Hyperlink"/>
@@ -6787,7 +8650,7 @@
         <w:pStyle w:val="Compact"/>
         <w:numPr>
           <w:ilvl w:val="0"/>
-          <w:numId w:val="1005"/>
+          <w:numId w:val="1007"/>
         </w:numPr>
       </w:pPr>
       <w:r>
@@ -6809,7 +8672,7 @@
       <w:r>
         <w:t xml:space="preserve">after the close, but Investing.com shows Nov 25, outside the window (</w:t>
       </w:r>
-      <w:hyperlink r:id="rId69">
+      <w:hyperlink r:id="rId76">
         <w:r>
           <w:rPr>
             <w:rStyle w:val="Hyperlink"/>
@@ -6823,7 +8686,7 @@
       <w:r>
         <w:t xml:space="preserve"> </w:t>
       </w:r>
-      <w:hyperlink r:id="rId70">
+      <w:hyperlink r:id="rId77">
         <w:r>
           <w:rPr>
             <w:rStyle w:val="Hyperlink"/>
@@ -6852,7 +8715,7 @@
       <w:r>
         <w:t xml:space="preserve">Shares have "stalled" despite $600B of AI capex, because investors doubt that AI revenue scales with spending (</w:t>
       </w:r>
-      <w:hyperlink r:id="rId71">
+      <w:hyperlink r:id="rId78">
         <w:r>
           <w:rPr>
             <w:rStyle w:val="Hyperlink"/>
@@ -6879,7 +8742,7 @@
       <w:r>
         <w:t xml:space="preserve">(</w:t>
       </w:r>
-      <w:hyperlink r:id="rId72">
+      <w:hyperlink r:id="rId79">
         <w:r>
           <w:rPr>
             <w:rStyle w:val="Hyperlink"/>
@@ -6890,7 +8753,7 @@
       <w:r>
         <w:t xml:space="preserve">). On Sep 24, Oracle's force-majeure notice on the New Mexico Stargate site became the first dated crack in AI-capex financing (</w:t>
       </w:r>
-      <w:hyperlink r:id="rId73">
+      <w:hyperlink r:id="rId80">
         <w:r>
           <w:rPr>
             <w:rStyle w:val="Hyperlink"/>
@@ -6919,7 +8782,7 @@
         <w:pStyle w:val="Compact"/>
         <w:numPr>
           <w:ilvl w:val="0"/>
-          <w:numId w:val="1006"/>
+          <w:numId w:val="1008"/>
         </w:numPr>
       </w:pPr>
       <w:r>
@@ -6931,7 +8794,7 @@
         <w:pStyle w:val="Compact"/>
         <w:numPr>
           <w:ilvl w:val="0"/>
-          <w:numId w:val="1006"/>
+          <w:numId w:val="1008"/>
         </w:numPr>
       </w:pPr>
       <w:r>
@@ -6943,7 +8806,7 @@
         <w:pStyle w:val="Compact"/>
         <w:numPr>
           <w:ilvl w:val="0"/>
-          <w:numId w:val="1006"/>
+          <w:numId w:val="1008"/>
         </w:numPr>
       </w:pPr>
       <w:r>
@@ -6963,14 +8826,14 @@
         <w:t xml:space="preserve">, the level before the Aug 26 report. That is about 8.7% below the reference price.</w:t>
       </w:r>
     </w:p>
-    <w:bookmarkEnd w:id="74"/>
-    <w:bookmarkStart w:id="85" w:name="X4871b4c12928ca2c0977976d8a81b529575a380"/>
+    <w:bookmarkEnd w:id="81"/>
+    <w:bookmarkStart w:id="92" w:name="X8c4f78267e28e6c1f603f0e7d5cb585bab61462"/>
     <w:p>
       <w:pPr>
         <w:pStyle w:val="Heading3"/>
       </w:pPr>
       <w:r>
-        <w:t xml:space="preserve">TRV: the quiet hurricane season has not been priced into the chart</w:t>
+        <w:t xml:space="preserve">TRV: estimate revisions from a quiet hurricane season</w:t>
       </w:r>
     </w:p>
     <w:p>
@@ -7021,7 +8884,7 @@
       <w:r>
         <w:t xml:space="preserve">, depending on which Zacks piece is cited (</w:t>
       </w:r>
-      <w:hyperlink r:id="rId75">
+      <w:hyperlink r:id="rId82">
         <w:r>
           <w:rPr>
             <w:rStyle w:val="Hyperlink"/>
@@ -7048,7 +8911,7 @@
       <w:r>
         <w:t xml:space="preserve">(</w:t>
       </w:r>
-      <w:hyperlink r:id="rId76">
+      <w:hyperlink r:id="rId83">
         <w:r>
           <w:rPr>
             <w:rStyle w:val="Hyperlink"/>
@@ -7093,7 +8956,7 @@
       <w:r>
         <w:t xml:space="preserve">but fell 4.51% in the seven days to Sep 24 (</w:t>
       </w:r>
-      <w:hyperlink r:id="rId57">
+      <w:hyperlink r:id="rId64">
         <w:r>
           <w:rPr>
             <w:rStyle w:val="Hyperlink"/>
@@ -7104,7 +8967,7 @@
       <w:r>
         <w:t xml:space="preserve">). The all-time high was $398.70 on Jul 28 (</w:t>
       </w:r>
-      <w:hyperlink r:id="rId77">
+      <w:hyperlink r:id="rId84">
         <w:r>
           <w:rPr>
             <w:rStyle w:val="Hyperlink"/>
@@ -7146,7 +9009,7 @@
       <w:r>
         <w:t xml:space="preserve">, confirmed by the company (</w:t>
       </w:r>
-      <w:hyperlink r:id="rId78">
+      <w:hyperlink r:id="rId85">
         <w:r>
           <w:rPr>
             <w:rStyle w:val="Hyperlink"/>
@@ -7163,13 +9026,13 @@
         <w:pStyle w:val="Compact"/>
         <w:numPr>
           <w:ilvl w:val="0"/>
-          <w:numId w:val="1007"/>
+          <w:numId w:val="1009"/>
         </w:numPr>
       </w:pPr>
       <w:r>
         <w:t xml:space="preserve">The 2026 Atlantic season has been "extremely inactive" (</w:t>
       </w:r>
-      <w:hyperlink r:id="rId79">
+      <w:hyperlink r:id="rId86">
         <w:r>
           <w:rPr>
             <w:rStyle w:val="Hyperlink"/>
@@ -7186,13 +9049,13 @@
         <w:pStyle w:val="Compact"/>
         <w:numPr>
           <w:ilvl w:val="0"/>
-          <w:numId w:val="1007"/>
+          <w:numId w:val="1009"/>
         </w:numPr>
       </w:pPr>
       <w:r>
         <w:t xml:space="preserve">First-half insured catastrophe losses were below trend (</w:t>
       </w:r>
-      <w:hyperlink r:id="rId80">
+      <w:hyperlink r:id="rId87">
         <w:r>
           <w:rPr>
             <w:rStyle w:val="Hyperlink"/>
@@ -7209,13 +9072,13 @@
         <w:pStyle w:val="Compact"/>
         <w:numPr>
           <w:ilvl w:val="0"/>
-          <w:numId w:val="1007"/>
+          <w:numId w:val="1009"/>
         </w:numPr>
       </w:pPr>
       <w:r>
         <w:t xml:space="preserve">Q2 profit rose 46% on lower catastrophe losses (</w:t>
       </w:r>
-      <w:hyperlink r:id="rId81">
+      <w:hyperlink r:id="rId88">
         <w:r>
           <w:rPr>
             <w:rStyle w:val="Hyperlink"/>
@@ -7257,7 +9120,7 @@
       <w:r>
         <w:t xml:space="preserve">. Morgan Stanley and Barclays have Underweight calls, though those predate the July high (</w:t>
       </w:r>
-      <w:hyperlink r:id="rId82">
+      <w:hyperlink r:id="rId89">
         <w:r>
           <w:rPr>
             <w:rStyle w:val="Hyperlink"/>
@@ -7268,7 +9131,7 @@
       <w:r>
         <w:t xml:space="preserve">). Commercial property pricing is softening (</w:t>
       </w:r>
-      <w:hyperlink r:id="rId83">
+      <w:hyperlink r:id="rId90">
         <w:r>
           <w:rPr>
             <w:rStyle w:val="Hyperlink"/>
@@ -7278,327 +9141,6 @@
       </w:hyperlink>
       <w:r>
         <w:t xml:space="preserve">). A headline about storm losses weighing on the shares exists, but we could not verify its date or content (</w:t>
-      </w:r>
-      <w:hyperlink r:id="rId84">
-        <w:r>
-          <w:rPr>
-            <w:rStyle w:val="Hyperlink"/>
-          </w:rPr>
-          <w:t xml:space="preserve">ad-hoc-news</w:t>
-        </w:r>
-      </w:hyperlink>
-      <w:r>
-        <w:t xml:space="preserve">). Higher yields also cut book value through bond marks. The hurricane season runs to Nov 30, so late-season storm risk stays open for the whole window.</w:t>
-      </w:r>
-    </w:p>
-    <w:p>
-      <w:pPr>
-        <w:pStyle w:val="BodyText"/>
-      </w:pPr>
-      <w:r>
-        <w:rPr>
-          <w:b/>
-          <w:bCs/>
-        </w:rPr>
-        <w:t xml:space="preserve">What proves it wrong:</w:t>
-      </w:r>
-    </w:p>
-    <w:p>
-      <w:pPr>
-        <w:pStyle w:val="Compact"/>
-        <w:numPr>
-          <w:ilvl w:val="0"/>
-          <w:numId w:val="1008"/>
-        </w:numPr>
-      </w:pPr>
-      <w:r>
-        <w:t xml:space="preserve">A pre-announced Q3 catastrophe loss above about $600M after tax.</w:t>
-      </w:r>
-    </w:p>
-    <w:p>
-      <w:pPr>
-        <w:pStyle w:val="Compact"/>
-        <w:numPr>
-          <w:ilvl w:val="0"/>
-          <w:numId w:val="1008"/>
-        </w:numPr>
-      </w:pPr>
-      <w:r>
-        <w:t xml:space="preserve">An underlying combined ratio worse than Q2.</w:t>
-      </w:r>
-    </w:p>
-    <w:p>
-      <w:pPr>
-        <w:pStyle w:val="Compact"/>
-        <w:numPr>
-          <w:ilvl w:val="0"/>
-          <w:numId w:val="1008"/>
-        </w:numPr>
-      </w:pPr>
-      <w:r>
-        <w:t xml:space="preserve">Business Insurance renewal premium change falling below low single digits on Oct 16.</w:t>
-      </w:r>
-    </w:p>
-    <w:p>
-      <w:pPr>
-        <w:pStyle w:val="Compact"/>
-        <w:numPr>
-          <w:ilvl w:val="0"/>
-          <w:numId w:val="1008"/>
-        </w:numPr>
-      </w:pPr>
-      <w:r>
-        <w:t xml:space="preserve">A close below</w:t>
-      </w:r>
-      <w:r>
-        <w:t xml:space="preserve"> </w:t>
-      </w:r>
-      <w:r>
-        <w:rPr>
-          <w:b/>
-          <w:bCs/>
-        </w:rPr>
-        <w:t xml:space="preserve">about $350</w:t>
-      </w:r>
-      <w:r>
-        <w:t xml:space="preserve"> </w:t>
-      </w:r>
-      <w:r>
-        <w:t xml:space="preserve">before the report. This level is our inference, only 3.4% below the reference price, so it is noise-prone and should be read alongside the fundamental signals.</w:t>
-      </w:r>
-    </w:p>
-    <w:bookmarkEnd w:id="85"/>
-    <w:bookmarkStart w:id="93" w:name="Xebaa6290fe80fa072f7530588114ef93afcc423"/>
-    <w:p>
-      <w:pPr>
-        <w:pStyle w:val="Heading3"/>
-      </w:pPr>
-      <w:r>
-        <w:t xml:space="preserve">APH: AI interconnect with a diversified floor</w:t>
-      </w:r>
-    </w:p>
-    <w:p>
-      <w:pPr>
-        <w:pStyle w:val="FirstParagraph"/>
-      </w:pPr>
-      <w:r>
-        <w:rPr>
-          <w:b/>
-          <w:bCs/>
-        </w:rPr>
-        <w:t xml:space="preserve">Thesis.</w:t>
-      </w:r>
-      <w:r>
-        <w:t xml:space="preserve"> </w:t>
-      </w:r>
-      <w:r>
-        <w:t xml:space="preserve">APH gives AI-rack exposure with lower relative volatility than pure AI hardware. It has a consistent beat history and a report inside the window.</w:t>
-      </w:r>
-    </w:p>
-    <w:p>
-      <w:pPr>
-        <w:pStyle w:val="BodyText"/>
-      </w:pPr>
-      <w:r>
-        <w:rPr>
-          <w:b/>
-          <w:bCs/>
-        </w:rPr>
-        <w:t xml:space="preserve">Split and price.</w:t>
-      </w:r>
-      <w:r>
-        <w:t xml:space="preserve"> </w:t>
-      </w:r>
-      <w:r>
-        <w:t xml:space="preserve">The $84 price is not stale. APH completed a</w:t>
-      </w:r>
-      <w:r>
-        <w:t xml:space="preserve"> </w:t>
-      </w:r>
-      <w:r>
-        <w:rPr>
-          <w:b/>
-          <w:bCs/>
-        </w:rPr>
-        <w:t xml:space="preserve">2-for-1 split, with split-adjusted trading from Sep 3</w:t>
-      </w:r>
-      <w:r>
-        <w:t xml:space="preserve"> </w:t>
-      </w:r>
-      <w:r>
-        <w:t xml:space="preserve">(</w:t>
-      </w:r>
-      <w:hyperlink r:id="rId86">
-        <w:r>
-          <w:rPr>
-            <w:rStyle w:val="Hyperlink"/>
-          </w:rPr>
-          <w:t xml:space="preserve">EBC</w:t>
-        </w:r>
-      </w:hyperlink>
-      <w:r>
-        <w:t xml:space="preserve">).</w:t>
-      </w:r>
-    </w:p>
-    <w:p>
-      <w:pPr>
-        <w:pStyle w:val="BodyText"/>
-      </w:pPr>
-      <w:r>
-        <w:rPr>
-          <w:b/>
-          <w:bCs/>
-        </w:rPr>
-        <w:t xml:space="preserve">Revisions.</w:t>
-      </w:r>
-    </w:p>
-    <w:p>
-      <w:pPr>
-        <w:pStyle w:val="Compact"/>
-        <w:numPr>
-          <w:ilvl w:val="0"/>
-          <w:numId w:val="1009"/>
-        </w:numPr>
-      </w:pPr>
-      <w:r>
-        <w:t xml:space="preserve">Zacks #1 on a screen requiring the stock to be within 20% of its 52-week high, with the</w:t>
-      </w:r>
-      <w:r>
-        <w:t xml:space="preserve"> </w:t>
-      </w:r>
-      <w:r>
-        <w:rPr>
-          <w:b/>
-          <w:bCs/>
-        </w:rPr>
-        <w:t xml:space="preserve">current-year estimate up 9% in 60 days</w:t>
-      </w:r>
-      <w:r>
-        <w:t xml:space="preserve"> </w:t>
-      </w:r>
-      <w:r>
-        <w:t xml:space="preserve">(</w:t>
-      </w:r>
-      <w:hyperlink r:id="rId87">
-        <w:r>
-          <w:rPr>
-            <w:rStyle w:val="Hyperlink"/>
-          </w:rPr>
-          <w:t xml:space="preserve">Zacks via Yahoo</w:t>
-        </w:r>
-      </w:hyperlink>
-      <w:r>
-        <w:t xml:space="preserve">).</w:t>
-      </w:r>
-    </w:p>
-    <w:p>
-      <w:pPr>
-        <w:pStyle w:val="Compact"/>
-        <w:numPr>
-          <w:ilvl w:val="0"/>
-          <w:numId w:val="1009"/>
-        </w:numPr>
-      </w:pPr>
-      <w:r>
-        <w:t xml:space="preserve">BNP raised its estimates after a management meeting (</w:t>
-      </w:r>
-      <w:hyperlink r:id="rId88">
-        <w:r>
-          <w:rPr>
-            <w:rStyle w:val="Hyperlink"/>
-          </w:rPr>
-          <w:t xml:space="preserve">Seeking Alpha</w:t>
-        </w:r>
-      </w:hyperlink>
-      <w:r>
-        <w:t xml:space="preserve">).</w:t>
-      </w:r>
-    </w:p>
-    <w:p>
-      <w:pPr>
-        <w:pStyle w:val="Compact"/>
-        <w:numPr>
-          <w:ilvl w:val="0"/>
-          <w:numId w:val="1009"/>
-        </w:numPr>
-      </w:pPr>
-      <w:r>
-        <w:t xml:space="preserve">Q2 sales were</w:t>
-      </w:r>
-      <w:r>
-        <w:t xml:space="preserve"> </w:t>
-      </w:r>
-      <w:r>
-        <w:rPr>
-          <w:b/>
-          <w:bCs/>
-        </w:rPr>
-        <w:t xml:space="preserve">$8.8B (about +55%)</w:t>
-      </w:r>
-      <w:r>
-        <w:t xml:space="preserve">, with orders of</w:t>
-      </w:r>
-      <w:r>
-        <w:t xml:space="preserve"> </w:t>
-      </w:r>
-      <w:r>
-        <w:rPr>
-          <w:b/>
-          <w:bCs/>
-        </w:rPr>
-        <w:t xml:space="preserve">$10.7B for a book-to-bill of about 1.2</w:t>
-      </w:r>
-      <w:r>
-        <w:t xml:space="preserve"> </w:t>
-      </w:r>
-      <w:r>
-        <w:t xml:space="preserve">(</w:t>
-      </w:r>
-      <w:hyperlink r:id="rId89">
-        <w:r>
-          <w:rPr>
-            <w:rStyle w:val="Hyperlink"/>
-          </w:rPr>
-          <w:t xml:space="preserve">OptionsTradingReport</w:t>
-        </w:r>
-      </w:hyperlink>
-      <w:r>
-        <w:t xml:space="preserve">).</w:t>
-      </w:r>
-    </w:p>
-    <w:p>
-      <w:pPr>
-        <w:pStyle w:val="Compact"/>
-        <w:numPr>
-          <w:ilvl w:val="0"/>
-          <w:numId w:val="1009"/>
-        </w:numPr>
-      </w:pPr>
-      <w:r>
-        <w:t xml:space="preserve">The June-quarter EPS of $1.35 (pre-split) beat the $1.19 estimate (</w:t>
-      </w:r>
-      <w:hyperlink r:id="rId90">
-        <w:r>
-          <w:rPr>
-            <w:rStyle w:val="Hyperlink"/>
-          </w:rPr>
-          <w:t xml:space="preserve">TipRanks</w:t>
-        </w:r>
-      </w:hyperlink>
-      <w:r>
-        <w:t xml:space="preserve">).</w:t>
-      </w:r>
-    </w:p>
-    <w:p>
-      <w:pPr>
-        <w:pStyle w:val="Compact"/>
-        <w:numPr>
-          <w:ilvl w:val="0"/>
-          <w:numId w:val="1009"/>
-        </w:numPr>
-      </w:pPr>
-      <w:r>
-        <w:t xml:space="preserve">Bernstein initiated at Outperform with a $99 target (</w:t>
       </w:r>
       <w:hyperlink r:id="rId91">
         <w:r>
@@ -7609,42 +9151,160 @@
         </w:r>
       </w:hyperlink>
       <w:r>
+        <w:t xml:space="preserve">). Higher yields also cut book value through bond marks. The hurricane season runs to Nov 30, so late-season storm risk stays open for the whole window.</w:t>
+      </w:r>
+    </w:p>
+    <w:p>
+      <w:pPr>
+        <w:pStyle w:val="BodyText"/>
+      </w:pPr>
+      <w:r>
+        <w:rPr>
+          <w:b/>
+          <w:bCs/>
+        </w:rPr>
+        <w:t xml:space="preserve">What proves it wrong:</w:t>
+      </w:r>
+    </w:p>
+    <w:p>
+      <w:pPr>
+        <w:pStyle w:val="Compact"/>
+        <w:numPr>
+          <w:ilvl w:val="0"/>
+          <w:numId w:val="1010"/>
+        </w:numPr>
+      </w:pPr>
+      <w:r>
+        <w:t xml:space="preserve">A pre-announced Q3 catastrophe loss above about $600M after tax.</w:t>
+      </w:r>
+    </w:p>
+    <w:p>
+      <w:pPr>
+        <w:pStyle w:val="Compact"/>
+        <w:numPr>
+          <w:ilvl w:val="0"/>
+          <w:numId w:val="1010"/>
+        </w:numPr>
+      </w:pPr>
+      <w:r>
+        <w:t xml:space="preserve">An underlying combined ratio worse than Q2.</w:t>
+      </w:r>
+    </w:p>
+    <w:p>
+      <w:pPr>
+        <w:pStyle w:val="Compact"/>
+        <w:numPr>
+          <w:ilvl w:val="0"/>
+          <w:numId w:val="1010"/>
+        </w:numPr>
+      </w:pPr>
+      <w:r>
+        <w:t xml:space="preserve">Business Insurance renewal premium change falling below low single digits on Oct 16.</w:t>
+      </w:r>
+    </w:p>
+    <w:p>
+      <w:pPr>
+        <w:pStyle w:val="Compact"/>
+        <w:numPr>
+          <w:ilvl w:val="0"/>
+          <w:numId w:val="1010"/>
+        </w:numPr>
+      </w:pPr>
+      <w:r>
+        <w:t xml:space="preserve">A close below</w:t>
+      </w:r>
+      <w:r>
+        <w:t xml:space="preserve"> </w:t>
+      </w:r>
+      <w:r>
+        <w:rPr>
+          <w:b/>
+          <w:bCs/>
+        </w:rPr>
+        <w:t xml:space="preserve">about $350</w:t>
+      </w:r>
+      <w:r>
+        <w:t xml:space="preserve"> </w:t>
+      </w:r>
+      <w:r>
+        <w:t xml:space="preserve">before the report. This level is our inference, only 3.4% below the reference price, so it is noise-prone and should be read alongside the fundamental signals.</w:t>
+      </w:r>
+    </w:p>
+    <w:bookmarkEnd w:id="92"/>
+    <w:bookmarkStart w:id="100" w:name="Xebaa6290fe80fa072f7530588114ef93afcc423"/>
+    <w:p>
+      <w:pPr>
+        <w:pStyle w:val="Heading3"/>
+      </w:pPr>
+      <w:r>
+        <w:t xml:space="preserve">APH: AI interconnect with a diversified floor</w:t>
+      </w:r>
+    </w:p>
+    <w:p>
+      <w:pPr>
+        <w:pStyle w:val="FirstParagraph"/>
+      </w:pPr>
+      <w:r>
+        <w:rPr>
+          <w:b/>
+          <w:bCs/>
+        </w:rPr>
+        <w:t xml:space="preserve">Thesis.</w:t>
+      </w:r>
+      <w:r>
+        <w:t xml:space="preserve"> </w:t>
+      </w:r>
+      <w:r>
+        <w:t xml:space="preserve">APH gives AI-rack exposure with lower relative volatility than pure AI hardware. It has a consistent beat history and a report inside the window.</w:t>
+      </w:r>
+    </w:p>
+    <w:p>
+      <w:pPr>
+        <w:pStyle w:val="BodyText"/>
+      </w:pPr>
+      <w:r>
+        <w:rPr>
+          <w:b/>
+          <w:bCs/>
+        </w:rPr>
+        <w:t xml:space="preserve">Split and price.</w:t>
+      </w:r>
+      <w:r>
+        <w:t xml:space="preserve"> </w:t>
+      </w:r>
+      <w:r>
+        <w:t xml:space="preserve">The $84 price is not stale. APH completed a</w:t>
+      </w:r>
+      <w:r>
+        <w:t xml:space="preserve"> </w:t>
+      </w:r>
+      <w:r>
+        <w:rPr>
+          <w:b/>
+          <w:bCs/>
+        </w:rPr>
+        <w:t xml:space="preserve">2-for-1 split, with split-adjusted trading from Sep 3</w:t>
+      </w:r>
+      <w:r>
+        <w:t xml:space="preserve"> </w:t>
+      </w:r>
+      <w:r>
+        <w:t xml:space="preserve">(</w:t>
+      </w:r>
+      <w:hyperlink r:id="rId93">
+        <w:r>
+          <w:rPr>
+            <w:rStyle w:val="Hyperlink"/>
+          </w:rPr>
+          <w:t xml:space="preserve">EBC</w:t>
+        </w:r>
+      </w:hyperlink>
+      <w:r>
         <w:t xml:space="preserve">).</w:t>
       </w:r>
     </w:p>
     <w:p>
       <w:pPr>
-        <w:pStyle w:val="FirstParagraph"/>
-      </w:pPr>
-      <w:r>
-        <w:rPr>
-          <w:b/>
-          <w:bCs/>
-        </w:rPr>
-        <w:t xml:space="preserve">Catalyst.</w:t>
-      </w:r>
-      <w:r>
-        <w:t xml:space="preserve"> </w:t>
-      </w:r>
-      <w:r>
-        <w:t xml:space="preserve">Q3 results are due</w:t>
-      </w:r>
-      <w:r>
-        <w:t xml:space="preserve"> </w:t>
-      </w:r>
-      <w:r>
-        <w:rPr>
-          <w:b/>
-          <w:bCs/>
-        </w:rPr>
-        <w:t xml:space="preserve">Oct 28 before the open</w:t>
-      </w:r>
-      <w:r>
-        <w:t xml:space="preserve">, the FOMC decision day. Before that, MU (Sep 30) and TSMC (Oct 15) give read-throughs.</w:t>
-      </w:r>
-    </w:p>
-    <w:p>
-      <w:pPr>
         <w:pStyle w:val="BodyText"/>
       </w:pPr>
       <w:r>
@@ -7652,28 +9312,37 @@
           <w:b/>
           <w:bCs/>
         </w:rPr>
-        <w:t xml:space="preserve">Bear case.</w:t>
-      </w:r>
-      <w:r>
-        <w:t xml:space="preserve"> </w:t>
-      </w:r>
-      <w:r>
-        <w:t xml:space="preserve">Zacks called APH stretched at</w:t>
-      </w:r>
-      <w:r>
-        <w:t xml:space="preserve"> </w:t>
-      </w:r>
-      <w:r>
-        <w:rPr>
-          <w:b/>
-          <w:bCs/>
-        </w:rPr>
-        <w:t xml:space="preserve">30.48x forward earnings vs 15.97x for TE Connectivity</w:t>
-      </w:r>
-      <w:r>
-        <w:t xml:space="preserve">, though that article's date is unclear (</w:t>
-      </w:r>
-      <w:hyperlink r:id="rId92">
+        <w:t xml:space="preserve">Revisions.</w:t>
+      </w:r>
+    </w:p>
+    <w:p>
+      <w:pPr>
+        <w:pStyle w:val="Compact"/>
+        <w:numPr>
+          <w:ilvl w:val="0"/>
+          <w:numId w:val="1011"/>
+        </w:numPr>
+      </w:pPr>
+      <w:r>
+        <w:t xml:space="preserve">Zacks #1 on a screen requiring the stock to be within 20% of its 52-week high, with the</w:t>
+      </w:r>
+      <w:r>
+        <w:t xml:space="preserve"> </w:t>
+      </w:r>
+      <w:r>
+        <w:rPr>
+          <w:b/>
+          <w:bCs/>
+        </w:rPr>
+        <w:t xml:space="preserve">current-year estimate up 9% in 60 days</w:t>
+      </w:r>
+      <w:r>
+        <w:t xml:space="preserve"> </w:t>
+      </w:r>
+      <w:r>
+        <w:t xml:space="preserve">(</w:t>
+      </w:r>
+      <w:hyperlink r:id="rId94">
         <w:r>
           <w:rPr>
             <w:rStyle w:val="Hyperlink"/>
@@ -7682,19 +9351,7 @@
         </w:r>
       </w:hyperlink>
       <w:r>
-        <w:t xml:space="preserve">). Its IT datacom business is about 41% of revenue, so a hyperscaler digestion phase would hit orders first. Connectors are a leading indicator of hyperscaler build rates.</w:t>
-      </w:r>
-    </w:p>
-    <w:p>
-      <w:pPr>
-        <w:pStyle w:val="BodyText"/>
-      </w:pPr>
-      <w:r>
-        <w:rPr>
-          <w:b/>
-          <w:bCs/>
-        </w:rPr>
-        <w:t xml:space="preserve">What proves it wrong:</w:t>
+        <w:t xml:space="preserve">).</w:t>
       </w:r>
     </w:p>
     <w:p>
@@ -7702,11 +9359,22 @@
         <w:pStyle w:val="Compact"/>
         <w:numPr>
           <w:ilvl w:val="0"/>
-          <w:numId w:val="1010"/>
+          <w:numId w:val="1011"/>
         </w:numPr>
       </w:pPr>
       <w:r>
-        <w:t xml:space="preserve">Book-to-bill below about 1.05 on Oct 28.</w:t>
+        <w:t xml:space="preserve">BNP raised its estimates after a management meeting (</w:t>
+      </w:r>
+      <w:hyperlink r:id="rId95">
+        <w:r>
+          <w:rPr>
+            <w:rStyle w:val="Hyperlink"/>
+          </w:rPr>
+          <w:t xml:space="preserve">Seeking Alpha</w:t>
+        </w:r>
+      </w:hyperlink>
+      <w:r>
+        <w:t xml:space="preserve">).</w:t>
       </w:r>
     </w:p>
     <w:p>
@@ -7714,11 +9382,51 @@
         <w:pStyle w:val="Compact"/>
         <w:numPr>
           <w:ilvl w:val="0"/>
-          <w:numId w:val="1010"/>
+          <w:numId w:val="1011"/>
         </w:numPr>
       </w:pPr>
       <w:r>
-        <w:t xml:space="preserve">A Q4 guide below consensus.</w:t>
+        <w:t xml:space="preserve">Q2 sales were</w:t>
+      </w:r>
+      <w:r>
+        <w:t xml:space="preserve"> </w:t>
+      </w:r>
+      <w:r>
+        <w:rPr>
+          <w:b/>
+          <w:bCs/>
+        </w:rPr>
+        <w:t xml:space="preserve">$8.8B (about +55%)</w:t>
+      </w:r>
+      <w:r>
+        <w:t xml:space="preserve">, with orders of</w:t>
+      </w:r>
+      <w:r>
+        <w:t xml:space="preserve"> </w:t>
+      </w:r>
+      <w:r>
+        <w:rPr>
+          <w:b/>
+          <w:bCs/>
+        </w:rPr>
+        <w:t xml:space="preserve">$10.7B for a book-to-bill of about 1.2</w:t>
+      </w:r>
+      <w:r>
+        <w:t xml:space="preserve"> </w:t>
+      </w:r>
+      <w:r>
+        <w:t xml:space="preserve">(</w:t>
+      </w:r>
+      <w:hyperlink r:id="rId96">
+        <w:r>
+          <w:rPr>
+            <w:rStyle w:val="Hyperlink"/>
+          </w:rPr>
+          <w:t xml:space="preserve">OptionsTradingReport</w:t>
+        </w:r>
+      </w:hyperlink>
+      <w:r>
+        <w:t xml:space="preserve">).</w:t>
       </w:r>
     </w:p>
     <w:p>
@@ -7726,10 +9434,165 @@
         <w:pStyle w:val="Compact"/>
         <w:numPr>
           <w:ilvl w:val="0"/>
-          <w:numId w:val="1010"/>
+          <w:numId w:val="1011"/>
         </w:numPr>
       </w:pPr>
       <w:r>
+        <w:t xml:space="preserve">The June-quarter EPS of $1.35 (pre-split) beat the $1.19 estimate (</w:t>
+      </w:r>
+      <w:hyperlink r:id="rId97">
+        <w:r>
+          <w:rPr>
+            <w:rStyle w:val="Hyperlink"/>
+          </w:rPr>
+          <w:t xml:space="preserve">TipRanks</w:t>
+        </w:r>
+      </w:hyperlink>
+      <w:r>
+        <w:t xml:space="preserve">).</w:t>
+      </w:r>
+    </w:p>
+    <w:p>
+      <w:pPr>
+        <w:pStyle w:val="Compact"/>
+        <w:numPr>
+          <w:ilvl w:val="0"/>
+          <w:numId w:val="1011"/>
+        </w:numPr>
+      </w:pPr>
+      <w:r>
+        <w:t xml:space="preserve">Bernstein initiated at Outperform with a $99 target (</w:t>
+      </w:r>
+      <w:hyperlink r:id="rId98">
+        <w:r>
+          <w:rPr>
+            <w:rStyle w:val="Hyperlink"/>
+          </w:rPr>
+          <w:t xml:space="preserve">ad-hoc-news</w:t>
+        </w:r>
+      </w:hyperlink>
+      <w:r>
+        <w:t xml:space="preserve">).</w:t>
+      </w:r>
+    </w:p>
+    <w:p>
+      <w:pPr>
+        <w:pStyle w:val="FirstParagraph"/>
+      </w:pPr>
+      <w:r>
+        <w:rPr>
+          <w:b/>
+          <w:bCs/>
+        </w:rPr>
+        <w:t xml:space="preserve">Catalyst.</w:t>
+      </w:r>
+      <w:r>
+        <w:t xml:space="preserve"> </w:t>
+      </w:r>
+      <w:r>
+        <w:t xml:space="preserve">Q3 results are due</w:t>
+      </w:r>
+      <w:r>
+        <w:t xml:space="preserve"> </w:t>
+      </w:r>
+      <w:r>
+        <w:rPr>
+          <w:b/>
+          <w:bCs/>
+        </w:rPr>
+        <w:t xml:space="preserve">Oct 28 before the open</w:t>
+      </w:r>
+      <w:r>
+        <w:t xml:space="preserve">, the FOMC decision day. Before that, MU (Sep 30) and TSMC (Oct 15) give read-throughs.</w:t>
+      </w:r>
+    </w:p>
+    <w:p>
+      <w:pPr>
+        <w:pStyle w:val="BodyText"/>
+      </w:pPr>
+      <w:r>
+        <w:rPr>
+          <w:b/>
+          <w:bCs/>
+        </w:rPr>
+        <w:t xml:space="preserve">Bear case.</w:t>
+      </w:r>
+      <w:r>
+        <w:t xml:space="preserve"> </w:t>
+      </w:r>
+      <w:r>
+        <w:t xml:space="preserve">Zacks called APH stretched at</w:t>
+      </w:r>
+      <w:r>
+        <w:t xml:space="preserve"> </w:t>
+      </w:r>
+      <w:r>
+        <w:rPr>
+          <w:b/>
+          <w:bCs/>
+        </w:rPr>
+        <w:t xml:space="preserve">30.48x forward earnings vs 15.97x for TE Connectivity</w:t>
+      </w:r>
+      <w:r>
+        <w:t xml:space="preserve">, though that article's date is unclear (</w:t>
+      </w:r>
+      <w:hyperlink r:id="rId99">
+        <w:r>
+          <w:rPr>
+            <w:rStyle w:val="Hyperlink"/>
+          </w:rPr>
+          <w:t xml:space="preserve">Zacks via Yahoo</w:t>
+        </w:r>
+      </w:hyperlink>
+      <w:r>
+        <w:t xml:space="preserve">). Its IT datacom business is about 41% of revenue, so a hyperscaler digestion phase would hit orders first. Connectors are a leading indicator of hyperscaler build rates.</w:t>
+      </w:r>
+    </w:p>
+    <w:p>
+      <w:pPr>
+        <w:pStyle w:val="BodyText"/>
+      </w:pPr>
+      <w:r>
+        <w:rPr>
+          <w:b/>
+          <w:bCs/>
+        </w:rPr>
+        <w:t xml:space="preserve">What proves it wrong:</w:t>
+      </w:r>
+    </w:p>
+    <w:p>
+      <w:pPr>
+        <w:pStyle w:val="Compact"/>
+        <w:numPr>
+          <w:ilvl w:val="0"/>
+          <w:numId w:val="1012"/>
+        </w:numPr>
+      </w:pPr>
+      <w:r>
+        <w:t xml:space="preserve">Book-to-bill below about 1.05 on Oct 28.</w:t>
+      </w:r>
+    </w:p>
+    <w:p>
+      <w:pPr>
+        <w:pStyle w:val="Compact"/>
+        <w:numPr>
+          <w:ilvl w:val="0"/>
+          <w:numId w:val="1012"/>
+        </w:numPr>
+      </w:pPr>
+      <w:r>
+        <w:t xml:space="preserve">A Q4 guide below consensus.</w:t>
+      </w:r>
+    </w:p>
+    <w:p>
+      <w:pPr>
+        <w:pStyle w:val="Compact"/>
+        <w:numPr>
+          <w:ilvl w:val="0"/>
+          <w:numId w:val="1012"/>
+        </w:numPr>
+      </w:pPr>
+      <w:r>
         <w:t xml:space="preserve">A close below</w:t>
       </w:r>
       <w:r>
@@ -7746,8 +9609,8 @@
         <w:t xml:space="preserve">, the Sep 18 low, before the report. That is about 7.8% below the reference price.</w:t>
       </w:r>
     </w:p>
-    <w:bookmarkEnd w:id="93"/>
-    <w:bookmarkStart w:id="98" w:name="X307d773aad3219b45b0db73b2d276a6869901f7"/>
+    <w:bookmarkEnd w:id="100"/>
+    <w:bookmarkStart w:id="105" w:name="X307d773aad3219b45b0db73b2d276a6869901f7"/>
     <w:p>
       <w:pPr>
         <w:pStyle w:val="Heading3"/>
@@ -7807,7 +9670,7 @@
       <w:r>
         <w:t xml:space="preserve">since Jun 30, making JPM the largest contributor to the Financials sector's increase (</w:t>
       </w:r>
-      <w:hyperlink r:id="rId94">
+      <w:hyperlink r:id="rId101">
         <w:r>
           <w:rPr>
             <w:rStyle w:val="Hyperlink"/>
@@ -7834,7 +9697,7 @@
       <w:r>
         <w:t xml:space="preserve">(</w:t>
       </w:r>
-      <w:hyperlink r:id="rId61">
+      <w:hyperlink r:id="rId68">
         <w:r>
           <w:rPr>
             <w:rStyle w:val="Hyperlink"/>
@@ -7861,7 +9724,7 @@
       <w:r>
         <w:t xml:space="preserve">(</w:t>
       </w:r>
-      <w:hyperlink r:id="rId95">
+      <w:hyperlink r:id="rId102">
         <w:r>
           <w:rPr>
             <w:rStyle w:val="Hyperlink"/>
@@ -7888,7 +9751,7 @@
       <w:r>
         <w:t xml:space="preserve">(</w:t>
       </w:r>
-      <w:hyperlink r:id="rId60">
+      <w:hyperlink r:id="rId67">
         <w:r>
           <w:rPr>
             <w:rStyle w:val="Hyperlink"/>
@@ -7933,7 +9796,7 @@
       <w:r>
         <w:t xml:space="preserve">at about 7:00am ET, confirmed by the company (</w:t>
       </w:r>
-      <w:hyperlink r:id="rId96">
+      <w:hyperlink r:id="rId103">
         <w:r>
           <w:rPr>
             <w:rStyle w:val="Hyperlink"/>
@@ -7978,7 +9841,7 @@
       <w:r>
         <w:t xml:space="preserve">when the 10-year topped 5%, amid a near-flat curve (</w:t>
       </w:r>
-      <w:hyperlink r:id="rId97">
+      <w:hyperlink r:id="rId104">
         <w:r>
           <w:rPr>
             <w:rStyle w:val="Hyperlink"/>
@@ -7989,7 +9852,7 @@
       <w:r>
         <w:t xml:space="preserve">). BofA's CEO guided Q3 trading "relatively flat", and BAC fell about 5% (</w:t>
       </w:r>
-      <w:hyperlink r:id="rId95">
+      <w:hyperlink r:id="rId102">
         <w:r>
           <w:rPr>
             <w:rStyle w:val="Hyperlink"/>
@@ -8029,7 +9892,7 @@
         <w:pStyle w:val="Compact"/>
         <w:numPr>
           <w:ilvl w:val="0"/>
-          <w:numId w:val="1011"/>
+          <w:numId w:val="1013"/>
         </w:numPr>
       </w:pPr>
       <w:r>
@@ -8057,7 +9920,7 @@
         <w:pStyle w:val="Compact"/>
         <w:numPr>
           <w:ilvl w:val="0"/>
-          <w:numId w:val="1011"/>
+          <w:numId w:val="1013"/>
         </w:numPr>
       </w:pPr>
       <w:r>
@@ -8069,15 +9932,15 @@
         <w:pStyle w:val="Compact"/>
         <w:numPr>
           <w:ilvl w:val="0"/>
-          <w:numId w:val="1011"/>
+          <w:numId w:val="1013"/>
         </w:numPr>
       </w:pPr>
       <w:r>
         <w:t xml:space="preserve">The 10-year holding above 5.25%.</w:t>
       </w:r>
     </w:p>
-    <w:bookmarkEnd w:id="98"/>
-    <w:bookmarkStart w:id="108" w:name="X937c853dc5e5c589e9cf7fe89f4c3cc4ab5ee3d"/>
+    <w:bookmarkEnd w:id="105"/>
+    <w:bookmarkStart w:id="115" w:name="X937c853dc5e5c589e9cf7fe89f4c3cc4ab5ee3d"/>
     <w:p>
       <w:pPr>
         <w:pStyle w:val="Heading3"/>
@@ -8121,7 +9984,7 @@
         <w:pStyle w:val="Compact"/>
         <w:numPr>
           <w:ilvl w:val="0"/>
-          <w:numId w:val="1012"/>
+          <w:numId w:val="1014"/>
         </w:numPr>
       </w:pPr>
       <w:r>
@@ -8143,7 +10006,7 @@
       <w:r>
         <w:t xml:space="preserve">(</w:t>
       </w:r>
-      <w:hyperlink r:id="rId99">
+      <w:hyperlink r:id="rId106">
         <w:r>
           <w:rPr>
             <w:rStyle w:val="Hyperlink"/>
@@ -8160,7 +10023,7 @@
         <w:pStyle w:val="Compact"/>
         <w:numPr>
           <w:ilvl w:val="0"/>
-          <w:numId w:val="1012"/>
+          <w:numId w:val="1014"/>
         </w:numPr>
       </w:pPr>
       <w:r>
@@ -8182,7 +10045,7 @@
       <w:r>
         <w:t xml:space="preserve">(</w:t>
       </w:r>
-      <w:hyperlink r:id="rId62">
+      <w:hyperlink r:id="rId69">
         <w:r>
           <w:rPr>
             <w:rStyle w:val="Hyperlink"/>
@@ -8199,7 +10062,7 @@
         <w:pStyle w:val="Compact"/>
         <w:numPr>
           <w:ilvl w:val="0"/>
-          <w:numId w:val="1012"/>
+          <w:numId w:val="1014"/>
         </w:numPr>
       </w:pPr>
       <w:r>
@@ -8221,7 +10084,7 @@
       <w:r>
         <w:t xml:space="preserve">(</w:t>
       </w:r>
-      <w:hyperlink r:id="rId100">
+      <w:hyperlink r:id="rId107">
         <w:r>
           <w:rPr>
             <w:rStyle w:val="Hyperlink"/>
@@ -8238,13 +10101,13 @@
         <w:pStyle w:val="Compact"/>
         <w:numPr>
           <w:ilvl w:val="0"/>
-          <w:numId w:val="1012"/>
+          <w:numId w:val="1014"/>
         </w:numPr>
       </w:pPr>
       <w:r>
         <w:t xml:space="preserve">Short interest is only about 1.89M shares (</w:t>
       </w:r>
-      <w:hyperlink r:id="rId101">
+      <w:hyperlink r:id="rId108">
         <w:r>
           <w:rPr>
             <w:rStyle w:val="Hyperlink"/>
@@ -8273,7 +10136,7 @@
       <w:r>
         <w:t xml:space="preserve">Q2 adjusted EBITDA rose 16.3% and EPS 52%, and 2026 guidance was raised (</w:t>
       </w:r>
-      <w:hyperlink r:id="rId102">
+      <w:hyperlink r:id="rId109">
         <w:r>
           <w:rPr>
             <w:rStyle w:val="Hyperlink"/>
@@ -8300,7 +10163,7 @@
       <w:r>
         <w:t xml:space="preserve">(</w:t>
       </w:r>
-      <w:hyperlink r:id="rId103">
+      <w:hyperlink r:id="rId110">
         <w:r>
           <w:rPr>
             <w:rStyle w:val="Hyperlink"/>
@@ -8329,7 +10192,7 @@
       <w:r>
         <w:t xml:space="preserve">THC has reported Q3 on Oct 28–30 in each of the last three years (</w:t>
       </w:r>
-      <w:hyperlink r:id="rId104">
+      <w:hyperlink r:id="rId111">
         <w:r>
           <w:rPr>
             <w:rStyle w:val="Hyperlink"/>
@@ -8364,7 +10227,7 @@
         <w:pStyle w:val="Compact"/>
         <w:numPr>
           <w:ilvl w:val="0"/>
-          <w:numId w:val="1013"/>
+          <w:numId w:val="1015"/>
         </w:numPr>
       </w:pPr>
       <w:r>
@@ -8402,7 +10265,7 @@
       <w:r>
         <w:t xml:space="preserve">(</w:t>
       </w:r>
-      <w:hyperlink r:id="rId105">
+      <w:hyperlink r:id="rId112">
         <w:r>
           <w:rPr>
             <w:rStyle w:val="Hyperlink"/>
@@ -8419,13 +10282,13 @@
         <w:pStyle w:val="Compact"/>
         <w:numPr>
           <w:ilvl w:val="0"/>
-          <w:numId w:val="1013"/>
+          <w:numId w:val="1015"/>
         </w:numPr>
       </w:pPr>
       <w:r>
         <w:t xml:space="preserve">Q2 exchange admissions fell 13.5% (</w:t>
       </w:r>
-      <w:hyperlink r:id="rId106">
+      <w:hyperlink r:id="rId113">
         <w:r>
           <w:rPr>
             <w:rStyle w:val="Hyperlink"/>
@@ -8442,7 +10305,7 @@
         <w:pStyle w:val="Compact"/>
         <w:numPr>
           <w:ilvl w:val="0"/>
-          <w:numId w:val="1013"/>
+          <w:numId w:val="1015"/>
         </w:numPr>
       </w:pPr>
       <w:r>
@@ -8458,7 +10321,7 @@
       <w:r>
         <w:t xml:space="preserve">(</w:t>
       </w:r>
-      <w:hyperlink r:id="rId107">
+      <w:hyperlink r:id="rId114">
         <w:r>
           <w:rPr>
             <w:rStyle w:val="Hyperlink"/>
@@ -8475,7 +10338,7 @@
         <w:pStyle w:val="Compact"/>
         <w:numPr>
           <w:ilvl w:val="0"/>
-          <w:numId w:val="1013"/>
+          <w:numId w:val="1015"/>
         </w:numPr>
       </w:pPr>
       <w:r>
@@ -8499,7 +10362,7 @@
         <w:pStyle w:val="Compact"/>
         <w:numPr>
           <w:ilvl w:val="0"/>
-          <w:numId w:val="1014"/>
+          <w:numId w:val="1016"/>
         </w:numPr>
       </w:pPr>
       <w:r>
@@ -8511,7 +10374,7 @@
         <w:pStyle w:val="Compact"/>
         <w:numPr>
           <w:ilvl w:val="0"/>
-          <w:numId w:val="1014"/>
+          <w:numId w:val="1016"/>
         </w:numPr>
       </w:pPr>
       <w:r>
@@ -8523,7 +10386,7 @@
         <w:pStyle w:val="Compact"/>
         <w:numPr>
           <w:ilvl w:val="0"/>
-          <w:numId w:val="1014"/>
+          <w:numId w:val="1016"/>
         </w:numPr>
       </w:pPr>
       <w:r>
@@ -8543,9 +10406,9 @@
         <w:t xml:space="preserve">, about 6.0% below the reference price.</w:t>
       </w:r>
     </w:p>
-    <w:bookmarkEnd w:id="108"/>
-    <w:bookmarkEnd w:id="109"/>
-    <w:bookmarkStart w:id="116" w:name="two-event-clusters-decide-the-window"/>
+    <w:bookmarkEnd w:id="115"/>
+    <w:bookmarkEnd w:id="116"/>
+    <w:bookmarkStart w:id="123" w:name="two-event-clusters-decide-the-window"/>
     <w:p>
       <w:pPr>
         <w:pStyle w:val="Heading2"/>
@@ -8636,7 +10499,7 @@
             <w:r>
               <w:t xml:space="preserve">US–China "protected lane" deal details (</w:t>
             </w:r>
-            <w:hyperlink r:id="rId110">
+            <w:hyperlink r:id="rId117">
               <w:r>
                 <w:rPr>
                   <w:rStyle w:val="Hyperlink"/>
@@ -8693,7 +10556,7 @@
             <w:r>
               <w:t xml:space="preserve">Micron FQ4 results, after close (</w:t>
             </w:r>
-            <w:hyperlink r:id="rId111">
+            <w:hyperlink r:id="rId118">
               <w:r>
                 <w:rPr>
                   <w:rStyle w:val="Hyperlink"/>
@@ -8750,7 +10613,7 @@
             <w:r>
               <w:t xml:space="preserve">September jobs report (</w:t>
             </w:r>
-            <w:hyperlink r:id="rId112">
+            <w:hyperlink r:id="rId119">
               <w:r>
                 <w:rPr>
                   <w:rStyle w:val="Hyperlink"/>
@@ -8817,7 +10680,7 @@
             <w:r>
               <w:t xml:space="preserve">(~7:00am ET); UNH (</w:t>
             </w:r>
-            <w:hyperlink r:id="rId113">
+            <w:hyperlink r:id="rId120">
               <w:r>
                 <w:rPr>
                   <w:rStyle w:val="Hyperlink"/>
@@ -9492,7 +11355,7 @@
             <w:r>
               <w:t xml:space="preserve">Treasury quarterly refunding (</w:t>
             </w:r>
-            <w:hyperlink r:id="rId114">
+            <w:hyperlink r:id="rId121">
               <w:r>
                 <w:rPr>
                   <w:rStyle w:val="Hyperlink"/>
@@ -9595,7 +11458,7 @@
             <w:r>
               <w:t xml:space="preserve">October CPI (</w:t>
             </w:r>
-            <w:hyperlink r:id="rId115">
+            <w:hyperlink r:id="rId122">
               <w:r>
                 <w:rPr>
                   <w:rStyle w:val="Hyperlink"/>
@@ -9782,8 +11645,8 @@
         <w:t xml:space="preserve">NVDA's report may add a third decision point in the final three trading days.</w:t>
       </w:r>
     </w:p>
-    <w:bookmarkEnd w:id="116"/>
-    <w:bookmarkStart w:id="120" w:name="X63b89da5788a912fdb407a113e9ad725352439e"/>
+    <w:bookmarkEnd w:id="123"/>
+    <w:bookmarkStart w:id="127" w:name="X63b89da5788a912fdb407a113e9ad725352439e"/>
     <w:p>
       <w:pPr>
         <w:pStyle w:val="Heading2"/>
@@ -9797,6 +11660,14 @@
         <w:pStyle w:val="FirstParagraph"/>
       </w:pPr>
       <w:r>
+        <w:t xml:space="preserve">This section was written for the V2 basket. For the V3 basket, oil matters directly: a Hormuz deal that holds is VLO's main risk, and MU's Sep 30 report is a single-day event risk. The yield-spike analysis for TRV, JPM and THC applies to both baskets.</w:t>
+      </w:r>
+    </w:p>
+    <w:p>
+      <w:pPr>
+        <w:pStyle w:val="BodyText"/>
+      </w:pPr>
+      <w:r>
         <w:rPr>
           <w:b/>
           <w:bCs/>
@@ -9809,7 +11680,7 @@
       <w:r>
         <w:t xml:space="preserve">would push oil and then yields down. Our notes' scenario map shows this would hurt energy and defense and lift airlines, rate-sensitive stocks and small caps. When the Iran offer surfaced, airlines rose 6–8% in a week (</w:t>
       </w:r>
-      <w:hyperlink r:id="rId117">
+      <w:hyperlink r:id="rId124">
         <w:r>
           <w:rPr>
             <w:rStyle w:val="Hyperlink"/>
@@ -9864,7 +11735,7 @@
       <w:r>
         <w:t xml:space="preserve">would test the NVDA and APH slots, 40% of an equal-weight basket. Oracle's Sep 24 force-majeure notice was the first dated crack (</w:t>
       </w:r>
-      <w:hyperlink r:id="rId118">
+      <w:hyperlink r:id="rId125">
         <w:r>
           <w:rPr>
             <w:rStyle w:val="Hyperlink"/>
@@ -9875,7 +11746,7 @@
       <w:r>
         <w:t xml:space="preserve">). The GLJ note on GEV showed the whole AI-power complex trading as one factor that day: ETN fell 7% and PWR 4% (</w:t>
       </w:r>
-      <w:hyperlink r:id="rId119">
+      <w:hyperlink r:id="rId126">
         <w:r>
           <w:rPr>
             <w:rStyle w:val="Hyperlink"/>
@@ -9923,8 +11794,8 @@
         <w:t xml:space="preserve">adds to the risk. Two picks report within four days of each other, and three more sit in the Oct 27–30 week. Earnings-gap risk is therefore concentrated rather than spread across the window.</w:t>
       </w:r>
     </w:p>
-    <w:bookmarkEnd w:id="120"/>
-    <w:bookmarkStart w:id="126" w:name="conflicting-figures-across-the-notes"/>
+    <w:bookmarkEnd w:id="127"/>
+    <w:bookmarkStart w:id="133" w:name="conflicting-figures-across-the-notes"/>
     <w:p>
       <w:pPr>
         <w:pStyle w:val="Heading2"/>
@@ -10070,7 +11941,7 @@
             <w:r>
               <w:t xml:space="preserve">) vs "below $98" (Yahoo) vs about $106 (</w:t>
             </w:r>
-            <w:hyperlink r:id="rId121">
+            <w:hyperlink r:id="rId128">
               <w:r>
                 <w:rPr>
                   <w:rStyle w:val="Hyperlink"/>
@@ -10197,7 +12068,7 @@
             <w:r>
               <w:t xml:space="preserve">Energy +38.8% / +40.01% / +38.4%; Tech +35.24% vs +24.1% (</w:t>
             </w:r>
-            <w:hyperlink r:id="rId122">
+            <w:hyperlink r:id="rId129">
               <w:r>
                 <w:rPr>
                   <w:rStyle w:val="Hyperlink"/>
@@ -10313,7 +12184,7 @@
             <w:r>
               <w:t xml:space="preserve">42 negative + 72 positive = 114, not the stated 111 (</w:t>
             </w:r>
-            <w:hyperlink r:id="rId123">
+            <w:hyperlink r:id="rId130">
               <w:r>
                 <w:rPr>
                   <w:rStyle w:val="Hyperlink"/>
@@ -10394,7 +12265,7 @@
             <w:r>
               <w:t xml:space="preserve">−1.24% after hours (low-quality blog) vs +8.7% the next day (</w:t>
             </w:r>
-            <w:hyperlink r:id="rId124">
+            <w:hyperlink r:id="rId131">
               <w:r>
                 <w:rPr>
                   <w:rStyle w:val="Hyperlink"/>
@@ -10580,7 +12451,7 @@
             <w:r>
               <w:t xml:space="preserve">"Near-flat" (</w:t>
             </w:r>
-            <w:hyperlink r:id="rId97">
+            <w:hyperlink r:id="rId104">
               <w:r>
                 <w:rPr>
                   <w:rStyle w:val="Hyperlink"/>
@@ -10591,7 +12462,7 @@
             <w:r>
               <w:t xml:space="preserve">) vs 2s/10s about +0.52% (</w:t>
             </w:r>
-            <w:hyperlink r:id="rId125">
+            <w:hyperlink r:id="rId132">
               <w:r>
                 <w:rPr>
                   <w:rStyle w:val="Hyperlink"/>
@@ -10757,8 +12628,8 @@
         </w:tc>
       </w:tr>
     </w:tbl>
-    <w:bookmarkEnd w:id="126"/>
-    <w:bookmarkStart w:id="127" w:name="grading-the-picks-on-nov-20-and-nov-23"/>
+    <w:bookmarkEnd w:id="133"/>
+    <w:bookmarkStart w:id="134" w:name="grading-the-picks-on-nov-20-and-nov-23"/>
     <w:p>
       <w:pPr>
         <w:pStyle w:val="Heading2"/>
@@ -10776,6 +12647,24 @@
           <w:b/>
           <w:bCs/>
         </w:rPr>
+        <w:t xml:space="preserve">Official basket.</w:t>
+      </w:r>
+      <w:r>
+        <w:t xml:space="preserve"> </w:t>
+      </w:r>
+      <w:r>
+        <w:t xml:space="preserve">The V3 rule-based basket (TRV, JPM, VLO, THC, MU) is the pre-registered official basket, because it follows the stated rules. The V2 basket and the NVDA-confirmed variant are graded as supplementary results.</w:t>
+      </w:r>
+    </w:p>
+    <w:p>
+      <w:pPr>
+        <w:pStyle w:val="BodyText"/>
+      </w:pPr>
+      <w:r>
+        <w:rPr>
+          <w:b/>
+          <w:bCs/>
+        </w:rPr>
         <w:t xml:space="preserve">Fixed window.</w:t>
       </w:r>
       <w:r>
@@ -10814,23 +12703,7 @@
         <w:t xml:space="preserve"> </w:t>
       </w:r>
       <w:r>
-        <w:t xml:space="preserve">for every stock and for the benchmark. Do not substitute Sep 25 closes. That would change the experiment. If an open price is unavailable, use the Sep 28 close for the stock</w:t>
-      </w:r>
-      <w:r>
-        <w:t xml:space="preserve"> </w:t>
-      </w:r>
-      <w:r>
-        <w:rPr>
-          <w:i/>
-          <w:iCs/>
-        </w:rPr>
-        <w:t xml:space="preserve">and</w:t>
-      </w:r>
-      <w:r>
-        <w:t xml:space="preserve"> </w:t>
-      </w:r>
-      <w:r>
-        <w:t xml:space="preserve">the benchmark, and say so.</w:t>
+        <w:t xml:space="preserve">for every stock and for the benchmark. Do not substitute Sep 25 closes. That would change the experiment. Use one entry convention for the whole basket: if the Sep 28 open is unavailable for any stock, switch every stock and the benchmark to the Sep 28 close. Report any mixed-convention result only as a separate note.</w:t>
       </w:r>
     </w:p>
     <w:p>
@@ -10895,7 +12768,7 @@
         <w:pStyle w:val="Compact"/>
         <w:numPr>
           <w:ilvl w:val="0"/>
-          <w:numId w:val="1015"/>
+          <w:numId w:val="1017"/>
         </w:numPr>
       </w:pPr>
       <w:r>
@@ -10917,7 +12790,7 @@
         <w:pStyle w:val="Compact"/>
         <w:numPr>
           <w:ilvl w:val="0"/>
-          <w:numId w:val="1015"/>
+          <w:numId w:val="1017"/>
         </w:numPr>
       </w:pPr>
       <w:r>
@@ -10931,7 +12804,7 @@
         <w:t xml:space="preserve"> </w:t>
       </w:r>
       <w:r>
-        <w:t xml:space="preserve">Using the 45–48% base rate and assuming independent picks, the chance of at least four of five beating the index is</w:t>
+        <w:t xml:space="preserve">Using the assumed (unvalidated) 45–48% base rate and assuming independent picks, the chance of at least four of five beating the index is</w:t>
       </w:r>
       <w:r>
         <w:t xml:space="preserve"> </w:t>
@@ -10981,7 +12854,7 @@
         <w:pStyle w:val="Compact"/>
         <w:numPr>
           <w:ilvl w:val="0"/>
-          <w:numId w:val="1015"/>
+          <w:numId w:val="1017"/>
         </w:numPr>
       </w:pPr>
       <w:r>
@@ -11003,7 +12876,7 @@
         <w:pStyle w:val="Compact"/>
         <w:numPr>
           <w:ilvl w:val="0"/>
-          <w:numId w:val="1015"/>
+          <w:numId w:val="1017"/>
         </w:numPr>
       </w:pPr>
       <w:r>
@@ -11037,7 +12910,7 @@
         <w:pStyle w:val="Compact"/>
         <w:numPr>
           <w:ilvl w:val="0"/>
-          <w:numId w:val="1016"/>
+          <w:numId w:val="1018"/>
         </w:numPr>
       </w:pPr>
       <w:r>
@@ -11045,29 +12918,29 @@
           <w:b/>
           <w:bCs/>
         </w:rPr>
-        <w:t xml:space="preserve">The mechanical basket</w:t>
-      </w:r>
-      <w:r>
-        <w:t xml:space="preserve"> </w:t>
-      </w:r>
-      <w:r>
-        <w:t xml:space="preserve">(ANET in place of APH) and the</w:t>
-      </w:r>
-      <w:r>
-        <w:t xml:space="preserve"> </w:t>
-      </w:r>
-      <w:r>
-        <w:rPr>
-          <w:b/>
-          <w:bCs/>
-        </w:rPr>
-        <w:t xml:space="preserve">runners-up</w:t>
-      </w:r>
-      <w:r>
-        <w:t xml:space="preserve"> </w:t>
-      </w:r>
-      <w:r>
-        <w:t xml:space="preserve">(ANET, DELL, MU, VLO, CVE), graded the same way. One window cannot show whether the caps or the override helped, because selection and sector exposure change together. Treat these as descriptive only.</w:t>
+        <w:t xml:space="preserve">The V2 basket</w:t>
+      </w:r>
+      <w:r>
+        <w:t xml:space="preserve"> </w:t>
+      </w:r>
+      <w:r>
+        <w:t xml:space="preserve">(NVDA, TRV, APH, JPM, THC), the</w:t>
+      </w:r>
+      <w:r>
+        <w:t xml:space="preserve"> </w:t>
+      </w:r>
+      <w:r>
+        <w:rPr>
+          <w:b/>
+          <w:bCs/>
+        </w:rPr>
+        <w:t xml:space="preserve">NVDA-confirmed variant</w:t>
+      </w:r>
+      <w:r>
+        <w:t xml:space="preserve"> </w:t>
+      </w:r>
+      <w:r>
+        <w:t xml:space="preserve">(NVDA in place of MU), and the next names in V3 order (DELL, CVE, ANET, APH), graded the same way. One window cannot show whether the caps or the override helped, because selection and sector exposure change together. Treat these as descriptive only.</w:t>
       </w:r>
     </w:p>
     <w:p>
@@ -11075,7 +12948,7 @@
         <w:pStyle w:val="Compact"/>
         <w:numPr>
           <w:ilvl w:val="0"/>
-          <w:numId w:val="1016"/>
+          <w:numId w:val="1018"/>
         </w:numPr>
       </w:pPr>
       <w:r>
@@ -11100,8 +12973,8 @@
         <w:t xml:space="preserve">Running the grading on Mon Nov 23 captures the Nov 20 closing data after options expiration. A grading check is scheduled for that date.</w:t>
       </w:r>
     </w:p>
-    <w:bookmarkEnd w:id="127"/>
-    <w:bookmarkStart w:id="128" w:name="conclusion"/>
+    <w:bookmarkEnd w:id="134"/>
+    <w:bookmarkStart w:id="135" w:name="conclusion"/>
     <w:p>
       <w:pPr>
         <w:pStyle w:val="Heading2"/>
@@ -11115,7 +12988,7 @@
         <w:pStyle w:val="FirstParagraph"/>
       </w:pPr>
       <w:r>
-        <w:t xml:space="preserve">The main finding is that in this regime the scorecard's two strongest signals point in different directions. Momentum is concentrated in crowded AI hardware, while the cleanest revisions sit in a quiet-catastrophe insurer and a guided-up bank. Neither signal alone makes a risk-aware basket. The theme cap replaces a de facto AI-capex bet with a basket whose business drivers are split across rates (JPM, TRV), hyperscaler capex (NVDA, APH) and health policy (THC). The drivers differ, but the common macro exposure does not: a yield spike hits at least four of the five, and that exposure has not been quantified. The sensitivity test supports treating TRV, JPM and THC as the robust core. The two AI slots are low-confidence choices among four close names.</w:t>
+        <w:t xml:space="preserve">Applied consistently, the scorecard picks TRV, JPM, VLO, THC and MU. Within this framework, TRV and JPM are the most reliable selections and VLO is fairly reliable; THC and the second AI slot are close calls. The picks rest on the statistical tendency of revisions and momentum to persist, not on evidence that consensus is wrong. The V3 basket trades V2's AI-capex exposure for oil (VLO) and a day-3 binary report (MU), and a yield spike still hits both Financials together.</w:t>
       </w:r>
     </w:p>
     <w:p>
@@ -11123,11 +12996,11 @@
         <w:pStyle w:val="BodyText"/>
       </w:pPr>
       <w:r>
-        <w:t xml:space="preserve">The uncomfortable implication is that the Financials leg makes the basket short the Fund Manager Survey's top tail risk, a yield spike. The Oct 13–16 cluster is therefore the first real test of the thesis, well before the AI names report. Given the snippet-only data, the most valuable next step is not more screening. It is a live-data pass that confirms prices, the NVDA and THC dates, and the implied moves, before anyone relies on these rankings.</w:t>
-      </w:r>
-    </w:p>
-    <w:bookmarkEnd w:id="128"/>
-    <w:bookmarkEnd w:id="129"/>
+        <w:t xml:space="preserve">The most valuable next step is a live-data pass, not more scoring. It should confirm the Sep 28 opening prices, NVIDIA's and Tenet's report dates, and the recent estimate changes for the top ten names. NVIDIA's date alone decides whether it or MU holds the AI slot.</w:t>
+      </w:r>
+    </w:p>
+    <w:bookmarkEnd w:id="135"/>
+    <w:bookmarkEnd w:id="136"/>
     <w:sectPr>
       <w:footnotePr>
         <w:numRestart w:val="eachSect"/>
@@ -11472,6 +13345,12 @@
     <w:abstractNumId w:val="991"/>
   </w:num>
   <w:num w:numId="1015">
+    <w:abstractNumId w:val="991"/>
+  </w:num>
+  <w:num w:numId="1016">
+    <w:abstractNumId w:val="991"/>
+  </w:num>
+  <w:num w:numId="1017">
     <w:abstractNumId w:val="99411"/>
     <w:lvlOverride w:ilvl="0">
       <w:startOverride w:val="1"/>
@@ -11501,7 +13380,7 @@
       <w:startOverride w:val="1"/>
     </w:lvlOverride>
   </w:num>
-  <w:num w:numId="1016">
+  <w:num w:numId="1018">
     <w:abstractNumId w:val="991"/>
   </w:num>
 </w:numbering>

</xml_diff>